<commit_message>
feat: enhance signup page with first and last name fields, server readiness check, and improved error handling
feat: add batch printing functionality in TodaClient with date filtering options and progress tracking
</commit_message>
<xml_diff>
--- a/backend/template.docx
+++ b/backend/template.docx
@@ -46,12 +46,12 @@
             <wp:extent cx="762635" cy="762635"/>
             <wp:effectExtent b="0" l="0" r="0" t="0"/>
             <wp:wrapNone/>
-            <wp:docPr id="2" name="image1.png"/>
+            <wp:docPr id="2" name="image3.png"/>
             <a:graphic>
               <a:graphicData uri="http://schemas.openxmlformats.org/drawingml/2006/picture">
                 <pic:pic>
                   <pic:nvPicPr>
-                    <pic:cNvPr id="0" name="image1.png"/>
+                    <pic:cNvPr id="0" name="image3.png"/>
                     <pic:cNvPicPr preferRelativeResize="0"/>
                   </pic:nvPicPr>
                   <pic:blipFill>
@@ -88,12 +88,12 @@
             <wp:extent cx="824230" cy="827405"/>
             <wp:effectExtent b="0" l="0" r="0" t="0"/>
             <wp:wrapNone/>
-            <wp:docPr id="3" name="image3.png"/>
+            <wp:docPr id="3" name="image1.png"/>
             <a:graphic>
               <a:graphicData uri="http://schemas.openxmlformats.org/drawingml/2006/picture">
                 <pic:pic>
                   <pic:nvPicPr>
-                    <pic:cNvPr id="0" name="image3.png"/>
+                    <pic:cNvPr id="0" name="image1.png"/>
                     <pic:cNvPicPr preferRelativeResize="0"/>
                   </pic:nvPicPr>
                   <pic:blipFill>
@@ -573,31 +573,296 @@
         <w:jc w:val="both"/>
         <w:rPr>
           <w:rFonts w:ascii="Times New Roman" w:cs="Times New Roman" w:eastAsia="Times New Roman" w:hAnsi="Times New Roman"/>
-        </w:rPr>
-      </w:pPr>
-      <w:r>
-        <w:rPr>
-          <w:rFonts w:ascii="Times New Roman" w:cs="Times New Roman" w:eastAsia="Times New Roman" w:hAnsi="Times New Roman"/>
-          <w:rtl w:val="0"/>
-        </w:rPr>
-        <w:tab/>
-        <w:t xml:space="preserve">ADDRESS:       </w:t>
-      </w:r>
-      <w:r>
-        <w:rPr>
-          <w:rFonts w:ascii="Times New Roman" w:cs="Times New Roman" w:eastAsia="Times New Roman" w:hAnsi="Times New Roman"/>
           <w:b w:val="1"/>
           <w:bCs w:val="1"/>
+        </w:rPr>
+      </w:pPr>
+      <w:r>
+        <w:rPr>
+          <w:rFonts w:ascii="Times New Roman" w:cs="Times New Roman" w:eastAsia="Times New Roman" w:hAnsi="Times New Roman"/>
+          <w:rtl w:val="0"/>
+        </w:rPr>
+        <w:tab/>
+        <w:t xml:space="preserve">ADDRESS:       </w:t>
+      </w:r>
+      <w:r>
+        <w:rPr>
+          <w:rFonts w:ascii="Times New Roman" w:cs="Times New Roman" w:eastAsia="Times New Roman" w:hAnsi="Times New Roman"/>
+          <w:b w:val="1"/>
+          <w:bCs w:val="1"/>
           <w:rtl w:val="0"/>
         </w:rPr>
         <w:t xml:space="preserve">[ADDRESS]</w:t>
       </w:r>
-      <w:r>
-        <w:rPr>
-          <w:rtl w:val="0"/>
-        </w:rPr>
-      </w:r>
-    </w:p>
+    </w:p>
+    <w:tbl>
+      <w:tblPr>
+        <w:tblStyle w:val="Table1"/>
+        <w:tblW w:w="8430.0" w:type="dxa"/>
+        <w:jc w:val="left"/>
+        <w:tblInd w:w="1440.0" w:type="dxa"/>
+        <w:tblBorders>
+          <w:top w:color="000000" w:space="0" w:sz="8" w:val="single"/>
+          <w:left w:color="000000" w:space="0" w:sz="8" w:val="single"/>
+          <w:bottom w:color="000000" w:space="0" w:sz="8" w:val="single"/>
+          <w:right w:color="000000" w:space="0" w:sz="8" w:val="single"/>
+          <w:insideH w:color="000000" w:space="0" w:sz="8" w:val="single"/>
+          <w:insideV w:color="000000" w:space="0" w:sz="8" w:val="single"/>
+        </w:tblBorders>
+        <w:tblLayout w:type="fixed"/>
+        <w:tblLook w:val="0600"/>
+      </w:tblPr>
+      <w:tblGrid>
+        <w:gridCol w:w="4200"/>
+        <w:gridCol w:w="4230"/>
+        <w:tblGridChange w:id="0">
+          <w:tblGrid>
+            <w:gridCol w:w="4200"/>
+            <w:gridCol w:w="4230"/>
+          </w:tblGrid>
+        </w:tblGridChange>
+      </w:tblGrid>
+      <w:tr>
+        <w:trPr>
+          <w:cantSplit w:val="0"/>
+          <w:tblHeader w:val="0"/>
+        </w:trPr>
+        <w:tc>
+          <w:tcPr>
+            <w:tcBorders>
+              <w:top w:color="000000" w:space="0" w:sz="0" w:val="nil"/>
+              <w:left w:color="000000" w:space="0" w:sz="0" w:val="nil"/>
+              <w:bottom w:color="000000" w:space="0" w:sz="0" w:val="nil"/>
+              <w:right w:color="000000" w:space="0" w:sz="0" w:val="nil"/>
+            </w:tcBorders>
+            <w:shd w:fill="auto" w:val="clear"/>
+            <w:tcMar>
+              <w:top w:w="0.0" w:type="dxa"/>
+              <w:left w:w="0.0" w:type="dxa"/>
+              <w:bottom w:w="0.0" w:type="dxa"/>
+              <w:right w:w="0.0" w:type="dxa"/>
+            </w:tcMar>
+          </w:tcPr>
+          <w:p>
+            <w:pPr>
+              <w:keepNext w:val="0"/>
+              <w:keepLines w:val="0"/>
+              <w:pageBreakBefore w:val="0"/>
+              <w:widowControl w:val="0"/>
+              <w:pBdr>
+                <w:top w:space="0" w:sz="0" w:val="nil"/>
+                <w:left w:space="0" w:sz="0" w:val="nil"/>
+                <w:bottom w:space="0" w:sz="0" w:val="nil"/>
+                <w:right w:space="0" w:sz="0" w:val="nil"/>
+                <w:between w:space="0" w:sz="0" w:val="nil"/>
+              </w:pBdr>
+              <w:shd w:fill="auto" w:val="clear"/>
+              <w:spacing w:after="0" w:before="0" w:line="360" w:lineRule="auto"/>
+              <w:ind w:left="0" w:right="0" w:firstLine="0"/>
+              <w:jc w:val="left"/>
+              <w:rPr>
+                <w:rFonts w:ascii="Times New Roman" w:cs="Times New Roman" w:eastAsia="Times New Roman" w:hAnsi="Times New Roman"/>
+                <w:b w:val="1"/>
+                <w:bCs w:val="1"/>
+              </w:rPr>
+            </w:pPr>
+            <w:r>
+              <w:rPr>
+                <w:rFonts w:ascii="Times New Roman" w:cs="Times New Roman" w:eastAsia="Times New Roman" w:hAnsi="Times New Roman"/>
+                <w:rtl w:val="0"/>
+              </w:rPr>
+              <w:t xml:space="preserve">Motor No.   :</w:t>
+            </w:r>
+            <w:r>
+              <w:rPr>
+                <w:rFonts w:ascii="Times New Roman" w:cs="Times New Roman" w:eastAsia="Times New Roman" w:hAnsi="Times New Roman"/>
+                <w:b w:val="1"/>
+                <w:bCs w:val="1"/>
+                <w:rtl w:val="0"/>
+              </w:rPr>
+              <w:t xml:space="preserve"> {{MOTOR_NO}}</w:t>
+            </w:r>
+          </w:p>
+        </w:tc>
+        <w:tc>
+          <w:tcPr>
+            <w:tcBorders>
+              <w:top w:color="000000" w:space="0" w:sz="0" w:val="nil"/>
+              <w:left w:color="000000" w:space="0" w:sz="0" w:val="nil"/>
+              <w:bottom w:color="000000" w:space="0" w:sz="0" w:val="nil"/>
+              <w:right w:color="000000" w:space="0" w:sz="0" w:val="nil"/>
+            </w:tcBorders>
+            <w:shd w:fill="auto" w:val="clear"/>
+            <w:tcMar>
+              <w:top w:w="0.0" w:type="dxa"/>
+              <w:left w:w="0.0" w:type="dxa"/>
+              <w:bottom w:w="0.0" w:type="dxa"/>
+              <w:right w:w="0.0" w:type="dxa"/>
+            </w:tcMar>
+          </w:tcPr>
+          <w:p>
+            <w:pPr>
+              <w:keepNext w:val="0"/>
+              <w:keepLines w:val="0"/>
+              <w:pageBreakBefore w:val="0"/>
+              <w:widowControl w:val="0"/>
+              <w:pBdr>
+                <w:top w:space="0" w:sz="0" w:val="nil"/>
+                <w:left w:space="0" w:sz="0" w:val="nil"/>
+                <w:bottom w:space="0" w:sz="0" w:val="nil"/>
+                <w:right w:space="0" w:sz="0" w:val="nil"/>
+                <w:between w:space="0" w:sz="0" w:val="nil"/>
+              </w:pBdr>
+              <w:shd w:fill="auto" w:val="clear"/>
+              <w:spacing w:after="0" w:before="0" w:line="360" w:lineRule="auto"/>
+              <w:ind w:left="0" w:right="0" w:firstLine="0"/>
+              <w:jc w:val="left"/>
+              <w:rPr>
+                <w:rFonts w:ascii="Times New Roman" w:cs="Times New Roman" w:eastAsia="Times New Roman" w:hAnsi="Times New Roman"/>
+                <w:b w:val="1"/>
+                <w:bCs w:val="1"/>
+              </w:rPr>
+            </w:pPr>
+            <w:r>
+              <w:rPr>
+                <w:rFonts w:ascii="Times New Roman" w:cs="Times New Roman" w:eastAsia="Times New Roman" w:hAnsi="Times New Roman"/>
+                <w:rtl w:val="0"/>
+              </w:rPr>
+              <w:t xml:space="preserve">Plate No. :</w:t>
+            </w:r>
+            <w:r>
+              <w:rPr>
+                <w:rFonts w:ascii="Times New Roman" w:cs="Times New Roman" w:eastAsia="Times New Roman" w:hAnsi="Times New Roman"/>
+                <w:b w:val="1"/>
+                <w:bCs w:val="1"/>
+                <w:rtl w:val="0"/>
+              </w:rPr>
+              <w:t xml:space="preserve"> {{PLATE_NO}}</w:t>
+            </w:r>
+          </w:p>
+        </w:tc>
+      </w:tr>
+      <w:tr>
+        <w:trPr>
+          <w:cantSplit w:val="0"/>
+          <w:tblHeader w:val="0"/>
+        </w:trPr>
+        <w:tc>
+          <w:tcPr>
+            <w:tcBorders>
+              <w:top w:color="000000" w:space="0" w:sz="0" w:val="nil"/>
+              <w:left w:color="000000" w:space="0" w:sz="0" w:val="nil"/>
+              <w:bottom w:color="000000" w:space="0" w:sz="0" w:val="nil"/>
+              <w:right w:color="000000" w:space="0" w:sz="0" w:val="nil"/>
+            </w:tcBorders>
+            <w:shd w:fill="auto" w:val="clear"/>
+            <w:tcMar>
+              <w:top w:w="0.0" w:type="dxa"/>
+              <w:left w:w="0.0" w:type="dxa"/>
+              <w:bottom w:w="0.0" w:type="dxa"/>
+              <w:right w:w="0.0" w:type="dxa"/>
+            </w:tcMar>
+          </w:tcPr>
+          <w:p>
+            <w:pPr>
+              <w:keepNext w:val="0"/>
+              <w:keepLines w:val="0"/>
+              <w:pageBreakBefore w:val="0"/>
+              <w:widowControl w:val="0"/>
+              <w:pBdr>
+                <w:top w:space="0" w:sz="0" w:val="nil"/>
+                <w:left w:space="0" w:sz="0" w:val="nil"/>
+                <w:bottom w:space="0" w:sz="0" w:val="nil"/>
+                <w:right w:space="0" w:sz="0" w:val="nil"/>
+                <w:between w:space="0" w:sz="0" w:val="nil"/>
+              </w:pBdr>
+              <w:shd w:fill="auto" w:val="clear"/>
+              <w:spacing w:after="0" w:before="0" w:line="360" w:lineRule="auto"/>
+              <w:ind w:left="0" w:right="0" w:firstLine="0"/>
+              <w:jc w:val="left"/>
+              <w:rPr>
+                <w:rFonts w:ascii="Times New Roman" w:cs="Times New Roman" w:eastAsia="Times New Roman" w:hAnsi="Times New Roman"/>
+                <w:b w:val="1"/>
+                <w:bCs w:val="1"/>
+              </w:rPr>
+            </w:pPr>
+            <w:r>
+              <w:rPr>
+                <w:rFonts w:ascii="Times New Roman" w:cs="Times New Roman" w:eastAsia="Times New Roman" w:hAnsi="Times New Roman"/>
+                <w:rtl w:val="0"/>
+              </w:rPr>
+              <w:t xml:space="preserve">Chassis No. :</w:t>
+            </w:r>
+            <w:r>
+              <w:rPr>
+                <w:rFonts w:ascii="Times New Roman" w:cs="Times New Roman" w:eastAsia="Times New Roman" w:hAnsi="Times New Roman"/>
+                <w:b w:val="1"/>
+                <w:bCs w:val="1"/>
+                <w:rtl w:val="0"/>
+              </w:rPr>
+              <w:t xml:space="preserve"> {{CHASSIS_NO}}</w:t>
+            </w:r>
+          </w:p>
+        </w:tc>
+        <w:tc>
+          <w:tcPr>
+            <w:tcBorders>
+              <w:top w:color="000000" w:space="0" w:sz="0" w:val="nil"/>
+              <w:left w:color="000000" w:space="0" w:sz="0" w:val="nil"/>
+              <w:bottom w:color="000000" w:space="0" w:sz="0" w:val="nil"/>
+              <w:right w:color="000000" w:space="0" w:sz="0" w:val="nil"/>
+            </w:tcBorders>
+            <w:shd w:fill="auto" w:val="clear"/>
+            <w:tcMar>
+              <w:top w:w="0.0" w:type="dxa"/>
+              <w:left w:w="0.0" w:type="dxa"/>
+              <w:bottom w:w="0.0" w:type="dxa"/>
+              <w:right w:w="0.0" w:type="dxa"/>
+            </w:tcMar>
+          </w:tcPr>
+          <w:p>
+            <w:pPr>
+              <w:keepNext w:val="0"/>
+              <w:keepLines w:val="0"/>
+              <w:pageBreakBefore w:val="0"/>
+              <w:widowControl w:val="0"/>
+              <w:pBdr>
+                <w:top w:space="0" w:sz="0" w:val="nil"/>
+                <w:left w:space="0" w:sz="0" w:val="nil"/>
+                <w:bottom w:space="0" w:sz="0" w:val="nil"/>
+                <w:right w:space="0" w:sz="0" w:val="nil"/>
+                <w:between w:space="0" w:sz="0" w:val="nil"/>
+              </w:pBdr>
+              <w:shd w:fill="auto" w:val="clear"/>
+              <w:spacing w:after="0" w:before="0" w:line="360" w:lineRule="auto"/>
+              <w:ind w:left="0" w:right="0" w:firstLine="0"/>
+              <w:jc w:val="left"/>
+              <w:rPr>
+                <w:rFonts w:ascii="Times New Roman" w:cs="Times New Roman" w:eastAsia="Times New Roman" w:hAnsi="Times New Roman"/>
+                <w:b w:val="1"/>
+                <w:bCs w:val="1"/>
+              </w:rPr>
+            </w:pPr>
+            <w:r>
+              <w:rPr>
+                <w:rFonts w:ascii="Times New Roman" w:cs="Times New Roman" w:eastAsia="Times New Roman" w:hAnsi="Times New Roman"/>
+                <w:rtl w:val="0"/>
+              </w:rPr>
+              <w:t xml:space="preserve">Route      :</w:t>
+            </w:r>
+            <w:r>
+              <w:rPr>
+                <w:rFonts w:ascii="Times New Roman" w:cs="Times New Roman" w:eastAsia="Times New Roman" w:hAnsi="Times New Roman"/>
+                <w:b w:val="1"/>
+                <w:bCs w:val="1"/>
+                <w:rtl w:val="0"/>
+              </w:rPr>
+              <w:t xml:space="preserve"> {{ROUTE}}</w:t>
+            </w:r>
+          </w:p>
+        </w:tc>
+      </w:tr>
+    </w:tbl>
     <w:p>
       <w:pPr>
         <w:spacing w:after="0" w:line="360" w:lineRule="auto"/>
@@ -611,31 +876,19 @@
       <w:r>
         <w:rPr>
           <w:rFonts w:ascii="Times New Roman" w:cs="Times New Roman" w:eastAsia="Times New Roman" w:hAnsi="Times New Roman"/>
-          <w:rtl w:val="0"/>
-        </w:rPr>
-        <w:tab/>
-        <w:tab/>
-        <w:t xml:space="preserve">Motor No.  :</w:t>
-        <w:tab/>
-      </w:r>
-      <w:r>
-        <w:rPr>
-          <w:rFonts w:ascii="Times New Roman" w:cs="Times New Roman" w:eastAsia="Times New Roman" w:hAnsi="Times New Roman"/>
           <w:b w:val="1"/>
           <w:bCs w:val="1"/>
           <w:rtl w:val="0"/>
         </w:rPr>
-        <w:t xml:space="preserve">[MOTOR_NO]</w:t>
-        <w:tab/>
-        <w:tab/>
-        <w:tab/>
-      </w:r>
-      <w:r>
-        <w:rPr>
-          <w:rFonts w:ascii="Times New Roman" w:cs="Times New Roman" w:eastAsia="Times New Roman" w:hAnsi="Times New Roman"/>
-          <w:rtl w:val="0"/>
-        </w:rPr>
-        <w:t xml:space="preserve">Plate No.: </w:t>
+        <w:tab/>
+        <w:tab/>
+      </w:r>
+      <w:r>
+        <w:rPr>
+          <w:rFonts w:ascii="Times New Roman" w:cs="Times New Roman" w:eastAsia="Times New Roman" w:hAnsi="Times New Roman"/>
+          <w:rtl w:val="0"/>
+        </w:rPr>
+        <w:t xml:space="preserve">Make           : </w:t>
       </w:r>
       <w:r>
         <w:rPr>
@@ -644,106 +897,6 @@
           <w:bCs w:val="1"/>
           <w:rtl w:val="0"/>
         </w:rPr>
-        <w:t xml:space="preserve">[PLATE_NO]</w:t>
-      </w:r>
-      <w:r>
-        <w:rPr>
-          <w:rFonts w:ascii="Times New Roman" w:cs="Times New Roman" w:eastAsia="Times New Roman" w:hAnsi="Times New Roman"/>
-          <w:rtl w:val="0"/>
-        </w:rPr>
-        <w:t xml:space="preserve"> </w:t>
-      </w:r>
-      <w:r>
-        <w:rPr>
-          <w:rtl w:val="0"/>
-        </w:rPr>
-      </w:r>
-    </w:p>
-    <w:p>
-      <w:pPr>
-        <w:spacing w:after="0" w:line="360" w:lineRule="auto"/>
-        <w:jc w:val="both"/>
-        <w:rPr>
-          <w:rFonts w:ascii="Times New Roman" w:cs="Times New Roman" w:eastAsia="Times New Roman" w:hAnsi="Times New Roman"/>
-          <w:b w:val="1"/>
-          <w:bCs w:val="1"/>
-        </w:rPr>
-      </w:pPr>
-      <w:r>
-        <w:rPr>
-          <w:rFonts w:ascii="Times New Roman" w:cs="Times New Roman" w:eastAsia="Times New Roman" w:hAnsi="Times New Roman"/>
-          <w:rtl w:val="0"/>
-        </w:rPr>
-        <w:tab/>
-        <w:tab/>
-        <w:t xml:space="preserve">Chassis No.:</w:t>
-        <w:tab/>
-      </w:r>
-      <w:r>
-        <w:rPr>
-          <w:rFonts w:ascii="Times New Roman" w:cs="Times New Roman" w:eastAsia="Times New Roman" w:hAnsi="Times New Roman"/>
-          <w:b w:val="1"/>
-          <w:bCs w:val="1"/>
-          <w:rtl w:val="0"/>
-        </w:rPr>
-        <w:t xml:space="preserve">[CHASSIS_NO]</w:t>
-        <w:tab/>
-        <w:tab/>
-      </w:r>
-      <w:r>
-        <w:rPr>
-          <w:rFonts w:ascii="Times New Roman" w:cs="Times New Roman" w:eastAsia="Times New Roman" w:hAnsi="Times New Roman"/>
-          <w:rtl w:val="0"/>
-        </w:rPr>
-        <w:t xml:space="preserve">Route: </w:t>
-      </w:r>
-      <w:r>
-        <w:rPr>
-          <w:rFonts w:ascii="Times New Roman" w:cs="Times New Roman" w:eastAsia="Times New Roman" w:hAnsi="Times New Roman"/>
-          <w:b w:val="1"/>
-          <w:bCs w:val="1"/>
-          <w:rtl w:val="0"/>
-        </w:rPr>
-        <w:t xml:space="preserve">[ROUTE]</w:t>
-      </w:r>
-    </w:p>
-    <w:p>
-      <w:pPr>
-        <w:spacing w:after="0" w:line="360" w:lineRule="auto"/>
-        <w:jc w:val="both"/>
-        <w:rPr>
-          <w:rFonts w:ascii="Times New Roman" w:cs="Times New Roman" w:eastAsia="Times New Roman" w:hAnsi="Times New Roman"/>
-          <w:b w:val="1"/>
-          <w:bCs w:val="1"/>
-        </w:rPr>
-      </w:pPr>
-      <w:r>
-        <w:rPr>
-          <w:rFonts w:ascii="Times New Roman" w:cs="Times New Roman" w:eastAsia="Times New Roman" w:hAnsi="Times New Roman"/>
-          <w:b w:val="1"/>
-          <w:bCs w:val="1"/>
-          <w:rtl w:val="0"/>
-        </w:rPr>
-        <w:tab/>
-        <w:tab/>
-      </w:r>
-      <w:r>
-        <w:rPr>
-          <w:rFonts w:ascii="Times New Roman" w:cs="Times New Roman" w:eastAsia="Times New Roman" w:hAnsi="Times New Roman"/>
-          <w:rtl w:val="0"/>
-        </w:rPr>
-        <w:t xml:space="preserve">Make</w:t>
-        <w:tab/>
-        <w:t xml:space="preserve">       :</w:t>
-      </w:r>
-      <w:r>
-        <w:rPr>
-          <w:rFonts w:ascii="Times New Roman" w:cs="Times New Roman" w:eastAsia="Times New Roman" w:hAnsi="Times New Roman"/>
-          <w:b w:val="1"/>
-          <w:bCs w:val="1"/>
-          <w:rtl w:val="0"/>
-        </w:rPr>
-        <w:tab/>
         <w:t xml:space="preserve">[MAKE]</w:t>
       </w:r>
     </w:p>
@@ -2320,6 +2473,13 @@
       <w:sz w:val="48"/>
       <w:szCs w:val="48"/>
     </w:rPr>
+  </w:style>
+  <w:style w:type="table" w:styleId="Table1">
+    <w:basedOn w:val="TableNormal"/>
+    <w:tblPr>
+      <w:tblStyleRowBandSize w:val="1"/>
+      <w:tblStyleColBandSize w:val="1"/>
+    </w:tblPr>
   </w:style>
 </w:styles>
 </file>

</xml_diff>

<commit_message>
feat: Implement K-Means Clustering for Route Saturation Analysis
- Added new RouteData table to store demographic factors for clustering.
- Introduced run_kmeans_clustering function to analyze route saturation based on active fleet, population, and road length.
- Updated main.py to include new API endpoint for updating route demographic data.
- Enhanced doc_generator.py to adjust signature size and formatting.
- Modified frontend Dashboard to handle route demographic updates and display clustering status.
- Added error handling for algorithmic saturation in TodaClient component.
- Updated template and document generation logic to reflect new clustering features.
</commit_message>
<xml_diff>
--- a/backend/template.docx
+++ b/backend/template.docx
@@ -29,7 +29,7 @@
           <w:szCs w:val="26"/>
           <w:rtl w:val="0"/>
         </w:rPr>
-        <w:t xml:space="preserve">Republic of the Philippines</w:t>
+        <w:t xml:space="preserve">manRepublic of the Philippines</w:t>
         <w:tab/>
         <w:tab/>
       </w:r>
@@ -46,12 +46,12 @@
             <wp:extent cx="762635" cy="762635"/>
             <wp:effectExtent b="0" l="0" r="0" t="0"/>
             <wp:wrapNone/>
-            <wp:docPr id="2" name="image3.png"/>
+            <wp:docPr id="2" name="image2.png"/>
             <a:graphic>
               <a:graphicData uri="http://schemas.openxmlformats.org/drawingml/2006/picture">
                 <pic:pic>
                   <pic:nvPicPr>
-                    <pic:cNvPr id="0" name="image3.png"/>
+                    <pic:cNvPr id="0" name="image2.png"/>
                     <pic:cNvPicPr preferRelativeResize="0"/>
                   </pic:nvPicPr>
                   <pic:blipFill>
@@ -130,12 +130,12 @@
             <wp:extent cx="1035685" cy="1079500"/>
             <wp:effectExtent b="0" l="0" r="0" t="0"/>
             <wp:wrapNone/>
-            <wp:docPr id="1" name="image2.png"/>
+            <wp:docPr id="1" name="image3.png"/>
             <a:graphic>
               <a:graphicData uri="http://schemas.openxmlformats.org/drawingml/2006/picture">
                 <pic:pic>
                   <pic:nvPicPr>
-                    <pic:cNvPr id="0" name="image2.png"/>
+                    <pic:cNvPr id="0" name="image3.png"/>
                     <pic:cNvPicPr preferRelativeResize="0"/>
                   </pic:nvPicPr>
                   <pic:blipFill>
@@ -444,6 +444,8 @@
           <w:rFonts w:ascii="Times New Roman" w:cs="Times New Roman" w:eastAsia="Times New Roman" w:hAnsi="Times New Roman"/>
           <w:b w:val="1"/>
           <w:bCs w:val="1"/>
+          <w:sz w:val="24"/>
+          <w:szCs w:val="24"/>
           <w:rtl w:val="0"/>
         </w:rPr>
         <w:t xml:space="preserve">[SBN_NO]</w:t>
@@ -1710,52 +1712,6 @@
         <w:spacing w:after="0" w:line="240" w:lineRule="auto"/>
         <w:jc w:val="both"/>
         <w:rPr>
-          <w:rFonts w:ascii="Times New Roman" w:cs="Times New Roman" w:eastAsia="Times New Roman" w:hAnsi="Times New Roman"/>
-          <w:b w:val="1"/>
-          <w:bCs w:val="1"/>
-          <w:sz w:val="24"/>
-          <w:szCs w:val="24"/>
-        </w:rPr>
-      </w:pPr>
-      <w:r>
-        <w:rPr>
-          <w:rFonts w:ascii="Times New Roman" w:cs="Times New Roman" w:eastAsia="Times New Roman" w:hAnsi="Times New Roman"/>
-          <w:b w:val="1"/>
-          <w:bCs w:val="1"/>
-          <w:sz w:val="24"/>
-          <w:szCs w:val="24"/>
-          <w:rtl w:val="0"/>
-        </w:rPr>
-        <w:tab/>
-        <w:tab/>
-        <w:tab/>
-        <w:tab/>
-        <w:tab/>
-      </w:r>
-    </w:p>
-    <w:p>
-      <w:pPr>
-        <w:keepNext w:val="0"/>
-        <w:keepLines w:val="0"/>
-        <w:pageBreakBefore w:val="0"/>
-        <w:widowControl w:val="1"/>
-        <w:pBdr>
-          <w:top w:space="0" w:sz="0" w:val="nil"/>
-          <w:left w:space="0" w:sz="0" w:val="nil"/>
-          <w:bottom w:space="0" w:sz="0" w:val="nil"/>
-          <w:right w:space="0" w:sz="0" w:val="nil"/>
-          <w:between w:space="0" w:sz="0" w:val="nil"/>
-        </w:pBdr>
-        <w:shd w:fill="auto" w:val="clear"/>
-        <w:tabs>
-          <w:tab w:val="left" w:leader="none" w:pos="6435"/>
-          <w:tab w:val="left" w:leader="none" w:pos="6975"/>
-          <w:tab w:val="left" w:leader="none" w:pos="7080"/>
-        </w:tabs>
-        <w:spacing w:after="0" w:before="0" w:line="240" w:lineRule="auto"/>
-        <w:ind w:left="0" w:right="0" w:firstLine="0"/>
-        <w:jc w:val="left"/>
-        <w:rPr>
           <w:rFonts w:ascii="Calibri" w:cs="Calibri" w:eastAsia="Calibri" w:hAnsi="Calibri"/>
           <w:b w:val="0"/>
           <w:bCs w:val="0"/>
@@ -1773,62 +1729,17 @@
       </w:pPr>
       <w:r>
         <w:rPr>
-          <w:rFonts w:ascii="Calibri" w:cs="Calibri" w:eastAsia="Calibri" w:hAnsi="Calibri"/>
-          <w:b w:val="0"/>
-          <w:bCs w:val="0"/>
-          <w:i w:val="0"/>
-          <w:iCs w:val="0"/>
-          <w:smallCaps w:val="0"/>
-          <w:strike w:val="0"/>
-          <w:color w:val="000000"/>
+          <w:rFonts w:ascii="Times New Roman" w:cs="Times New Roman" w:eastAsia="Times New Roman" w:hAnsi="Times New Roman"/>
+          <w:b w:val="1"/>
+          <w:bCs w:val="1"/>
           <w:sz w:val="24"/>
           <w:szCs w:val="24"/>
-          <w:u w:val="none"/>
-          <w:shd w:fill="auto" w:val="clear"/>
-          <w:vertAlign w:val="baseline"/>
-          <w:rtl w:val="0"/>
-        </w:rPr>
-        <w:tab/>
-        <w:tab/>
-        <w:tab/>
-      </w:r>
-    </w:p>
-    <w:p>
-      <w:pPr>
-        <w:keepNext w:val="0"/>
-        <w:keepLines w:val="0"/>
-        <w:pageBreakBefore w:val="0"/>
-        <w:widowControl w:val="1"/>
-        <w:pBdr>
-          <w:top w:space="0" w:sz="0" w:val="nil"/>
-          <w:left w:space="0" w:sz="0" w:val="nil"/>
-          <w:bottom w:space="0" w:sz="0" w:val="nil"/>
-          <w:right w:space="0" w:sz="0" w:val="nil"/>
-          <w:between w:space="0" w:sz="0" w:val="nil"/>
-        </w:pBdr>
-        <w:shd w:fill="auto" w:val="clear"/>
-        <w:tabs>
-          <w:tab w:val="left" w:leader="none" w:pos="6810"/>
-        </w:tabs>
-        <w:spacing w:after="0" w:before="0" w:line="240" w:lineRule="auto"/>
-        <w:ind w:left="0" w:right="0" w:firstLine="0"/>
-        <w:jc w:val="left"/>
-        <w:rPr>
-          <w:rFonts w:ascii="Calibri" w:cs="Calibri" w:eastAsia="Calibri" w:hAnsi="Calibri"/>
-          <w:b w:val="0"/>
-          <w:bCs w:val="0"/>
-          <w:i w:val="0"/>
-          <w:iCs w:val="0"/>
-          <w:smallCaps w:val="0"/>
-          <w:strike w:val="0"/>
-          <w:color w:val="000000"/>
-          <w:sz w:val="24"/>
-          <w:szCs w:val="24"/>
-          <w:u w:val="none"/>
-          <w:shd w:fill="auto" w:val="clear"/>
-          <w:vertAlign w:val="baseline"/>
-        </w:rPr>
-      </w:pPr>
+          <w:rtl w:val="0"/>
+        </w:rPr>
+        <w:tab/>
+        <w:tab/>
+        <w:tab/>
+      </w:r>
       <w:r>
         <w:rPr>
           <w:rtl w:val="0"/>
@@ -1856,31 +1767,83 @@
           <w:rFonts w:ascii="Times New Roman" w:cs="Times New Roman" w:eastAsia="Times New Roman" w:hAnsi="Times New Roman"/>
           <w:b w:val="1"/>
           <w:bCs w:val="1"/>
-          <w:i w:val="0"/>
-          <w:iCs w:val="0"/>
-          <w:smallCaps w:val="0"/>
-          <w:strike w:val="0"/>
-          <w:color w:val="000000"/>
-          <w:u w:val="none"/>
-          <w:shd w:fill="auto" w:val="clear"/>
-          <w:vertAlign w:val="baseline"/>
-        </w:rPr>
-      </w:pPr>
-      <w:r>
-        <w:rPr>
-          <w:rFonts w:ascii="Times New Roman" w:cs="Times New Roman" w:eastAsia="Times New Roman" w:hAnsi="Times New Roman"/>
-          <w:b w:val="1"/>
-          <w:bCs w:val="1"/>
-          <w:rtl w:val="0"/>
-        </w:rPr>
-        <w:t xml:space="preserve">[E_SIGNATURE]</w:t>
-      </w:r>
-      <w:r>
-        <w:rPr>
-          <w:rtl w:val="0"/>
-        </w:rPr>
-      </w:r>
-    </w:p>
+        </w:rPr>
+      </w:pPr>
+      <w:r>
+        <w:rPr>
+          <w:rtl w:val="0"/>
+        </w:rPr>
+      </w:r>
+    </w:p>
+    <w:tbl>
+      <w:tblPr>
+        <w:tblStyle w:val="Table2"/>
+        <w:tblW w:w="2235.0" w:type="dxa"/>
+        <w:jc w:val="center"/>
+        <w:tblLayout w:type="fixed"/>
+        <w:tblLook w:val="0600"/>
+      </w:tblPr>
+      <w:tblGrid>
+        <w:gridCol w:w="2235"/>
+        <w:tblGridChange w:id="0">
+          <w:tblGrid>
+            <w:gridCol w:w="2235"/>
+          </w:tblGrid>
+        </w:tblGridChange>
+      </w:tblGrid>
+      <w:tr>
+        <w:trPr>
+          <w:cantSplit w:val="1"/>
+          <w:trHeight w:val="863.9999999999999" w:hRule="atLeast"/>
+          <w:tblHeader w:val="0"/>
+        </w:trPr>
+        <w:tc>
+          <w:tcPr>
+            <w:shd w:fill="auto" w:val="clear"/>
+            <w:tcMar>
+              <w:top w:w="100.0" w:type="dxa"/>
+              <w:left w:w="100.0" w:type="dxa"/>
+              <w:bottom w:w="100.0" w:type="dxa"/>
+              <w:right w:w="100.0" w:type="dxa"/>
+            </w:tcMar>
+            <w:vAlign w:val="top"/>
+          </w:tcPr>
+          <w:p>
+            <w:pPr>
+              <w:keepNext w:val="0"/>
+              <w:keepLines w:val="0"/>
+              <w:pageBreakBefore w:val="0"/>
+              <w:widowControl w:val="0"/>
+              <w:pBdr>
+                <w:top w:space="0" w:sz="0" w:val="nil"/>
+                <w:left w:space="0" w:sz="0" w:val="nil"/>
+                <w:bottom w:space="0" w:sz="0" w:val="nil"/>
+                <w:right w:space="0" w:sz="0" w:val="nil"/>
+                <w:between w:space="0" w:sz="0" w:val="nil"/>
+              </w:pBdr>
+              <w:shd w:fill="auto" w:val="clear"/>
+              <w:spacing w:after="0" w:before="0" w:line="240" w:lineRule="auto"/>
+              <w:ind w:left="0" w:right="0" w:firstLine="0"/>
+              <w:jc w:val="center"/>
+              <w:rPr>
+                <w:rFonts w:ascii="Times New Roman" w:cs="Times New Roman" w:eastAsia="Times New Roman" w:hAnsi="Times New Roman"/>
+                <w:b w:val="1"/>
+                <w:bCs w:val="1"/>
+              </w:rPr>
+            </w:pPr>
+            <w:r>
+              <w:rPr>
+                <w:rFonts w:ascii="Times New Roman" w:cs="Times New Roman" w:eastAsia="Times New Roman" w:hAnsi="Times New Roman"/>
+                <w:b w:val="1"/>
+                <w:bCs w:val="1"/>
+                <w:rtl w:val="0"/>
+              </w:rPr>
+              <w:t xml:space="preserve">[E_SIGNATURE]</w:t>
+            </w:r>
+          </w:p>
+        </w:tc>
+      </w:tr>
+    </w:tbl>
     <w:p>
       <w:pPr>
         <w:keepNext w:val="0"/>
@@ -2480,6 +2443,50 @@
       <w:tblStyleRowBandSize w:val="1"/>
       <w:tblStyleColBandSize w:val="1"/>
     </w:tblPr>
+  </w:style>
+  <w:style w:type="table" w:styleId="Table2">
+    <w:basedOn w:val="TableNormal"/>
+    <w:tblPr>
+      <w:tblStyleRowBandSize w:val="1"/>
+      <w:tblStyleColBandSize w:val="1"/>
+      <w:tblCellMar/>
+    </w:tblPr>
+    <w:tblStylePr w:type="band1Horz">
+      <w:tcPr/>
+    </w:tblStylePr>
+    <w:tblStylePr w:type="band1Vert">
+      <w:tcPr/>
+    </w:tblStylePr>
+    <w:tblStylePr w:type="band2Horz">
+      <w:tcPr/>
+    </w:tblStylePr>
+    <w:tblStylePr w:type="band2Vert">
+      <w:tcPr/>
+    </w:tblStylePr>
+    <w:tblStylePr w:type="firstCol">
+      <w:tcPr/>
+    </w:tblStylePr>
+    <w:tblStylePr w:type="firstRow">
+      <w:tcPr/>
+    </w:tblStylePr>
+    <w:tblStylePr w:type="lastCol">
+      <w:tcPr/>
+    </w:tblStylePr>
+    <w:tblStylePr w:type="lastRow">
+      <w:tcPr/>
+    </w:tblStylePr>
+    <w:tblStylePr w:type="neCell">
+      <w:tcPr/>
+    </w:tblStylePr>
+    <w:tblStylePr w:type="nwCell">
+      <w:tcPr/>
+    </w:tblStylePr>
+    <w:tblStylePr w:type="seCell">
+      <w:tcPr/>
+    </w:tblStylePr>
+    <w:tblStylePr w:type="swCell">
+      <w:tcPr/>
+    </w:tblStylePr>
   </w:style>
 </w:styles>
 </file>

</xml_diff>

<commit_message>
fix: update template.docx to resolve discrepancies in document structure
</commit_message>
<xml_diff>
--- a/backend/template.docx
+++ b/backend/template.docx
@@ -1,6 +1,6 @@
 
 <file path=word/document.xml><?xml version="1.0" encoding="utf-8"?>
-<w:document xmlns:wpc="http://schemas.microsoft.com/office/word/2010/wordprocessingCanvas" xmlns:cx="http://schemas.microsoft.com/office/drawing/2014/chartex" xmlns:cx1="http://schemas.microsoft.com/office/drawing/2015/9/8/chartex" xmlns:cx2="http://schemas.microsoft.com/office/drawing/2015/10/21/chartex" xmlns:cx3="http://schemas.microsoft.com/office/drawing/2016/5/9/chartex" xmlns:cx4="http://schemas.microsoft.com/office/drawing/2016/5/10/chartex" xmlns:cx5="http://schemas.microsoft.com/office/drawing/2016/5/11/chartex" xmlns:cx6="http://schemas.microsoft.com/office/drawing/2016/5/12/chartex" xmlns:cx7="http://schemas.microsoft.com/office/drawing/2016/5/13/chartex" xmlns:cx8="http://schemas.microsoft.com/office/drawing/2016/5/14/chartex" xmlns:mc="http://schemas.openxmlformats.org/markup-compatibility/2006" xmlns:aink="http://schemas.microsoft.com/office/drawing/2016/ink" xmlns:am3d="http://schemas.microsoft.com/office/drawing/2017/model3d" xmlns:o="urn:schemas-microsoft-com:office:office" xmlns:r="http://schemas.openxmlformats.org/officeDocument/2006/relationships" xmlns:m="http://schemas.openxmlformats.org/officeDocument/2006/math" xmlns:v="urn:schemas-microsoft-com:vml" xmlns:wp14="http://schemas.microsoft.com/office/word/2010/wordprocessingDrawing" xmlns:wp="http://schemas.openxmlformats.org/drawingml/2006/wordprocessingDrawing" xmlns:w10="urn:schemas-microsoft-com:office:word" xmlns:w="http://schemas.openxmlformats.org/wordprocessingml/2006/main" xmlns:w14="http://schemas.microsoft.com/office/word/2010/wordml" xmlns:w15="http://schemas.microsoft.com/office/word/2012/wordml" xmlns:w16cex="http://schemas.microsoft.com/office/word/2018/wordml/cex" xmlns:w16cid="http://schemas.microsoft.com/office/word/2016/wordml/cid" xmlns:w16="http://schemas.microsoft.com/office/word/2018/wordml" xmlns:w16sdtdh="http://schemas.microsoft.com/office/word/2020/wordml/sdtdatahash" xmlns:w16se="http://schemas.microsoft.com/office/word/2015/wordml/symex" xmlns:wpg="http://schemas.microsoft.com/office/word/2010/wordprocessingGroup" xmlns:wpi="http://schemas.microsoft.com/office/word/2010/wordprocessingInk" xmlns:wne="http://schemas.microsoft.com/office/word/2006/wordml" xmlns:wps="http://schemas.microsoft.com/office/word/2010/wordprocessingShape" mc:Ignorable="w14 w15 w16se w16cid w16 w16cex w16sdtdh wp14">
+<w:document xmlns:wpc="http://schemas.microsoft.com/office/word/2010/wordprocessingCanvas" xmlns:cx="http://schemas.microsoft.com/office/drawing/2014/chartex" xmlns:mc="http://schemas.openxmlformats.org/markup-compatibility/2006" xmlns:o="urn:schemas-microsoft-com:office:office" xmlns:r="http://schemas.openxmlformats.org/officeDocument/2006/relationships" xmlns:m="http://schemas.openxmlformats.org/officeDocument/2006/math" xmlns:v="urn:schemas-microsoft-com:vml" xmlns:wp14="http://schemas.microsoft.com/office/word/2010/wordprocessingDrawing" xmlns:wp="http://schemas.openxmlformats.org/drawingml/2006/wordprocessingDrawing" xmlns:w10="urn:schemas-microsoft-com:office:word" xmlns:w="http://schemas.openxmlformats.org/wordprocessingml/2006/main" xmlns:w14="http://schemas.microsoft.com/office/word/2010/wordml" xmlns:w15="http://schemas.microsoft.com/office/word/2012/wordml" xmlns:w16se="http://schemas.microsoft.com/office/word/2015/wordml/symex" xmlns:wpg="http://schemas.microsoft.com/office/word/2010/wordprocessingGroup" xmlns:wpi="http://schemas.microsoft.com/office/word/2010/wordprocessingInk" xmlns:wne="http://schemas.microsoft.com/office/word/2006/wordml" xmlns:wps="http://schemas.microsoft.com/office/word/2010/wordprocessingShape" mc:Ignorable="w14 w15 w16se wp14">
   <w:body>
     <w:p>
       <w:pPr>
@@ -11,9 +11,8 @@
         <w:spacing w:after="0"/>
         <w:ind w:right="-175"/>
         <w:rPr>
-          <w:rFonts w:ascii="Bookman Old Style" w:eastAsia="Bookman Old Style" w:hAnsi="Bookman Old Style" w:cs="Bookman Old Style"/>
-          <w:b/>
-          <w:bCs/>
+          <w:rFonts w:ascii="Bookman Old Style" w:hAnsi="Bookman Old Style" w:cs="Times New Roman"/>
+          <w:b/>
           <w:sz w:val="26"/>
           <w:szCs w:val="26"/>
         </w:rPr>
@@ -21,36 +20,178 @@
       <w:r>
         <w:rPr>
           <w:noProof/>
+          <w:lang w:val="en-PH" w:eastAsia="en-PH"/>
         </w:rPr>
         <w:drawing>
-          <wp:anchor distT="0" distB="0" distL="0" distR="0" simplePos="0" relativeHeight="251660288" behindDoc="1" locked="0" layoutInCell="1" hidden="0" allowOverlap="1" wp14:anchorId="45EEEB47" wp14:editId="5C2FB61C">
+          <wp:anchor distT="0" distB="0" distL="114300" distR="114300" simplePos="0" relativeHeight="251659264" behindDoc="1" locked="0" layoutInCell="1" allowOverlap="1" wp14:anchorId="13231DDD" wp14:editId="21C805C3">
             <wp:simplePos x="0" y="0"/>
             <wp:positionH relativeFrom="column">
-              <wp:posOffset>4260850</wp:posOffset>
+              <wp:posOffset>3507105</wp:posOffset>
             </wp:positionH>
             <wp:positionV relativeFrom="paragraph">
-              <wp:posOffset>-132715</wp:posOffset>
+              <wp:posOffset>55880</wp:posOffset>
             </wp:positionV>
-            <wp:extent cx="1035685" cy="1079500"/>
+            <wp:extent cx="762635" cy="762635"/>
             <wp:effectExtent l="0" t="0" r="0" b="0"/>
             <wp:wrapNone/>
-            <wp:docPr id="1" name="image3.png"/>
-            <wp:cNvGraphicFramePr/>
+            <wp:docPr id="5" name="Picture 5"/>
+            <wp:cNvGraphicFramePr>
+              <a:graphicFrameLocks xmlns:a="http://schemas.openxmlformats.org/drawingml/2006/main"/>
+            </wp:cNvGraphicFramePr>
             <a:graphic xmlns:a="http://schemas.openxmlformats.org/drawingml/2006/main">
               <a:graphicData uri="http://schemas.openxmlformats.org/drawingml/2006/picture">
                 <pic:pic xmlns:pic="http://schemas.openxmlformats.org/drawingml/2006/picture">
                   <pic:nvPicPr>
-                    <pic:cNvPr id="0" name="image3.png"/>
-                    <pic:cNvPicPr preferRelativeResize="0"/>
+                    <pic:cNvPr id="0" name="Picture 3"/>
+                    <pic:cNvPicPr>
+                      <a:picLocks noChangeArrowheads="1"/>
+                    </pic:cNvPicPr>
                   </pic:nvPicPr>
                   <pic:blipFill>
-                    <a:blip r:embed="rId7"/>
+                    <a:blip r:embed="rId7" cstate="print">
+                      <a:extLst>
+                        <a:ext uri="{28A0092B-C50C-407E-A947-70E740481C1C}">
+                          <a14:useLocalDpi xmlns:a14="http://schemas.microsoft.com/office/drawing/2010/main" val="0"/>
+                        </a:ext>
+                      </a:extLst>
+                    </a:blip>
                     <a:srcRect/>
                     <a:stretch>
                       <a:fillRect/>
                     </a:stretch>
                   </pic:blipFill>
-                  <pic:spPr>
+                  <pic:spPr bwMode="auto">
+                    <a:xfrm>
+                      <a:off x="0" y="0"/>
+                      <a:ext cx="762635" cy="762635"/>
+                    </a:xfrm>
+                    <a:prstGeom prst="rect">
+                      <a:avLst/>
+                    </a:prstGeom>
+                    <a:noFill/>
+                  </pic:spPr>
+                </pic:pic>
+              </a:graphicData>
+            </a:graphic>
+            <wp14:sizeRelH relativeFrom="page">
+              <wp14:pctWidth>0</wp14:pctWidth>
+            </wp14:sizeRelH>
+            <wp14:sizeRelV relativeFrom="page">
+              <wp14:pctHeight>0</wp14:pctHeight>
+            </wp14:sizeRelV>
+          </wp:anchor>
+        </w:drawing>
+      </w:r>
+      <w:bookmarkStart w:id="0" w:name="_Hlk196749847"/>
+      <w:r>
+        <w:rPr>
+          <w:noProof/>
+          <w:lang w:val="en-PH" w:eastAsia="en-PH"/>
+        </w:rPr>
+        <w:drawing>
+          <wp:anchor distT="0" distB="0" distL="114300" distR="114300" simplePos="0" relativeHeight="251660288" behindDoc="1" locked="0" layoutInCell="1" allowOverlap="1" wp14:anchorId="453D507F" wp14:editId="30785A82">
+            <wp:simplePos x="0" y="0"/>
+            <wp:positionH relativeFrom="column">
+              <wp:posOffset>5281295</wp:posOffset>
+            </wp:positionH>
+            <wp:positionV relativeFrom="paragraph">
+              <wp:posOffset>23495</wp:posOffset>
+            </wp:positionV>
+            <wp:extent cx="824230" cy="827405"/>
+            <wp:effectExtent l="0" t="0" r="0" b="0"/>
+            <wp:wrapNone/>
+            <wp:docPr id="4" name="Picture 4"/>
+            <wp:cNvGraphicFramePr>
+              <a:graphicFrameLocks xmlns:a="http://schemas.openxmlformats.org/drawingml/2006/main"/>
+            </wp:cNvGraphicFramePr>
+            <a:graphic xmlns:a="http://schemas.openxmlformats.org/drawingml/2006/main">
+              <a:graphicData uri="http://schemas.openxmlformats.org/drawingml/2006/picture">
+                <pic:pic xmlns:pic="http://schemas.openxmlformats.org/drawingml/2006/picture">
+                  <pic:nvPicPr>
+                    <pic:cNvPr id="0" name="Picture 2"/>
+                    <pic:cNvPicPr>
+                      <a:picLocks noChangeArrowheads="1"/>
+                    </pic:cNvPicPr>
+                  </pic:nvPicPr>
+                  <pic:blipFill>
+                    <a:blip r:embed="rId8">
+                      <a:extLst>
+                        <a:ext uri="{28A0092B-C50C-407E-A947-70E740481C1C}">
+                          <a14:useLocalDpi xmlns:a14="http://schemas.microsoft.com/office/drawing/2010/main" val="0"/>
+                        </a:ext>
+                      </a:extLst>
+                    </a:blip>
+                    <a:srcRect/>
+                    <a:stretch>
+                      <a:fillRect/>
+                    </a:stretch>
+                  </pic:blipFill>
+                  <pic:spPr bwMode="auto">
+                    <a:xfrm>
+                      <a:off x="0" y="0"/>
+                      <a:ext cx="824230" cy="827405"/>
+                    </a:xfrm>
+                    <a:prstGeom prst="rect">
+                      <a:avLst/>
+                    </a:prstGeom>
+                    <a:noFill/>
+                  </pic:spPr>
+                </pic:pic>
+              </a:graphicData>
+            </a:graphic>
+            <wp14:sizeRelH relativeFrom="page">
+              <wp14:pctWidth>0</wp14:pctWidth>
+            </wp14:sizeRelH>
+            <wp14:sizeRelV relativeFrom="page">
+              <wp14:pctHeight>0</wp14:pctHeight>
+            </wp14:sizeRelV>
+          </wp:anchor>
+        </w:drawing>
+      </w:r>
+      <w:r>
+        <w:rPr>
+          <w:noProof/>
+          <w:lang w:val="en-PH" w:eastAsia="en-PH"/>
+        </w:rPr>
+        <w:drawing>
+          <wp:anchor distT="0" distB="0" distL="114300" distR="114300" simplePos="0" relativeHeight="251661312" behindDoc="1" locked="0" layoutInCell="1" allowOverlap="1" wp14:anchorId="5C45EE3A" wp14:editId="3FB6BBAB">
+            <wp:simplePos x="0" y="0"/>
+            <wp:positionH relativeFrom="page">
+              <wp:posOffset>4993005</wp:posOffset>
+            </wp:positionH>
+            <wp:positionV relativeFrom="paragraph">
+              <wp:posOffset>-96520</wp:posOffset>
+            </wp:positionV>
+            <wp:extent cx="1035685" cy="1079500"/>
+            <wp:effectExtent l="0" t="0" r="0" b="0"/>
+            <wp:wrapNone/>
+            <wp:docPr id="1" name="Picture 1"/>
+            <wp:cNvGraphicFramePr>
+              <a:graphicFrameLocks xmlns:a="http://schemas.openxmlformats.org/drawingml/2006/main" noChangeAspect="1"/>
+            </wp:cNvGraphicFramePr>
+            <a:graphic xmlns:a="http://schemas.openxmlformats.org/drawingml/2006/main">
+              <a:graphicData uri="http://schemas.openxmlformats.org/drawingml/2006/picture">
+                <pic:pic xmlns:pic="http://schemas.openxmlformats.org/drawingml/2006/picture">
+                  <pic:nvPicPr>
+                    <pic:cNvPr id="0" name="Picture 1"/>
+                    <pic:cNvPicPr>
+                      <a:picLocks noChangeAspect="1" noChangeArrowheads="1"/>
+                    </pic:cNvPicPr>
+                  </pic:nvPicPr>
+                  <pic:blipFill>
+                    <a:blip r:embed="rId9" cstate="print">
+                      <a:extLst>
+                        <a:ext uri="{28A0092B-C50C-407E-A947-70E740481C1C}">
+                          <a14:useLocalDpi xmlns:a14="http://schemas.microsoft.com/office/drawing/2010/main" val="0"/>
+                        </a:ext>
+                      </a:extLst>
+                    </a:blip>
+                    <a:srcRect/>
+                    <a:stretch>
+                      <a:fillRect/>
+                    </a:stretch>
+                  </pic:blipFill>
+                  <pic:spPr bwMode="auto">
                     <a:xfrm>
                       <a:off x="0" y="0"/>
                       <a:ext cx="1035685" cy="1079500"/>
@@ -58,115 +199,24 @@
                     <a:prstGeom prst="rect">
                       <a:avLst/>
                     </a:prstGeom>
-                    <a:ln/>
+                    <a:noFill/>
                   </pic:spPr>
                 </pic:pic>
               </a:graphicData>
             </a:graphic>
+            <wp14:sizeRelH relativeFrom="page">
+              <wp14:pctWidth>0</wp14:pctWidth>
+            </wp14:sizeRelH>
+            <wp14:sizeRelV relativeFrom="page">
+              <wp14:pctHeight>0</wp14:pctHeight>
+            </wp14:sizeRelV>
           </wp:anchor>
         </w:drawing>
       </w:r>
       <w:r>
         <w:rPr>
-          <w:noProof/>
-        </w:rPr>
-        <w:drawing>
-          <wp:anchor distT="0" distB="0" distL="0" distR="0" simplePos="0" relativeHeight="251659264" behindDoc="1" locked="0" layoutInCell="1" hidden="0" allowOverlap="1" wp14:anchorId="6A009495" wp14:editId="7414C753">
-            <wp:simplePos x="0" y="0"/>
-            <wp:positionH relativeFrom="column">
-              <wp:posOffset>5281295</wp:posOffset>
-            </wp:positionH>
-            <wp:positionV relativeFrom="paragraph">
-              <wp:posOffset>-14605</wp:posOffset>
-            </wp:positionV>
-            <wp:extent cx="824230" cy="827405"/>
-            <wp:effectExtent l="0" t="0" r="0" b="0"/>
-            <wp:wrapNone/>
-            <wp:docPr id="3" name="image1.png"/>
-            <wp:cNvGraphicFramePr/>
-            <a:graphic xmlns:a="http://schemas.openxmlformats.org/drawingml/2006/main">
-              <a:graphicData uri="http://schemas.openxmlformats.org/drawingml/2006/picture">
-                <pic:pic xmlns:pic="http://schemas.openxmlformats.org/drawingml/2006/picture">
-                  <pic:nvPicPr>
-                    <pic:cNvPr id="0" name="image1.png"/>
-                    <pic:cNvPicPr preferRelativeResize="0"/>
-                  </pic:nvPicPr>
-                  <pic:blipFill>
-                    <a:blip r:embed="rId8"/>
-                    <a:srcRect/>
-                    <a:stretch>
-                      <a:fillRect/>
-                    </a:stretch>
-                  </pic:blipFill>
-                  <pic:spPr>
-                    <a:xfrm>
-                      <a:off x="0" y="0"/>
-                      <a:ext cx="824230" cy="827405"/>
-                    </a:xfrm>
-                    <a:prstGeom prst="rect">
-                      <a:avLst/>
-                    </a:prstGeom>
-                    <a:ln/>
-                  </pic:spPr>
-                </pic:pic>
-              </a:graphicData>
-            </a:graphic>
-          </wp:anchor>
-        </w:drawing>
-      </w:r>
-      <w:r>
-        <w:rPr>
-          <w:noProof/>
-        </w:rPr>
-        <w:drawing>
-          <wp:anchor distT="0" distB="0" distL="0" distR="0" simplePos="0" relativeHeight="251658240" behindDoc="1" locked="0" layoutInCell="1" hidden="0" allowOverlap="1" wp14:anchorId="183D2472" wp14:editId="7438835D">
-            <wp:simplePos x="0" y="0"/>
-            <wp:positionH relativeFrom="column">
-              <wp:posOffset>3506470</wp:posOffset>
-            </wp:positionH>
-            <wp:positionV relativeFrom="paragraph">
-              <wp:posOffset>18085</wp:posOffset>
-            </wp:positionV>
-            <wp:extent cx="762635" cy="762635"/>
-            <wp:effectExtent l="0" t="0" r="0" b="0"/>
-            <wp:wrapNone/>
-            <wp:docPr id="2" name="image2.png"/>
-            <wp:cNvGraphicFramePr/>
-            <a:graphic xmlns:a="http://schemas.openxmlformats.org/drawingml/2006/main">
-              <a:graphicData uri="http://schemas.openxmlformats.org/drawingml/2006/picture">
-                <pic:pic xmlns:pic="http://schemas.openxmlformats.org/drawingml/2006/picture">
-                  <pic:nvPicPr>
-                    <pic:cNvPr id="0" name="image2.png"/>
-                    <pic:cNvPicPr preferRelativeResize="0"/>
-                  </pic:nvPicPr>
-                  <pic:blipFill>
-                    <a:blip r:embed="rId9"/>
-                    <a:srcRect/>
-                    <a:stretch>
-                      <a:fillRect/>
-                    </a:stretch>
-                  </pic:blipFill>
-                  <pic:spPr>
-                    <a:xfrm>
-                      <a:off x="0" y="0"/>
-                      <a:ext cx="762635" cy="762635"/>
-                    </a:xfrm>
-                    <a:prstGeom prst="rect">
-                      <a:avLst/>
-                    </a:prstGeom>
-                    <a:ln/>
-                  </pic:spPr>
-                </pic:pic>
-              </a:graphicData>
-            </a:graphic>
-          </wp:anchor>
-        </w:drawing>
-      </w:r>
-      <w:r>
-        <w:rPr>
-          <w:rFonts w:ascii="Bookman Old Style" w:eastAsia="Bookman Old Style" w:hAnsi="Bookman Old Style" w:cs="Bookman Old Style"/>
-          <w:b/>
-          <w:bCs/>
+          <w:rFonts w:ascii="Bookman Old Style" w:hAnsi="Bookman Old Style" w:cs="Times New Roman"/>
+          <w:b/>
           <w:sz w:val="26"/>
           <w:szCs w:val="26"/>
         </w:rPr>
@@ -174,9 +224,8 @@
       </w:r>
       <w:r>
         <w:rPr>
-          <w:rFonts w:ascii="Bookman Old Style" w:eastAsia="Bookman Old Style" w:hAnsi="Bookman Old Style" w:cs="Bookman Old Style"/>
-          <w:b/>
-          <w:bCs/>
+          <w:rFonts w:ascii="Bookman Old Style" w:hAnsi="Bookman Old Style" w:cs="Times New Roman"/>
+          <w:b/>
           <w:sz w:val="26"/>
           <w:szCs w:val="26"/>
         </w:rPr>
@@ -184,9 +233,8 @@
       </w:r>
       <w:r>
         <w:rPr>
-          <w:rFonts w:ascii="Bookman Old Style" w:eastAsia="Bookman Old Style" w:hAnsi="Bookman Old Style" w:cs="Bookman Old Style"/>
-          <w:b/>
-          <w:bCs/>
+          <w:rFonts w:ascii="Bookman Old Style" w:hAnsi="Bookman Old Style" w:cs="Times New Roman"/>
+          <w:b/>
           <w:sz w:val="26"/>
           <w:szCs w:val="26"/>
         </w:rPr>
@@ -203,18 +251,16 @@
         <w:spacing w:after="0"/>
         <w:ind w:right="283"/>
         <w:rPr>
-          <w:rFonts w:ascii="Bookman Old Style" w:eastAsia="Bookman Old Style" w:hAnsi="Bookman Old Style" w:cs="Bookman Old Style"/>
-          <w:b/>
-          <w:bCs/>
+          <w:rFonts w:ascii="Bookman Old Style" w:hAnsi="Bookman Old Style" w:cs="Times New Roman"/>
+          <w:b/>
           <w:sz w:val="26"/>
           <w:szCs w:val="26"/>
         </w:rPr>
       </w:pPr>
       <w:r>
         <w:rPr>
-          <w:rFonts w:ascii="Bookman Old Style" w:eastAsia="Bookman Old Style" w:hAnsi="Bookman Old Style" w:cs="Bookman Old Style"/>
-          <w:b/>
-          <w:bCs/>
+          <w:rFonts w:ascii="Bookman Old Style" w:hAnsi="Bookman Old Style" w:cs="Times New Roman"/>
+          <w:b/>
           <w:sz w:val="26"/>
           <w:szCs w:val="26"/>
         </w:rPr>
@@ -222,9 +268,8 @@
       </w:r>
       <w:r>
         <w:rPr>
-          <w:rFonts w:ascii="Bookman Old Style" w:eastAsia="Bookman Old Style" w:hAnsi="Bookman Old Style" w:cs="Bookman Old Style"/>
-          <w:b/>
-          <w:bCs/>
+          <w:rFonts w:ascii="Bookman Old Style" w:hAnsi="Bookman Old Style" w:cs="Times New Roman"/>
+          <w:b/>
           <w:sz w:val="26"/>
           <w:szCs w:val="26"/>
         </w:rPr>
@@ -232,9 +277,8 @@
       </w:r>
       <w:r>
         <w:rPr>
-          <w:rFonts w:ascii="Bookman Old Style" w:eastAsia="Bookman Old Style" w:hAnsi="Bookman Old Style" w:cs="Bookman Old Style"/>
-          <w:b/>
-          <w:bCs/>
+          <w:rFonts w:ascii="Bookman Old Style" w:hAnsi="Bookman Old Style" w:cs="Times New Roman"/>
+          <w:b/>
           <w:sz w:val="26"/>
           <w:szCs w:val="26"/>
         </w:rPr>
@@ -242,9 +286,8 @@
       </w:r>
       <w:r>
         <w:rPr>
-          <w:rFonts w:ascii="Bookman Old Style" w:eastAsia="Bookman Old Style" w:hAnsi="Bookman Old Style" w:cs="Bookman Old Style"/>
-          <w:b/>
-          <w:bCs/>
+          <w:rFonts w:ascii="Bookman Old Style" w:hAnsi="Bookman Old Style" w:cs="Times New Roman"/>
+          <w:b/>
           <w:sz w:val="26"/>
           <w:szCs w:val="26"/>
         </w:rPr>
@@ -259,14 +302,16 @@
         <w:spacing w:after="0"/>
         <w:ind w:right="283"/>
         <w:rPr>
-          <w:rFonts w:ascii="Bookman Old Style" w:eastAsia="Bookman Old Style" w:hAnsi="Bookman Old Style" w:cs="Bookman Old Style"/>
+          <w:rFonts w:ascii="Bookman Old Style" w:hAnsi="Bookman Old Style" w:cs="Times New Roman"/>
+          <w:bCs/>
           <w:sz w:val="26"/>
           <w:szCs w:val="26"/>
         </w:rPr>
       </w:pPr>
       <w:r>
         <w:rPr>
-          <w:rFonts w:ascii="Bookman Old Style" w:eastAsia="Bookman Old Style" w:hAnsi="Bookman Old Style" w:cs="Bookman Old Style"/>
+          <w:rFonts w:ascii="Bookman Old Style" w:hAnsi="Bookman Old Style" w:cs="Times New Roman"/>
+          <w:bCs/>
           <w:sz w:val="26"/>
           <w:szCs w:val="26"/>
         </w:rPr>
@@ -274,7 +319,8 @@
       </w:r>
       <w:r>
         <w:rPr>
-          <w:rFonts w:ascii="Bookman Old Style" w:eastAsia="Bookman Old Style" w:hAnsi="Bookman Old Style" w:cs="Bookman Old Style"/>
+          <w:rFonts w:ascii="Bookman Old Style" w:hAnsi="Bookman Old Style" w:cs="Times New Roman"/>
+          <w:bCs/>
           <w:sz w:val="26"/>
           <w:szCs w:val="26"/>
         </w:rPr>
@@ -289,14 +335,16 @@
         <w:spacing w:after="0"/>
         <w:ind w:right="283"/>
         <w:rPr>
-          <w:rFonts w:ascii="Bookman Old Style" w:eastAsia="Bookman Old Style" w:hAnsi="Bookman Old Style" w:cs="Bookman Old Style"/>
+          <w:rFonts w:ascii="Bookman Old Style" w:hAnsi="Bookman Old Style" w:cs="Times New Roman"/>
+          <w:bCs/>
           <w:sz w:val="26"/>
           <w:szCs w:val="26"/>
         </w:rPr>
       </w:pPr>
       <w:r>
         <w:rPr>
-          <w:rFonts w:ascii="Bookman Old Style" w:eastAsia="Bookman Old Style" w:hAnsi="Bookman Old Style" w:cs="Bookman Old Style"/>
+          <w:rFonts w:ascii="Bookman Old Style" w:hAnsi="Bookman Old Style" w:cs="Times New Roman"/>
+          <w:bCs/>
           <w:sz w:val="26"/>
           <w:szCs w:val="26"/>
         </w:rPr>
@@ -304,7 +352,8 @@
       </w:r>
       <w:r>
         <w:rPr>
-          <w:rFonts w:ascii="Bookman Old Style" w:eastAsia="Bookman Old Style" w:hAnsi="Bookman Old Style" w:cs="Bookman Old Style"/>
+          <w:rFonts w:ascii="Bookman Old Style" w:hAnsi="Bookman Old Style" w:cs="Times New Roman"/>
+          <w:bCs/>
           <w:sz w:val="26"/>
           <w:szCs w:val="26"/>
         </w:rPr>
@@ -319,14 +368,14 @@
         <w:spacing w:after="0" w:line="240" w:lineRule="auto"/>
         <w:ind w:right="676"/>
         <w:rPr>
-          <w:rFonts w:ascii="Bookman Old Style" w:eastAsia="Bookman Old Style" w:hAnsi="Bookman Old Style" w:cs="Bookman Old Style"/>
+          <w:rFonts w:ascii="Bookman Old Style" w:hAnsi="Bookman Old Style" w:cs="Times New Roman"/>
           <w:sz w:val="14"/>
           <w:szCs w:val="14"/>
         </w:rPr>
       </w:pPr>
       <w:r>
         <w:rPr>
-          <w:rFonts w:ascii="Bookman Old Style" w:eastAsia="Bookman Old Style" w:hAnsi="Bookman Old Style" w:cs="Bookman Old Style"/>
+          <w:rFonts w:ascii="Bookman Old Style" w:hAnsi="Bookman Old Style" w:cs="Times New Roman"/>
           <w:sz w:val="14"/>
           <w:szCs w:val="14"/>
         </w:rPr>
@@ -335,23 +384,16 @@
     </w:p>
     <w:p>
       <w:pPr>
+        <w:pStyle w:val="Footer"/>
         <w:pBdr>
-          <w:top w:val="single" w:sz="24" w:space="1" w:color="622423"/>
-          <w:left w:val="nil"/>
-          <w:bottom w:val="nil"/>
-          <w:right w:val="nil"/>
-          <w:between w:val="nil"/>
+          <w:top w:val="thinThickSmallGap" w:sz="24" w:space="1" w:color="622423"/>
         </w:pBdr>
         <w:tabs>
-          <w:tab w:val="center" w:pos="4680"/>
-          <w:tab w:val="right" w:pos="9360"/>
           <w:tab w:val="left" w:pos="720"/>
         </w:tabs>
-        <w:spacing w:after="0" w:line="240" w:lineRule="auto"/>
         <w:ind w:right="301"/>
         <w:rPr>
-          <w:rFonts w:ascii="Cambria" w:eastAsia="Cambria" w:hAnsi="Cambria" w:cs="Cambria"/>
-          <w:color w:val="000000"/>
+          <w:rFonts w:ascii="Cambria" w:hAnsi="Cambria"/>
           <w:sz w:val="12"/>
           <w:szCs w:val="12"/>
         </w:rPr>
@@ -361,7 +403,7 @@
       <w:pPr>
         <w:spacing w:after="0" w:line="240" w:lineRule="auto"/>
         <w:rPr>
-          <w:rFonts w:ascii="Times New Roman" w:eastAsia="Times New Roman" w:hAnsi="Times New Roman" w:cs="Times New Roman"/>
+          <w:rFonts w:ascii="Times New Roman" w:hAnsi="Times New Roman" w:cs="Times New Roman"/>
           <w:sz w:val="12"/>
           <w:szCs w:val="12"/>
         </w:rPr>
@@ -373,7 +415,7 @@
         <w:ind w:left="-284"/>
         <w:jc w:val="center"/>
         <w:rPr>
-          <w:rFonts w:ascii="Times New Roman" w:eastAsia="Times New Roman" w:hAnsi="Times New Roman" w:cs="Times New Roman"/>
+          <w:rFonts w:ascii="Times New Roman" w:hAnsi="Times New Roman" w:cs="Times New Roman"/>
           <w:sz w:val="12"/>
           <w:szCs w:val="12"/>
         </w:rPr>
@@ -385,30 +427,29 @@
         <w:ind w:left="-284"/>
         <w:jc w:val="center"/>
         <w:rPr>
-          <w:rFonts w:ascii="Times New Roman" w:eastAsia="Times New Roman" w:hAnsi="Times New Roman" w:cs="Times New Roman"/>
-          <w:b/>
-          <w:bCs/>
+          <w:rFonts w:ascii="Times New Roman" w:hAnsi="Times New Roman" w:cs="Times New Roman"/>
+          <w:b/>
           <w:sz w:val="26"/>
           <w:szCs w:val="26"/>
         </w:rPr>
       </w:pPr>
       <w:r>
         <w:rPr>
-          <w:rFonts w:ascii="Times New Roman" w:eastAsia="Times New Roman" w:hAnsi="Times New Roman" w:cs="Times New Roman"/>
-          <w:b/>
-          <w:bCs/>
+          <w:rFonts w:ascii="Times New Roman" w:hAnsi="Times New Roman" w:cs="Times New Roman"/>
+          <w:b/>
           <w:sz w:val="26"/>
           <w:szCs w:val="26"/>
         </w:rPr>
         <w:t>MOTORIZED TRICYCLE FRANCHISE</w:t>
       </w:r>
+      <w:bookmarkEnd w:id="0"/>
     </w:p>
     <w:p>
       <w:pPr>
         <w:spacing w:after="0" w:line="240" w:lineRule="auto"/>
         <w:jc w:val="center"/>
         <w:rPr>
-          <w:rFonts w:ascii="Times New Roman" w:eastAsia="Times New Roman" w:hAnsi="Times New Roman" w:cs="Times New Roman"/>
+          <w:rFonts w:ascii="Times New Roman" w:hAnsi="Times New Roman" w:cs="Times New Roman"/>
           <w:sz w:val="12"/>
           <w:szCs w:val="12"/>
         </w:rPr>
@@ -419,7 +460,7 @@
         <w:spacing w:after="0" w:line="240" w:lineRule="auto"/>
         <w:jc w:val="center"/>
         <w:rPr>
-          <w:rFonts w:ascii="Times New Roman" w:eastAsia="Times New Roman" w:hAnsi="Times New Roman" w:cs="Times New Roman"/>
+          <w:rFonts w:ascii="Times New Roman" w:hAnsi="Times New Roman" w:cs="Times New Roman"/>
           <w:sz w:val="12"/>
           <w:szCs w:val="12"/>
         </w:rPr>
@@ -430,7 +471,7 @@
         <w:spacing w:after="0" w:line="240" w:lineRule="auto"/>
         <w:jc w:val="center"/>
         <w:rPr>
-          <w:rFonts w:ascii="Times New Roman" w:eastAsia="Times New Roman" w:hAnsi="Times New Roman" w:cs="Times New Roman"/>
+          <w:rFonts w:ascii="Times New Roman" w:hAnsi="Times New Roman" w:cs="Times New Roman"/>
           <w:sz w:val="8"/>
           <w:szCs w:val="8"/>
         </w:rPr>
@@ -441,75 +482,90 @@
         <w:spacing w:after="0" w:line="360" w:lineRule="auto"/>
         <w:jc w:val="center"/>
         <w:rPr>
-          <w:rFonts w:ascii="Times New Roman" w:eastAsia="Times New Roman" w:hAnsi="Times New Roman" w:cs="Times New Roman"/>
-          <w:sz w:val="20"/>
-          <w:szCs w:val="20"/>
-        </w:rPr>
-      </w:pPr>
-      <w:r>
-        <w:rPr>
-          <w:rFonts w:ascii="Times New Roman" w:eastAsia="Times New Roman" w:hAnsi="Times New Roman" w:cs="Times New Roman"/>
-          <w:sz w:val="20"/>
-          <w:szCs w:val="20"/>
-        </w:rPr>
-        <w:tab/>
-      </w:r>
-      <w:r>
-        <w:rPr>
-          <w:rFonts w:ascii="Times New Roman" w:eastAsia="Times New Roman" w:hAnsi="Times New Roman" w:cs="Times New Roman"/>
-          <w:sz w:val="20"/>
-          <w:szCs w:val="20"/>
-        </w:rPr>
-        <w:tab/>
-      </w:r>
-      <w:r>
-        <w:rPr>
-          <w:rFonts w:ascii="Times New Roman" w:eastAsia="Times New Roman" w:hAnsi="Times New Roman" w:cs="Times New Roman"/>
-          <w:sz w:val="20"/>
-          <w:szCs w:val="20"/>
-        </w:rPr>
-        <w:tab/>
-      </w:r>
-      <w:r>
-        <w:rPr>
-          <w:rFonts w:ascii="Times New Roman" w:eastAsia="Times New Roman" w:hAnsi="Times New Roman" w:cs="Times New Roman"/>
-          <w:sz w:val="20"/>
-          <w:szCs w:val="20"/>
-        </w:rPr>
-        <w:tab/>
-      </w:r>
-      <w:r>
-        <w:rPr>
-          <w:rFonts w:ascii="Times New Roman" w:eastAsia="Times New Roman" w:hAnsi="Times New Roman" w:cs="Times New Roman"/>
-          <w:sz w:val="20"/>
-          <w:szCs w:val="20"/>
-        </w:rPr>
-        <w:tab/>
-      </w:r>
-      <w:r>
-        <w:rPr>
-          <w:rFonts w:ascii="Times New Roman" w:eastAsia="Times New Roman" w:hAnsi="Times New Roman" w:cs="Times New Roman"/>
-          <w:sz w:val="20"/>
-          <w:szCs w:val="20"/>
-        </w:rPr>
-        <w:tab/>
-      </w:r>
-      <w:r>
-        <w:rPr>
-          <w:rFonts w:ascii="Times New Roman" w:eastAsia="Times New Roman" w:hAnsi="Times New Roman" w:cs="Times New Roman"/>
-          <w:sz w:val="20"/>
-          <w:szCs w:val="20"/>
-        </w:rPr>
-        <w:tab/>
-      </w:r>
-      <w:r>
-        <w:rPr>
-          <w:rFonts w:ascii="Times New Roman" w:eastAsia="Times New Roman" w:hAnsi="Times New Roman" w:cs="Times New Roman"/>
-          <w:sz w:val="20"/>
-          <w:szCs w:val="20"/>
-        </w:rPr>
-        <w:tab/>
-        <w:t xml:space="preserve">SBN No. </w:t>
+          <w:rFonts w:ascii="Times New Roman" w:hAnsi="Times New Roman" w:cs="Times New Roman"/>
+          <w:sz w:val="20"/>
+          <w:szCs w:val="20"/>
+        </w:rPr>
+      </w:pPr>
+      <w:r>
+        <w:rPr>
+          <w:rFonts w:ascii="Times New Roman" w:hAnsi="Times New Roman" w:cs="Times New Roman"/>
+          <w:sz w:val="20"/>
+          <w:szCs w:val="20"/>
+        </w:rPr>
+        <w:tab/>
+      </w:r>
+      <w:r>
+        <w:rPr>
+          <w:rFonts w:ascii="Times New Roman" w:hAnsi="Times New Roman" w:cs="Times New Roman"/>
+          <w:sz w:val="20"/>
+          <w:szCs w:val="20"/>
+        </w:rPr>
+        <w:tab/>
+      </w:r>
+      <w:r>
+        <w:rPr>
+          <w:rFonts w:ascii="Times New Roman" w:hAnsi="Times New Roman" w:cs="Times New Roman"/>
+          <w:sz w:val="20"/>
+          <w:szCs w:val="20"/>
+        </w:rPr>
+        <w:tab/>
+      </w:r>
+      <w:r>
+        <w:rPr>
+          <w:rFonts w:ascii="Times New Roman" w:hAnsi="Times New Roman" w:cs="Times New Roman"/>
+          <w:sz w:val="20"/>
+          <w:szCs w:val="20"/>
+        </w:rPr>
+        <w:tab/>
+      </w:r>
+      <w:r>
+        <w:rPr>
+          <w:rFonts w:ascii="Times New Roman" w:hAnsi="Times New Roman" w:cs="Times New Roman"/>
+          <w:sz w:val="20"/>
+          <w:szCs w:val="20"/>
+        </w:rPr>
+        <w:tab/>
+      </w:r>
+      <w:r>
+        <w:rPr>
+          <w:rFonts w:ascii="Times New Roman" w:hAnsi="Times New Roman" w:cs="Times New Roman"/>
+          <w:sz w:val="20"/>
+          <w:szCs w:val="20"/>
+        </w:rPr>
+        <w:tab/>
+      </w:r>
+      <w:r>
+        <w:rPr>
+          <w:rFonts w:ascii="Times New Roman" w:hAnsi="Times New Roman" w:cs="Times New Roman"/>
+          <w:sz w:val="20"/>
+          <w:szCs w:val="20"/>
+        </w:rPr>
+        <w:tab/>
+      </w:r>
+      <w:r>
+        <w:rPr>
+          <w:rFonts w:ascii="Times New Roman" w:hAnsi="Times New Roman" w:cs="Times New Roman"/>
+          <w:sz w:val="20"/>
+          <w:szCs w:val="20"/>
+        </w:rPr>
+        <w:tab/>
+      </w:r>
+      <w:r>
+        <w:rPr>
+          <w:rFonts w:ascii="Times New Roman" w:hAnsi="Times New Roman" w:cs="Times New Roman"/>
+          <w:sz w:val="20"/>
+          <w:szCs w:val="20"/>
+        </w:rPr>
+        <w:t>SBN No.</w:t>
+      </w:r>
+      <w:r>
+        <w:rPr>
+          <w:rFonts w:ascii="Times New Roman" w:hAnsi="Times New Roman" w:cs="Times New Roman"/>
+          <w:sz w:val="20"/>
+          <w:szCs w:val="20"/>
+        </w:rPr>
+        <w:t xml:space="preserve"> </w:t>
       </w:r>
       <w:r>
         <w:rPr>
@@ -527,7 +583,7 @@
         <w:spacing w:after="0" w:line="360" w:lineRule="auto"/>
         <w:jc w:val="center"/>
         <w:rPr>
-          <w:rFonts w:ascii="Times New Roman" w:eastAsia="Times New Roman" w:hAnsi="Times New Roman" w:cs="Times New Roman"/>
+          <w:rFonts w:ascii="Times New Roman" w:hAnsi="Times New Roman" w:cs="Times New Roman"/>
           <w:sz w:val="8"/>
           <w:szCs w:val="8"/>
         </w:rPr>
@@ -538,7 +594,7 @@
         <w:spacing w:after="0" w:line="360" w:lineRule="auto"/>
         <w:jc w:val="center"/>
         <w:rPr>
-          <w:rFonts w:ascii="Times New Roman" w:eastAsia="Times New Roman" w:hAnsi="Times New Roman" w:cs="Times New Roman"/>
+          <w:rFonts w:ascii="Times New Roman" w:hAnsi="Times New Roman" w:cs="Times New Roman"/>
           <w:sz w:val="8"/>
           <w:szCs w:val="8"/>
         </w:rPr>
@@ -549,27 +605,59 @@
         <w:spacing w:after="0" w:line="240" w:lineRule="auto"/>
         <w:jc w:val="both"/>
         <w:rPr>
-          <w:rFonts w:ascii="Times New Roman" w:eastAsia="Times New Roman" w:hAnsi="Times New Roman" w:cs="Times New Roman"/>
-          <w:sz w:val="20"/>
-          <w:szCs w:val="20"/>
-        </w:rPr>
-      </w:pPr>
-      <w:r>
-        <w:rPr>
-          <w:rFonts w:ascii="Times New Roman" w:eastAsia="Times New Roman" w:hAnsi="Times New Roman" w:cs="Times New Roman"/>
-          <w:sz w:val="20"/>
-          <w:szCs w:val="20"/>
-        </w:rPr>
-        <w:tab/>
-        <w:t xml:space="preserve">Pursuant to Municipal Ordinance 02 – S – 2006 and Ordinance # 01 – S – </w:t>
-      </w:r>
-      <w:r>
-        <w:rPr>
-          <w:rFonts w:ascii="Times New Roman" w:eastAsia="Times New Roman" w:hAnsi="Times New Roman" w:cs="Times New Roman"/>
-          <w:sz w:val="20"/>
-          <w:szCs w:val="20"/>
-        </w:rPr>
-        <w:t>2011, motorized tricycle – for – hire franchise is hereby granted to:</w:t>
+          <w:rFonts w:ascii="Times New Roman" w:hAnsi="Times New Roman" w:cs="Times New Roman"/>
+          <w:sz w:val="20"/>
+          <w:szCs w:val="20"/>
+        </w:rPr>
+      </w:pPr>
+      <w:r>
+        <w:rPr>
+          <w:rFonts w:ascii="Times New Roman" w:hAnsi="Times New Roman" w:cs="Times New Roman"/>
+          <w:sz w:val="20"/>
+          <w:szCs w:val="20"/>
+        </w:rPr>
+        <w:tab/>
+        <w:t>Pursuant to Municipal</w:t>
+      </w:r>
+      <w:r>
+        <w:rPr>
+          <w:rFonts w:ascii="Times New Roman" w:hAnsi="Times New Roman" w:cs="Times New Roman"/>
+          <w:sz w:val="20"/>
+          <w:szCs w:val="20"/>
+        </w:rPr>
+        <w:t xml:space="preserve"> Ordinance 02 – S – 2006 and Ordinance # 01 – S – 2011, motorized tricycle </w:t>
+      </w:r>
+      <w:r>
+        <w:rPr>
+          <w:rFonts w:ascii="Times New Roman" w:hAnsi="Times New Roman" w:cs="Times New Roman"/>
+          <w:sz w:val="20"/>
+          <w:szCs w:val="20"/>
+        </w:rPr>
+        <w:t xml:space="preserve">– </w:t>
+      </w:r>
+      <w:r>
+        <w:rPr>
+          <w:rFonts w:ascii="Times New Roman" w:hAnsi="Times New Roman" w:cs="Times New Roman"/>
+          <w:sz w:val="20"/>
+          <w:szCs w:val="20"/>
+        </w:rPr>
+        <w:t>for</w:t>
+      </w:r>
+      <w:r>
+        <w:rPr>
+          <w:rFonts w:ascii="Times New Roman" w:hAnsi="Times New Roman" w:cs="Times New Roman"/>
+          <w:sz w:val="20"/>
+          <w:szCs w:val="20"/>
+        </w:rPr>
+        <w:t xml:space="preserve"> – hire </w:t>
+      </w:r>
+      <w:r>
+        <w:rPr>
+          <w:rFonts w:ascii="Times New Roman" w:hAnsi="Times New Roman" w:cs="Times New Roman"/>
+          <w:sz w:val="20"/>
+          <w:szCs w:val="20"/>
+        </w:rPr>
+        <w:t>franchise is hereby granted to:</w:t>
       </w:r>
     </w:p>
     <w:p>
@@ -577,7 +665,7 @@
         <w:spacing w:after="0" w:line="360" w:lineRule="auto"/>
         <w:jc w:val="both"/>
         <w:rPr>
-          <w:rFonts w:ascii="Times New Roman" w:eastAsia="Times New Roman" w:hAnsi="Times New Roman" w:cs="Times New Roman"/>
+          <w:rFonts w:ascii="Times New Roman" w:hAnsi="Times New Roman" w:cs="Times New Roman"/>
           <w:sz w:val="20"/>
           <w:szCs w:val="20"/>
         </w:rPr>
@@ -662,20 +750,35 @@
           <w:rFonts w:ascii="Times New Roman" w:eastAsia="Times New Roman" w:hAnsi="Times New Roman" w:cs="Times New Roman"/>
         </w:rPr>
         <w:tab/>
-        <w:t xml:space="preserve">ADDRESS:       </w:t>
-      </w:r>
-      <w:r>
-        <w:rPr>
-          <w:rFonts w:ascii="Times New Roman" w:eastAsia="Times New Roman" w:hAnsi="Times New Roman" w:cs="Times New Roman"/>
-          <w:b/>
-          <w:bCs/>
-        </w:rPr>
-        <w:t>[ADDRESS]</w:t>
+        <w:t xml:space="preserve">ADDRESS:    </w:t>
+      </w:r>
+      <w:proofErr w:type="gramStart"/>
+      <w:r>
+        <w:rPr>
+          <w:rFonts w:ascii="Times New Roman" w:eastAsia="Times New Roman" w:hAnsi="Times New Roman" w:cs="Times New Roman"/>
+        </w:rPr>
+        <w:t xml:space="preserve">   </w:t>
+      </w:r>
+      <w:r>
+        <w:rPr>
+          <w:rFonts w:ascii="Times New Roman" w:eastAsia="Times New Roman" w:hAnsi="Times New Roman" w:cs="Times New Roman"/>
+          <w:b/>
+          <w:bCs/>
+        </w:rPr>
+        <w:t>[</w:t>
+      </w:r>
+      <w:proofErr w:type="gramEnd"/>
+      <w:r>
+        <w:rPr>
+          <w:rFonts w:ascii="Times New Roman" w:eastAsia="Times New Roman" w:hAnsi="Times New Roman" w:cs="Times New Roman"/>
+          <w:b/>
+          <w:bCs/>
+        </w:rPr>
+        <w:t>ADDRESS]</w:t>
       </w:r>
     </w:p>
     <w:tbl>
       <w:tblPr>
-        <w:tblStyle w:val="a"/>
         <w:tblW w:w="8430" w:type="dxa"/>
         <w:tblInd w:w="1134" w:type="dxa"/>
         <w:tblBorders>
@@ -731,16 +834,8 @@
               <w:rPr>
                 <w:rFonts w:ascii="Times New Roman" w:eastAsia="Times New Roman" w:hAnsi="Times New Roman" w:cs="Times New Roman"/>
               </w:rPr>
-              <w:t xml:space="preserve">Motor No. </w:t>
+              <w:t>Motor No.   :</w:t>
             </w:r>
-            <w:proofErr w:type="gramStart"/>
-            <w:r>
-              <w:rPr>
-                <w:rFonts w:ascii="Times New Roman" w:eastAsia="Times New Roman" w:hAnsi="Times New Roman" w:cs="Times New Roman"/>
-              </w:rPr>
-              <w:t xml:space="preserve">  :</w:t>
-            </w:r>
-            <w:proofErr w:type="gramEnd"/>
             <w:r>
               <w:rPr>
                 <w:rFonts w:ascii="Times New Roman" w:eastAsia="Times New Roman" w:hAnsi="Times New Roman" w:cs="Times New Roman"/>
@@ -788,16 +883,8 @@
               <w:rPr>
                 <w:rFonts w:ascii="Times New Roman" w:eastAsia="Times New Roman" w:hAnsi="Times New Roman" w:cs="Times New Roman"/>
               </w:rPr>
-              <w:t xml:space="preserve">Plate </w:t>
+              <w:t>Plate No. :</w:t>
             </w:r>
-            <w:proofErr w:type="gramStart"/>
-            <w:r>
-              <w:rPr>
-                <w:rFonts w:ascii="Times New Roman" w:eastAsia="Times New Roman" w:hAnsi="Times New Roman" w:cs="Times New Roman"/>
-              </w:rPr>
-              <w:t>No. :</w:t>
-            </w:r>
-            <w:proofErr w:type="gramEnd"/>
             <w:r>
               <w:rPr>
                 <w:rFonts w:ascii="Times New Roman" w:eastAsia="Times New Roman" w:hAnsi="Times New Roman" w:cs="Times New Roman"/>
@@ -927,15 +1014,7 @@
           <w:b/>
           <w:bCs/>
         </w:rPr>
-        <w:t xml:space="preserve">       </w:t>
-      </w:r>
-      <w:r>
-        <w:rPr>
-          <w:rFonts w:ascii="Times New Roman" w:eastAsia="Times New Roman" w:hAnsi="Times New Roman" w:cs="Times New Roman"/>
-          <w:b/>
-          <w:bCs/>
-        </w:rPr>
-        <w:t xml:space="preserve"> </w:t>
+        <w:t xml:space="preserve">        </w:t>
       </w:r>
       <w:r>
         <w:rPr>
@@ -971,7 +1050,7 @@
         <w:spacing w:after="0" w:line="360" w:lineRule="auto"/>
         <w:jc w:val="both"/>
         <w:rPr>
-          <w:rFonts w:ascii="Times New Roman" w:eastAsia="Times New Roman" w:hAnsi="Times New Roman" w:cs="Times New Roman"/>
+          <w:rFonts w:ascii="Times New Roman" w:hAnsi="Times New Roman" w:cs="Times New Roman"/>
           <w:sz w:val="8"/>
           <w:szCs w:val="8"/>
         </w:rPr>
@@ -982,17 +1061,17 @@
         <w:spacing w:after="0" w:line="360" w:lineRule="auto"/>
         <w:jc w:val="both"/>
         <w:rPr>
-          <w:rFonts w:ascii="Times New Roman" w:eastAsia="Times New Roman" w:hAnsi="Times New Roman" w:cs="Times New Roman"/>
+          <w:rFonts w:ascii="Times New Roman" w:hAnsi="Times New Roman" w:cs="Times New Roman"/>
           <w:b/>
           <w:bCs/>
           <w:u w:val="single"/>
-        </w:rPr>
-      </w:pPr>
-      <w:bookmarkStart w:id="0" w:name="_4j14xhbf0i8f" w:colFirst="0" w:colLast="0"/>
-      <w:bookmarkEnd w:id="0"/>
-      <w:r>
-        <w:rPr>
-          <w:rFonts w:ascii="Times New Roman" w:eastAsia="Times New Roman" w:hAnsi="Times New Roman" w:cs="Times New Roman"/>
+          <w:lang w:val="en-PH"/>
+        </w:rPr>
+      </w:pPr>
+      <w:bookmarkStart w:id="1" w:name="_Hlk202943617"/>
+      <w:r>
+        <w:rPr>
+          <w:rFonts w:ascii="Times New Roman" w:hAnsi="Times New Roman" w:cs="Times New Roman"/>
           <w:b/>
           <w:bCs/>
           <w:u w:val="single"/>
@@ -1005,7 +1084,7 @@
         <w:spacing w:after="0" w:line="360" w:lineRule="auto"/>
         <w:jc w:val="both"/>
         <w:rPr>
-          <w:rFonts w:ascii="Times New Roman" w:eastAsia="Times New Roman" w:hAnsi="Times New Roman" w:cs="Times New Roman"/>
+          <w:rFonts w:ascii="Times New Roman" w:hAnsi="Times New Roman" w:cs="Times New Roman"/>
           <w:b/>
           <w:bCs/>
           <w:sz w:val="10"/>
@@ -1016,30 +1095,22 @@
     </w:p>
     <w:p>
       <w:pPr>
+        <w:pStyle w:val="ListParagraph"/>
         <w:numPr>
           <w:ilvl w:val="0"/>
-          <w:numId w:val="1"/>
+          <w:numId w:val="2"/>
         </w:numPr>
-        <w:pBdr>
-          <w:top w:val="nil"/>
-          <w:left w:val="nil"/>
-          <w:bottom w:val="nil"/>
-          <w:right w:val="nil"/>
-          <w:between w:val="nil"/>
-        </w:pBdr>
         <w:spacing w:after="0"/>
         <w:jc w:val="both"/>
         <w:rPr>
-          <w:rFonts w:ascii="Times New Roman" w:eastAsia="Times New Roman" w:hAnsi="Times New Roman" w:cs="Times New Roman"/>
-          <w:color w:val="000000"/>
-          <w:sz w:val="20"/>
-          <w:szCs w:val="20"/>
-        </w:rPr>
-      </w:pPr>
-      <w:r>
-        <w:rPr>
-          <w:rFonts w:ascii="Times New Roman" w:eastAsia="Times New Roman" w:hAnsi="Times New Roman" w:cs="Times New Roman"/>
-          <w:color w:val="000000"/>
+          <w:rFonts w:ascii="Times New Roman" w:hAnsi="Times New Roman" w:cs="Times New Roman"/>
+          <w:sz w:val="20"/>
+          <w:szCs w:val="20"/>
+        </w:rPr>
+      </w:pPr>
+      <w:r>
+        <w:rPr>
+          <w:rFonts w:ascii="Times New Roman" w:hAnsi="Times New Roman" w:cs="Times New Roman"/>
           <w:sz w:val="20"/>
           <w:szCs w:val="20"/>
         </w:rPr>
@@ -1048,30 +1119,22 @@
     </w:p>
     <w:p>
       <w:pPr>
+        <w:pStyle w:val="ListParagraph"/>
         <w:numPr>
           <w:ilvl w:val="0"/>
-          <w:numId w:val="1"/>
+          <w:numId w:val="2"/>
         </w:numPr>
-        <w:pBdr>
-          <w:top w:val="nil"/>
-          <w:left w:val="nil"/>
-          <w:bottom w:val="nil"/>
-          <w:right w:val="nil"/>
-          <w:between w:val="nil"/>
-        </w:pBdr>
         <w:spacing w:after="0"/>
         <w:jc w:val="both"/>
         <w:rPr>
-          <w:rFonts w:ascii="Times New Roman" w:eastAsia="Times New Roman" w:hAnsi="Times New Roman" w:cs="Times New Roman"/>
-          <w:color w:val="000000"/>
-          <w:sz w:val="20"/>
-          <w:szCs w:val="20"/>
-        </w:rPr>
-      </w:pPr>
-      <w:r>
-        <w:rPr>
-          <w:rFonts w:ascii="Times New Roman" w:eastAsia="Times New Roman" w:hAnsi="Times New Roman" w:cs="Times New Roman"/>
-          <w:color w:val="000000"/>
+          <w:rFonts w:ascii="Times New Roman" w:hAnsi="Times New Roman" w:cs="Times New Roman"/>
+          <w:sz w:val="20"/>
+          <w:szCs w:val="20"/>
+        </w:rPr>
+      </w:pPr>
+      <w:r>
+        <w:rPr>
+          <w:rFonts w:ascii="Times New Roman" w:hAnsi="Times New Roman" w:cs="Times New Roman"/>
           <w:sz w:val="20"/>
           <w:szCs w:val="20"/>
         </w:rPr>
@@ -1080,71 +1143,46 @@
     </w:p>
     <w:p>
       <w:pPr>
+        <w:pStyle w:val="ListParagraph"/>
         <w:numPr>
           <w:ilvl w:val="0"/>
-          <w:numId w:val="1"/>
+          <w:numId w:val="2"/>
         </w:numPr>
-        <w:pBdr>
-          <w:top w:val="nil"/>
-          <w:left w:val="nil"/>
-          <w:bottom w:val="nil"/>
-          <w:right w:val="nil"/>
-          <w:between w:val="nil"/>
-        </w:pBdr>
         <w:spacing w:after="0"/>
         <w:jc w:val="both"/>
         <w:rPr>
-          <w:rFonts w:ascii="Times New Roman" w:eastAsia="Times New Roman" w:hAnsi="Times New Roman" w:cs="Times New Roman"/>
-          <w:color w:val="000000"/>
-          <w:sz w:val="20"/>
-          <w:szCs w:val="20"/>
-        </w:rPr>
-      </w:pPr>
-      <w:r>
-        <w:rPr>
-          <w:rFonts w:ascii="Times New Roman" w:eastAsia="Times New Roman" w:hAnsi="Times New Roman" w:cs="Times New Roman"/>
-          <w:color w:val="000000"/>
-          <w:sz w:val="20"/>
-          <w:szCs w:val="20"/>
-        </w:rPr>
-        <w:t xml:space="preserve">HOLDER SHALL NOT OPERATE outside his </w:t>
-      </w:r>
-      <w:r>
-        <w:rPr>
-          <w:rFonts w:ascii="Times New Roman" w:eastAsia="Times New Roman" w:hAnsi="Times New Roman" w:cs="Times New Roman"/>
-          <w:color w:val="000000"/>
-          <w:sz w:val="20"/>
-          <w:szCs w:val="20"/>
-        </w:rPr>
-        <w:t>authorized route;</w:t>
-      </w:r>
-    </w:p>
-    <w:p>
-      <w:pPr>
+          <w:rFonts w:ascii="Times New Roman" w:hAnsi="Times New Roman" w:cs="Times New Roman"/>
+          <w:sz w:val="20"/>
+          <w:szCs w:val="20"/>
+        </w:rPr>
+      </w:pPr>
+      <w:r>
+        <w:rPr>
+          <w:rFonts w:ascii="Times New Roman" w:hAnsi="Times New Roman" w:cs="Times New Roman"/>
+          <w:sz w:val="20"/>
+          <w:szCs w:val="20"/>
+        </w:rPr>
+        <w:t>HOLDER SHALL NOT OPERATE outside his authorized route;</w:t>
+      </w:r>
+    </w:p>
+    <w:p>
+      <w:pPr>
+        <w:pStyle w:val="ListParagraph"/>
         <w:numPr>
           <w:ilvl w:val="0"/>
-          <w:numId w:val="1"/>
+          <w:numId w:val="2"/>
         </w:numPr>
-        <w:pBdr>
-          <w:top w:val="nil"/>
-          <w:left w:val="nil"/>
-          <w:bottom w:val="nil"/>
-          <w:right w:val="nil"/>
-          <w:between w:val="nil"/>
-        </w:pBdr>
         <w:spacing w:after="0"/>
         <w:jc w:val="both"/>
         <w:rPr>
-          <w:rFonts w:ascii="Times New Roman" w:eastAsia="Times New Roman" w:hAnsi="Times New Roman" w:cs="Times New Roman"/>
-          <w:color w:val="000000"/>
-          <w:sz w:val="20"/>
-          <w:szCs w:val="20"/>
-        </w:rPr>
-      </w:pPr>
-      <w:r>
-        <w:rPr>
-          <w:rFonts w:ascii="Times New Roman" w:eastAsia="Times New Roman" w:hAnsi="Times New Roman" w:cs="Times New Roman"/>
-          <w:color w:val="000000"/>
+          <w:rFonts w:ascii="Times New Roman" w:hAnsi="Times New Roman" w:cs="Times New Roman"/>
+          <w:sz w:val="20"/>
+          <w:szCs w:val="20"/>
+        </w:rPr>
+      </w:pPr>
+      <w:r>
+        <w:rPr>
+          <w:rFonts w:ascii="Times New Roman" w:hAnsi="Times New Roman" w:cs="Times New Roman"/>
           <w:sz w:val="20"/>
           <w:szCs w:val="20"/>
         </w:rPr>
@@ -1153,30 +1191,22 @@
     </w:p>
     <w:p>
       <w:pPr>
+        <w:pStyle w:val="ListParagraph"/>
         <w:numPr>
           <w:ilvl w:val="0"/>
-          <w:numId w:val="1"/>
+          <w:numId w:val="2"/>
         </w:numPr>
-        <w:pBdr>
-          <w:top w:val="nil"/>
-          <w:left w:val="nil"/>
-          <w:bottom w:val="nil"/>
-          <w:right w:val="nil"/>
-          <w:between w:val="nil"/>
-        </w:pBdr>
         <w:spacing w:after="0"/>
         <w:jc w:val="both"/>
         <w:rPr>
-          <w:rFonts w:ascii="Times New Roman" w:eastAsia="Times New Roman" w:hAnsi="Times New Roman" w:cs="Times New Roman"/>
-          <w:color w:val="000000"/>
-          <w:sz w:val="20"/>
-          <w:szCs w:val="20"/>
-        </w:rPr>
-      </w:pPr>
-      <w:r>
-        <w:rPr>
-          <w:rFonts w:ascii="Times New Roman" w:eastAsia="Times New Roman" w:hAnsi="Times New Roman" w:cs="Times New Roman"/>
-          <w:color w:val="000000"/>
+          <w:rFonts w:ascii="Times New Roman" w:hAnsi="Times New Roman" w:cs="Times New Roman"/>
+          <w:sz w:val="20"/>
+          <w:szCs w:val="20"/>
+        </w:rPr>
+      </w:pPr>
+      <w:r>
+        <w:rPr>
+          <w:rFonts w:ascii="Times New Roman" w:hAnsi="Times New Roman" w:cs="Times New Roman"/>
           <w:sz w:val="20"/>
           <w:szCs w:val="20"/>
         </w:rPr>
@@ -1185,71 +1215,46 @@
     </w:p>
     <w:p>
       <w:pPr>
+        <w:pStyle w:val="ListParagraph"/>
         <w:numPr>
           <w:ilvl w:val="0"/>
-          <w:numId w:val="1"/>
+          <w:numId w:val="2"/>
         </w:numPr>
-        <w:pBdr>
-          <w:top w:val="nil"/>
-          <w:left w:val="nil"/>
-          <w:bottom w:val="nil"/>
-          <w:right w:val="nil"/>
-          <w:between w:val="nil"/>
-        </w:pBdr>
         <w:spacing w:after="0"/>
         <w:jc w:val="both"/>
         <w:rPr>
-          <w:rFonts w:ascii="Times New Roman" w:eastAsia="Times New Roman" w:hAnsi="Times New Roman" w:cs="Times New Roman"/>
-          <w:color w:val="000000"/>
-          <w:sz w:val="20"/>
-          <w:szCs w:val="20"/>
-        </w:rPr>
-      </w:pPr>
-      <w:r>
-        <w:rPr>
-          <w:rFonts w:ascii="Times New Roman" w:eastAsia="Times New Roman" w:hAnsi="Times New Roman" w:cs="Times New Roman"/>
-          <w:color w:val="000000"/>
-          <w:sz w:val="20"/>
-          <w:szCs w:val="20"/>
-        </w:rPr>
-        <w:t>HOLDER SHALL employ only drivers with proper</w:t>
-      </w:r>
-      <w:r>
-        <w:rPr>
-          <w:rFonts w:ascii="Times New Roman" w:eastAsia="Times New Roman" w:hAnsi="Times New Roman" w:cs="Times New Roman"/>
-          <w:color w:val="000000"/>
-          <w:sz w:val="20"/>
-          <w:szCs w:val="20"/>
-        </w:rPr>
-        <w:t xml:space="preserve"> transportation card issued by the Tricycle Franchising Regulatory Office to be placed inside the sidecar of the tricycle – for – hire;</w:t>
-      </w:r>
-    </w:p>
-    <w:p>
-      <w:pPr>
+          <w:rFonts w:ascii="Times New Roman" w:hAnsi="Times New Roman" w:cs="Times New Roman"/>
+          <w:sz w:val="20"/>
+          <w:szCs w:val="20"/>
+        </w:rPr>
+      </w:pPr>
+      <w:r>
+        <w:rPr>
+          <w:rFonts w:ascii="Times New Roman" w:hAnsi="Times New Roman" w:cs="Times New Roman"/>
+          <w:sz w:val="20"/>
+          <w:szCs w:val="20"/>
+        </w:rPr>
+        <w:t>HOLDER SHALL employ only drivers with proper transportation card issued by the Tricycle Franchising Regulatory Office to be placed inside the sidecar of the tricycle – for – hire;</w:t>
+      </w:r>
+    </w:p>
+    <w:p>
+      <w:pPr>
+        <w:pStyle w:val="ListParagraph"/>
         <w:numPr>
           <w:ilvl w:val="0"/>
-          <w:numId w:val="1"/>
+          <w:numId w:val="2"/>
         </w:numPr>
-        <w:pBdr>
-          <w:top w:val="nil"/>
-          <w:left w:val="nil"/>
-          <w:bottom w:val="nil"/>
-          <w:right w:val="nil"/>
-          <w:between w:val="nil"/>
-        </w:pBdr>
         <w:spacing w:after="0"/>
         <w:jc w:val="both"/>
         <w:rPr>
-          <w:rFonts w:ascii="Times New Roman" w:eastAsia="Times New Roman" w:hAnsi="Times New Roman" w:cs="Times New Roman"/>
-          <w:color w:val="000000"/>
-          <w:sz w:val="20"/>
-          <w:szCs w:val="20"/>
-        </w:rPr>
-      </w:pPr>
-      <w:r>
-        <w:rPr>
-          <w:rFonts w:ascii="Times New Roman" w:eastAsia="Times New Roman" w:hAnsi="Times New Roman" w:cs="Times New Roman"/>
-          <w:color w:val="000000"/>
+          <w:rFonts w:ascii="Times New Roman" w:hAnsi="Times New Roman" w:cs="Times New Roman"/>
+          <w:sz w:val="20"/>
+          <w:szCs w:val="20"/>
+        </w:rPr>
+      </w:pPr>
+      <w:r>
+        <w:rPr>
+          <w:rFonts w:ascii="Times New Roman" w:hAnsi="Times New Roman" w:cs="Times New Roman"/>
           <w:sz w:val="20"/>
           <w:szCs w:val="20"/>
         </w:rPr>
@@ -1258,71 +1263,46 @@
     </w:p>
     <w:p>
       <w:pPr>
+        <w:pStyle w:val="ListParagraph"/>
         <w:numPr>
           <w:ilvl w:val="0"/>
-          <w:numId w:val="1"/>
+          <w:numId w:val="2"/>
         </w:numPr>
-        <w:pBdr>
-          <w:top w:val="nil"/>
-          <w:left w:val="nil"/>
-          <w:bottom w:val="nil"/>
-          <w:right w:val="nil"/>
-          <w:between w:val="nil"/>
-        </w:pBdr>
         <w:spacing w:after="0"/>
         <w:jc w:val="both"/>
         <w:rPr>
-          <w:rFonts w:ascii="Times New Roman" w:eastAsia="Times New Roman" w:hAnsi="Times New Roman" w:cs="Times New Roman"/>
-          <w:color w:val="000000"/>
-          <w:sz w:val="20"/>
-          <w:szCs w:val="20"/>
-        </w:rPr>
-      </w:pPr>
-      <w:r>
-        <w:rPr>
-          <w:rFonts w:ascii="Times New Roman" w:eastAsia="Times New Roman" w:hAnsi="Times New Roman" w:cs="Times New Roman"/>
-          <w:color w:val="000000"/>
-          <w:sz w:val="20"/>
-          <w:szCs w:val="20"/>
-        </w:rPr>
-        <w:t>Tricycle – for – hi</w:t>
-      </w:r>
-      <w:r>
-        <w:rPr>
-          <w:rFonts w:ascii="Times New Roman" w:eastAsia="Times New Roman" w:hAnsi="Times New Roman" w:cs="Times New Roman"/>
-          <w:color w:val="000000"/>
-          <w:sz w:val="20"/>
-          <w:szCs w:val="20"/>
-        </w:rPr>
-        <w:t>re shall bear a color code indicating the name of TODA;</w:t>
-      </w:r>
-    </w:p>
-    <w:p>
-      <w:pPr>
+          <w:rFonts w:ascii="Times New Roman" w:hAnsi="Times New Roman" w:cs="Times New Roman"/>
+          <w:sz w:val="20"/>
+          <w:szCs w:val="20"/>
+        </w:rPr>
+      </w:pPr>
+      <w:r>
+        <w:rPr>
+          <w:rFonts w:ascii="Times New Roman" w:hAnsi="Times New Roman" w:cs="Times New Roman"/>
+          <w:sz w:val="20"/>
+          <w:szCs w:val="20"/>
+        </w:rPr>
+        <w:t>Tricycle – for – hire shall bear a color code indicating the name of TODA;</w:t>
+      </w:r>
+    </w:p>
+    <w:p>
+      <w:pPr>
+        <w:pStyle w:val="ListParagraph"/>
         <w:numPr>
           <w:ilvl w:val="0"/>
-          <w:numId w:val="1"/>
+          <w:numId w:val="2"/>
         </w:numPr>
-        <w:pBdr>
-          <w:top w:val="nil"/>
-          <w:left w:val="nil"/>
-          <w:bottom w:val="nil"/>
-          <w:right w:val="nil"/>
-          <w:between w:val="nil"/>
-        </w:pBdr>
         <w:spacing w:after="0"/>
         <w:jc w:val="both"/>
         <w:rPr>
-          <w:rFonts w:ascii="Times New Roman" w:eastAsia="Times New Roman" w:hAnsi="Times New Roman" w:cs="Times New Roman"/>
-          <w:color w:val="000000"/>
-          <w:sz w:val="20"/>
-          <w:szCs w:val="20"/>
-        </w:rPr>
-      </w:pPr>
-      <w:r>
-        <w:rPr>
-          <w:rFonts w:ascii="Times New Roman" w:eastAsia="Times New Roman" w:hAnsi="Times New Roman" w:cs="Times New Roman"/>
-          <w:color w:val="000000"/>
+          <w:rFonts w:ascii="Times New Roman" w:hAnsi="Times New Roman" w:cs="Times New Roman"/>
+          <w:sz w:val="20"/>
+          <w:szCs w:val="20"/>
+        </w:rPr>
+      </w:pPr>
+      <w:r>
+        <w:rPr>
+          <w:rFonts w:ascii="Times New Roman" w:hAnsi="Times New Roman" w:cs="Times New Roman"/>
           <w:sz w:val="20"/>
           <w:szCs w:val="20"/>
         </w:rPr>
@@ -1331,43 +1311,26 @@
     </w:p>
     <w:p>
       <w:pPr>
+        <w:pStyle w:val="ListParagraph"/>
         <w:numPr>
           <w:ilvl w:val="0"/>
-          <w:numId w:val="1"/>
+          <w:numId w:val="2"/>
         </w:numPr>
-        <w:pBdr>
-          <w:top w:val="nil"/>
-          <w:left w:val="nil"/>
-          <w:bottom w:val="nil"/>
-          <w:right w:val="nil"/>
-          <w:between w:val="nil"/>
-        </w:pBdr>
         <w:spacing w:after="0"/>
         <w:jc w:val="both"/>
         <w:rPr>
-          <w:rFonts w:ascii="Times New Roman" w:eastAsia="Times New Roman" w:hAnsi="Times New Roman" w:cs="Times New Roman"/>
-          <w:color w:val="000000"/>
-          <w:sz w:val="20"/>
-          <w:szCs w:val="20"/>
-        </w:rPr>
-      </w:pPr>
-      <w:r>
-        <w:rPr>
-          <w:rFonts w:ascii="Times New Roman" w:eastAsia="Times New Roman" w:hAnsi="Times New Roman" w:cs="Times New Roman"/>
-          <w:color w:val="000000"/>
-          <w:sz w:val="20"/>
-          <w:szCs w:val="20"/>
-        </w:rPr>
-        <w:t>HOLDER SHALL comply with Ordinance and non-compliance thereof shall be sufficient cause for the revocation/s</w:t>
-      </w:r>
-      <w:r>
-        <w:rPr>
-          <w:rFonts w:ascii="Times New Roman" w:eastAsia="Times New Roman" w:hAnsi="Times New Roman" w:cs="Times New Roman"/>
-          <w:color w:val="000000"/>
-          <w:sz w:val="20"/>
-          <w:szCs w:val="20"/>
-        </w:rPr>
-        <w:t>uspension of this AUTHORITY;</w:t>
+          <w:rFonts w:ascii="Times New Roman" w:hAnsi="Times New Roman" w:cs="Times New Roman"/>
+          <w:sz w:val="20"/>
+          <w:szCs w:val="20"/>
+        </w:rPr>
+      </w:pPr>
+      <w:r>
+        <w:rPr>
+          <w:rFonts w:ascii="Times New Roman" w:hAnsi="Times New Roman" w:cs="Times New Roman"/>
+          <w:sz w:val="20"/>
+          <w:szCs w:val="20"/>
+        </w:rPr>
+        <w:t>HOLDER SHALL comply with Ordinance and non-compliance thereof shall be sufficient cause for the revocation/suspension of this AUTHORITY;</w:t>
       </w:r>
     </w:p>
     <w:p>
@@ -1375,7 +1338,7 @@
         <w:spacing w:after="0"/>
         <w:jc w:val="center"/>
         <w:rPr>
-          <w:rFonts w:ascii="Times New Roman" w:eastAsia="Times New Roman" w:hAnsi="Times New Roman" w:cs="Times New Roman"/>
+          <w:rFonts w:ascii="Times New Roman" w:hAnsi="Times New Roman" w:cs="Times New Roman"/>
           <w:sz w:val="20"/>
           <w:szCs w:val="20"/>
         </w:rPr>
@@ -1387,14 +1350,14 @@
         <w:ind w:left="360"/>
         <w:jc w:val="both"/>
         <w:rPr>
-          <w:rFonts w:ascii="Times New Roman" w:eastAsia="Times New Roman" w:hAnsi="Times New Roman" w:cs="Times New Roman"/>
-          <w:sz w:val="20"/>
-          <w:szCs w:val="20"/>
-        </w:rPr>
-      </w:pPr>
-      <w:r>
-        <w:rPr>
-          <w:rFonts w:ascii="Times New Roman" w:eastAsia="Times New Roman" w:hAnsi="Times New Roman" w:cs="Times New Roman"/>
+          <w:rFonts w:ascii="Times New Roman" w:hAnsi="Times New Roman" w:cs="Times New Roman"/>
+          <w:sz w:val="20"/>
+          <w:szCs w:val="20"/>
+        </w:rPr>
+      </w:pPr>
+      <w:r>
+        <w:rPr>
+          <w:rFonts w:ascii="Times New Roman" w:hAnsi="Times New Roman" w:cs="Times New Roman"/>
           <w:sz w:val="20"/>
           <w:szCs w:val="20"/>
         </w:rPr>
@@ -1407,7 +1370,7 @@
         <w:ind w:left="360"/>
         <w:jc w:val="both"/>
         <w:rPr>
-          <w:rFonts w:ascii="Times New Roman" w:eastAsia="Times New Roman" w:hAnsi="Times New Roman" w:cs="Times New Roman"/>
+          <w:rFonts w:ascii="Times New Roman" w:hAnsi="Times New Roman" w:cs="Times New Roman"/>
           <w:sz w:val="20"/>
           <w:szCs w:val="20"/>
         </w:rPr>
@@ -1419,14 +1382,14 @@
         <w:ind w:left="360"/>
         <w:jc w:val="both"/>
         <w:rPr>
-          <w:rFonts w:ascii="Times New Roman" w:eastAsia="Times New Roman" w:hAnsi="Times New Roman" w:cs="Times New Roman"/>
-          <w:sz w:val="20"/>
-          <w:szCs w:val="20"/>
-        </w:rPr>
-      </w:pPr>
-      <w:r>
-        <w:rPr>
-          <w:rFonts w:ascii="Times New Roman" w:eastAsia="Times New Roman" w:hAnsi="Times New Roman" w:cs="Times New Roman"/>
+          <w:rFonts w:ascii="Times New Roman" w:hAnsi="Times New Roman" w:cs="Times New Roman"/>
+          <w:sz w:val="20"/>
+          <w:szCs w:val="20"/>
+        </w:rPr>
+      </w:pPr>
+      <w:r>
+        <w:rPr>
+          <w:rFonts w:ascii="Times New Roman" w:hAnsi="Times New Roman" w:cs="Times New Roman"/>
           <w:b/>
           <w:bCs/>
           <w:sz w:val="20"/>
@@ -1436,7 +1399,7 @@
       </w:r>
       <w:r>
         <w:rPr>
-          <w:rFonts w:ascii="Times New Roman" w:eastAsia="Times New Roman" w:hAnsi="Times New Roman" w:cs="Times New Roman"/>
+          <w:rFonts w:ascii="Times New Roman" w:hAnsi="Times New Roman" w:cs="Times New Roman"/>
           <w:sz w:val="20"/>
           <w:szCs w:val="20"/>
         </w:rPr>
@@ -1448,12 +1411,13 @@
         <w:spacing w:after="0"/>
         <w:jc w:val="both"/>
         <w:rPr>
-          <w:rFonts w:ascii="Times New Roman" w:eastAsia="Times New Roman" w:hAnsi="Times New Roman" w:cs="Times New Roman"/>
-          <w:sz w:val="20"/>
-          <w:szCs w:val="20"/>
-        </w:rPr>
-      </w:pPr>
-    </w:p>
+          <w:rFonts w:ascii="Times New Roman" w:hAnsi="Times New Roman" w:cs="Times New Roman"/>
+          <w:sz w:val="20"/>
+          <w:szCs w:val="20"/>
+        </w:rPr>
+      </w:pPr>
+    </w:p>
+    <w:bookmarkEnd w:id="1"/>
     <w:p>
       <w:pPr>
         <w:spacing w:after="0"/>
@@ -1467,13 +1431,7 @@
         <w:rPr>
           <w:rFonts w:ascii="Times New Roman" w:eastAsia="Times New Roman" w:hAnsi="Times New Roman" w:cs="Times New Roman"/>
         </w:rPr>
-        <w:t>Dat</w:t>
-      </w:r>
-      <w:r>
-        <w:rPr>
-          <w:rFonts w:ascii="Times New Roman" w:eastAsia="Times New Roman" w:hAnsi="Times New Roman" w:cs="Times New Roman"/>
-        </w:rPr>
-        <w:t xml:space="preserve">e Issued: </w:t>
+        <w:t xml:space="preserve">Date Issued: </w:t>
       </w:r>
       <w:r>
         <w:rPr>
@@ -1586,6 +1544,8 @@
         </w:rPr>
         <w:tab/>
       </w:r>
+      <w:bookmarkStart w:id="2" w:name="_GoBack"/>
+      <w:bookmarkEnd w:id="2"/>
     </w:p>
     <w:p>
       <w:pPr>
@@ -1614,14 +1574,12 @@
         <w:rPr>
           <w:rFonts w:ascii="Times New Roman" w:hAnsi="Times New Roman" w:cs="Times New Roman"/>
           <w:b/>
-          <w:lang w:val="en-US" w:eastAsia="en-US"/>
-        </w:rPr>
-      </w:pPr>
-      <w:r>
-        <w:rPr>
-          <w:rFonts w:ascii="Times New Roman" w:hAnsi="Times New Roman" w:cs="Times New Roman"/>
-          <w:b/>
-          <w:lang w:val="en-US" w:eastAsia="en-US"/>
+        </w:rPr>
+      </w:pPr>
+      <w:r>
+        <w:rPr>
+          <w:rFonts w:ascii="Times New Roman" w:hAnsi="Times New Roman" w:cs="Times New Roman"/>
+          <w:b/>
         </w:rPr>
         <w:t>[CHAIRMAN_NAME]</w:t>
       </w:r>
@@ -1631,43 +1589,30 @@
         <w:spacing w:after="0"/>
         <w:jc w:val="center"/>
         <w:rPr>
-          <w:rFonts w:ascii="Times New Roman" w:hAnsi="Times New Roman" w:cs="Times New Roman"/>
-          <w:b/>
-          <w:lang w:val="en-US" w:eastAsia="en-US"/>
-        </w:rPr>
-      </w:pPr>
-      <w:r>
-        <w:rPr>
-          <w:rFonts w:ascii="Times New Roman" w:hAnsi="Times New Roman" w:cs="Times New Roman"/>
-          <w:lang w:val="en-US" w:eastAsia="en-US"/>
+          <w:rFonts w:ascii="Times New Roman" w:eastAsia="Calibri" w:hAnsi="Times New Roman" w:cs="Times New Roman"/>
+          <w:b/>
+        </w:rPr>
+      </w:pPr>
+      <w:r>
+        <w:rPr>
+          <w:rFonts w:ascii="Times New Roman" w:hAnsi="Times New Roman" w:cs="Times New Roman"/>
         </w:rPr>
         <w:t>Chairman, Committee on Transportation</w:t>
       </w:r>
-    </w:p>
-    <w:p>
-      <w:pPr>
-        <w:spacing w:after="0" w:line="240" w:lineRule="auto"/>
-        <w:jc w:val="center"/>
-        <w:rPr>
-          <w:rFonts w:ascii="Times New Roman" w:eastAsia="Times New Roman" w:hAnsi="Times New Roman" w:cs="Times New Roman"/>
-          <w:sz w:val="20"/>
-          <w:szCs w:val="20"/>
-        </w:rPr>
-      </w:pPr>
     </w:p>
     <w:sectPr>
       <w:footerReference w:type="default" r:id="rId10"/>
-      <w:pgSz w:w="11906" w:h="16838"/>
-      <w:pgMar w:top="720" w:right="864" w:bottom="576" w:left="1152" w:header="720" w:footer="170" w:gutter="0"/>
-      <w:pgNumType w:start="1"/>
+      <w:pgSz w:w="11906" w:h="16838" w:code="9"/>
+      <w:pgMar w:top="720" w:right="862" w:bottom="578" w:left="1151" w:header="720" w:footer="170" w:gutter="0"/>
       <w:cols w:space="720"/>
+      <w:docGrid w:linePitch="360"/>
     </w:sectPr>
   </w:body>
 </w:document>
 </file>
 
 <file path=word/endnotes.xml><?xml version="1.0" encoding="utf-8"?>
-<w:endnotes xmlns:wpc="http://schemas.microsoft.com/office/word/2010/wordprocessingCanvas" xmlns:cx="http://schemas.microsoft.com/office/drawing/2014/chartex" xmlns:cx1="http://schemas.microsoft.com/office/drawing/2015/9/8/chartex" xmlns:cx2="http://schemas.microsoft.com/office/drawing/2015/10/21/chartex" xmlns:cx3="http://schemas.microsoft.com/office/drawing/2016/5/9/chartex" xmlns:cx4="http://schemas.microsoft.com/office/drawing/2016/5/10/chartex" xmlns:cx5="http://schemas.microsoft.com/office/drawing/2016/5/11/chartex" xmlns:cx6="http://schemas.microsoft.com/office/drawing/2016/5/12/chartex" xmlns:cx7="http://schemas.microsoft.com/office/drawing/2016/5/13/chartex" xmlns:cx8="http://schemas.microsoft.com/office/drawing/2016/5/14/chartex" xmlns:mc="http://schemas.openxmlformats.org/markup-compatibility/2006" xmlns:aink="http://schemas.microsoft.com/office/drawing/2016/ink" xmlns:am3d="http://schemas.microsoft.com/office/drawing/2017/model3d" xmlns:o="urn:schemas-microsoft-com:office:office" xmlns:r="http://schemas.openxmlformats.org/officeDocument/2006/relationships" xmlns:m="http://schemas.openxmlformats.org/officeDocument/2006/math" xmlns:v="urn:schemas-microsoft-com:vml" xmlns:wp14="http://schemas.microsoft.com/office/word/2010/wordprocessingDrawing" xmlns:wp="http://schemas.openxmlformats.org/drawingml/2006/wordprocessingDrawing" xmlns:w10="urn:schemas-microsoft-com:office:word" xmlns:w="http://schemas.openxmlformats.org/wordprocessingml/2006/main" xmlns:w14="http://schemas.microsoft.com/office/word/2010/wordml" xmlns:w15="http://schemas.microsoft.com/office/word/2012/wordml" xmlns:w16cex="http://schemas.microsoft.com/office/word/2018/wordml/cex" xmlns:w16cid="http://schemas.microsoft.com/office/word/2016/wordml/cid" xmlns:w16="http://schemas.microsoft.com/office/word/2018/wordml" xmlns:w16sdtdh="http://schemas.microsoft.com/office/word/2020/wordml/sdtdatahash" xmlns:w16se="http://schemas.microsoft.com/office/word/2015/wordml/symex" xmlns:wpg="http://schemas.microsoft.com/office/word/2010/wordprocessingGroup" xmlns:wpi="http://schemas.microsoft.com/office/word/2010/wordprocessingInk" xmlns:wne="http://schemas.microsoft.com/office/word/2006/wordml" xmlns:wps="http://schemas.microsoft.com/office/word/2010/wordprocessingShape" mc:Ignorable="w14 w15 w16se w16cid w16 w16cex w16sdtdh wp14">
+<w:endnotes xmlns:wpc="http://schemas.microsoft.com/office/word/2010/wordprocessingCanvas" xmlns:cx="http://schemas.microsoft.com/office/drawing/2014/chartex" xmlns:mc="http://schemas.openxmlformats.org/markup-compatibility/2006" xmlns:o="urn:schemas-microsoft-com:office:office" xmlns:r="http://schemas.openxmlformats.org/officeDocument/2006/relationships" xmlns:m="http://schemas.openxmlformats.org/officeDocument/2006/math" xmlns:v="urn:schemas-microsoft-com:vml" xmlns:wp14="http://schemas.microsoft.com/office/word/2010/wordprocessingDrawing" xmlns:wp="http://schemas.openxmlformats.org/drawingml/2006/wordprocessingDrawing" xmlns:w10="urn:schemas-microsoft-com:office:word" xmlns:w="http://schemas.openxmlformats.org/wordprocessingml/2006/main" xmlns:w14="http://schemas.microsoft.com/office/word/2010/wordml" xmlns:w15="http://schemas.microsoft.com/office/word/2012/wordml" xmlns:w16se="http://schemas.microsoft.com/office/word/2015/wordml/symex" xmlns:wpg="http://schemas.microsoft.com/office/word/2010/wordprocessingGroup" xmlns:wpi="http://schemas.microsoft.com/office/word/2010/wordprocessingInk" xmlns:wne="http://schemas.microsoft.com/office/word/2006/wordml" xmlns:wps="http://schemas.microsoft.com/office/word/2010/wordprocessingShape" mc:Ignorable="w14 w15 w16se wp14">
   <w:endnote w:type="separator" w:id="-1">
     <w:p>
       <w:pPr>
@@ -1692,25 +1637,19 @@
 </file>
 
 <file path=word/footer1.xml><?xml version="1.0" encoding="utf-8"?>
-<w:ftr xmlns:wpc="http://schemas.microsoft.com/office/word/2010/wordprocessingCanvas" xmlns:cx="http://schemas.microsoft.com/office/drawing/2014/chartex" xmlns:cx1="http://schemas.microsoft.com/office/drawing/2015/9/8/chartex" xmlns:cx2="http://schemas.microsoft.com/office/drawing/2015/10/21/chartex" xmlns:cx3="http://schemas.microsoft.com/office/drawing/2016/5/9/chartex" xmlns:cx4="http://schemas.microsoft.com/office/drawing/2016/5/10/chartex" xmlns:cx5="http://schemas.microsoft.com/office/drawing/2016/5/11/chartex" xmlns:cx6="http://schemas.microsoft.com/office/drawing/2016/5/12/chartex" xmlns:cx7="http://schemas.microsoft.com/office/drawing/2016/5/13/chartex" xmlns:cx8="http://schemas.microsoft.com/office/drawing/2016/5/14/chartex" xmlns:mc="http://schemas.openxmlformats.org/markup-compatibility/2006" xmlns:aink="http://schemas.microsoft.com/office/drawing/2016/ink" xmlns:am3d="http://schemas.microsoft.com/office/drawing/2017/model3d" xmlns:o="urn:schemas-microsoft-com:office:office" xmlns:r="http://schemas.openxmlformats.org/officeDocument/2006/relationships" xmlns:m="http://schemas.openxmlformats.org/officeDocument/2006/math" xmlns:v="urn:schemas-microsoft-com:vml" xmlns:wp14="http://schemas.microsoft.com/office/word/2010/wordprocessingDrawing" xmlns:wp="http://schemas.openxmlformats.org/drawingml/2006/wordprocessingDrawing" xmlns:w10="urn:schemas-microsoft-com:office:word" xmlns:w="http://schemas.openxmlformats.org/wordprocessingml/2006/main" xmlns:w14="http://schemas.microsoft.com/office/word/2010/wordml" xmlns:w15="http://schemas.microsoft.com/office/word/2012/wordml" xmlns:w16cex="http://schemas.microsoft.com/office/word/2018/wordml/cex" xmlns:w16cid="http://schemas.microsoft.com/office/word/2016/wordml/cid" xmlns:w16="http://schemas.microsoft.com/office/word/2018/wordml" xmlns:w16sdtdh="http://schemas.microsoft.com/office/word/2020/wordml/sdtdatahash" xmlns:w16se="http://schemas.microsoft.com/office/word/2015/wordml/symex" xmlns:wpg="http://schemas.microsoft.com/office/word/2010/wordprocessingGroup" xmlns:wpi="http://schemas.microsoft.com/office/word/2010/wordprocessingInk" xmlns:wne="http://schemas.microsoft.com/office/word/2006/wordml" xmlns:wps="http://schemas.microsoft.com/office/word/2010/wordprocessingShape" mc:Ignorable="w14 w15 w16se w16cid w16 w16cex w16sdtdh wp14">
+<w:ftr xmlns:wpc="http://schemas.microsoft.com/office/word/2010/wordprocessingCanvas" xmlns:cx="http://schemas.microsoft.com/office/drawing/2014/chartex" xmlns:mc="http://schemas.openxmlformats.org/markup-compatibility/2006" xmlns:o="urn:schemas-microsoft-com:office:office" xmlns:r="http://schemas.openxmlformats.org/officeDocument/2006/relationships" xmlns:m="http://schemas.openxmlformats.org/officeDocument/2006/math" xmlns:v="urn:schemas-microsoft-com:vml" xmlns:wp14="http://schemas.microsoft.com/office/word/2010/wordprocessingDrawing" xmlns:wp="http://schemas.openxmlformats.org/drawingml/2006/wordprocessingDrawing" xmlns:w10="urn:schemas-microsoft-com:office:word" xmlns:w="http://schemas.openxmlformats.org/wordprocessingml/2006/main" xmlns:w14="http://schemas.microsoft.com/office/word/2010/wordml" xmlns:w15="http://schemas.microsoft.com/office/word/2012/wordml" xmlns:w16se="http://schemas.microsoft.com/office/word/2015/wordml/symex" xmlns:wpg="http://schemas.microsoft.com/office/word/2010/wordprocessingGroup" xmlns:wpi="http://schemas.microsoft.com/office/word/2010/wordprocessingInk" xmlns:wne="http://schemas.microsoft.com/office/word/2006/wordml" xmlns:wps="http://schemas.microsoft.com/office/word/2010/wordprocessingShape" mc:Ignorable="w14 w15 w16se wp14">
   <w:p>
     <w:pPr>
+      <w:pStyle w:val="Footer"/>
       <w:pBdr>
-        <w:top w:val="single" w:sz="24" w:space="1" w:color="622423"/>
-        <w:left w:val="nil"/>
-        <w:bottom w:val="nil"/>
-        <w:right w:val="nil"/>
-        <w:between w:val="nil"/>
+        <w:top w:val="thinThickSmallGap" w:sz="24" w:space="1" w:color="622423"/>
       </w:pBdr>
       <w:tabs>
-        <w:tab w:val="center" w:pos="4680"/>
-        <w:tab w:val="right" w:pos="9360"/>
+        <w:tab w:val="clear" w:pos="9360"/>
       </w:tabs>
-      <w:spacing w:after="0" w:line="240" w:lineRule="auto"/>
       <w:ind w:right="301"/>
       <w:rPr>
-        <w:rFonts w:ascii="Bookman Old Style" w:eastAsia="Bookman Old Style" w:hAnsi="Bookman Old Style" w:cs="Bookman Old Style"/>
-        <w:color w:val="000000"/>
+        <w:rFonts w:ascii="Bookman Old Style" w:hAnsi="Bookman Old Style" w:cs="Times New Roman"/>
         <w:sz w:val="14"/>
         <w:szCs w:val="14"/>
       </w:rPr>
@@ -1718,87 +1657,77 @@
   </w:p>
   <w:p>
     <w:pPr>
+      <w:pStyle w:val="Footer"/>
       <w:pBdr>
-        <w:top w:val="single" w:sz="24" w:space="1" w:color="622423"/>
-        <w:left w:val="nil"/>
-        <w:bottom w:val="nil"/>
-        <w:right w:val="nil"/>
-        <w:between w:val="nil"/>
+        <w:top w:val="thinThickSmallGap" w:sz="24" w:space="1" w:color="622423"/>
       </w:pBdr>
       <w:tabs>
-        <w:tab w:val="center" w:pos="4680"/>
-        <w:tab w:val="right" w:pos="9360"/>
+        <w:tab w:val="clear" w:pos="9360"/>
       </w:tabs>
-      <w:spacing w:after="0" w:line="240" w:lineRule="auto"/>
       <w:ind w:right="301"/>
       <w:rPr>
-        <w:rFonts w:ascii="Bookman Old Style" w:eastAsia="Bookman Old Style" w:hAnsi="Bookman Old Style" w:cs="Bookman Old Style"/>
-        <w:color w:val="000000"/>
+        <w:rFonts w:ascii="Bookman Old Style" w:hAnsi="Bookman Old Style" w:cs="Times New Roman"/>
         <w:sz w:val="16"/>
         <w:szCs w:val="16"/>
       </w:rPr>
     </w:pPr>
     <w:r>
       <w:rPr>
-        <w:rFonts w:ascii="Bookman Old Style" w:eastAsia="Bookman Old Style" w:hAnsi="Bookman Old Style" w:cs="Bookman Old Style"/>
-        <w:color w:val="000000"/>
+        <w:rFonts w:ascii="Bookman Old Style" w:hAnsi="Bookman Old Style" w:cs="Times New Roman"/>
         <w:sz w:val="16"/>
         <w:szCs w:val="16"/>
       </w:rPr>
-      <w:t>2/F Sangguniang Bayan Bldg. Municipal Compound, Brgy. Ibayo Silangan, Naic, Cavite</w:t>
+      <w:t xml:space="preserve">2/F </w:t>
+    </w:r>
+    <w:proofErr w:type="spellStart"/>
+    <w:r>
+      <w:rPr>
+        <w:rFonts w:ascii="Bookman Old Style" w:hAnsi="Bookman Old Style" w:cs="Times New Roman"/>
+        <w:sz w:val="16"/>
+        <w:szCs w:val="16"/>
+      </w:rPr>
+      <w:t>Sangguniang</w:t>
+    </w:r>
+    <w:proofErr w:type="spellEnd"/>
+    <w:r>
+      <w:rPr>
+        <w:rFonts w:ascii="Bookman Old Style" w:hAnsi="Bookman Old Style" w:cs="Times New Roman"/>
+        <w:sz w:val="16"/>
+        <w:szCs w:val="16"/>
+      </w:rPr>
+      <w:t xml:space="preserve"> Bayan Bldg. Municipal Compound, Brgy. Ibayo Silangan, Naic, Cavite</w:t>
     </w:r>
   </w:p>
   <w:p>
     <w:pPr>
       <w:spacing w:after="0" w:line="240" w:lineRule="auto"/>
       <w:rPr>
-        <w:rFonts w:ascii="Bookman Old Style" w:eastAsia="Bookman Old Style" w:hAnsi="Bookman Old Style" w:cs="Bookman Old Style"/>
+        <w:rFonts w:ascii="Bookman Old Style" w:hAnsi="Bookman Old Style"/>
         <w:sz w:val="16"/>
         <w:szCs w:val="16"/>
       </w:rPr>
     </w:pPr>
     <w:r>
       <w:rPr>
-        <w:rFonts w:ascii="Bookman Old Style" w:eastAsia="Bookman Old Style" w:hAnsi="Bookman Old Style" w:cs="Bookman Old Style"/>
+        <w:rFonts w:ascii="Bookman Old Style" w:hAnsi="Bookman Old Style"/>
         <w:sz w:val="16"/>
         <w:szCs w:val="16"/>
       </w:rPr>
-      <w:t xml:space="preserve">Tel. No.: (046) 890 – </w:t>
-    </w:r>
-    <w:r>
-      <w:rPr>
-        <w:rFonts w:ascii="Bookman Old Style" w:eastAsia="Bookman Old Style" w:hAnsi="Bookman Old Style" w:cs="Bookman Old Style"/>
-        <w:sz w:val="16"/>
-        <w:szCs w:val="16"/>
-      </w:rPr>
-      <w:t>2134</w:t>
+      <w:t>Tel. No.: (046) 890 – 2134</w:t>
     </w:r>
   </w:p>
   <w:p>
     <w:pPr>
-      <w:pBdr>
-        <w:top w:val="nil"/>
-        <w:left w:val="nil"/>
-        <w:bottom w:val="nil"/>
-        <w:right w:val="nil"/>
-        <w:between w:val="nil"/>
-      </w:pBdr>
-      <w:tabs>
-        <w:tab w:val="center" w:pos="4680"/>
-        <w:tab w:val="right" w:pos="9360"/>
-      </w:tabs>
-      <w:spacing w:after="0" w:line="240" w:lineRule="auto"/>
+      <w:pStyle w:val="Footer"/>
       <w:rPr>
-        <w:rFonts w:ascii="Bookman Old Style" w:eastAsia="Bookman Old Style" w:hAnsi="Bookman Old Style" w:cs="Bookman Old Style"/>
-        <w:color w:val="000000"/>
+        <w:rFonts w:ascii="Bookman Old Style" w:hAnsi="Bookman Old Style" w:cs="Times New Roman"/>
         <w:sz w:val="16"/>
         <w:szCs w:val="16"/>
       </w:rPr>
     </w:pPr>
     <w:r>
       <w:rPr>
-        <w:rFonts w:ascii="Bookman Old Style" w:eastAsia="Bookman Old Style" w:hAnsi="Bookman Old Style" w:cs="Bookman Old Style"/>
-        <w:color w:val="000000"/>
+        <w:rFonts w:ascii="Bookman Old Style" w:hAnsi="Bookman Old Style" w:cs="Times New Roman"/>
         <w:sz w:val="16"/>
         <w:szCs w:val="16"/>
       </w:rPr>
@@ -1807,28 +1736,14 @@
   </w:p>
   <w:p>
     <w:pPr>
-      <w:pBdr>
-        <w:top w:val="nil"/>
-        <w:left w:val="nil"/>
-        <w:bottom w:val="nil"/>
-        <w:right w:val="nil"/>
-        <w:between w:val="nil"/>
-      </w:pBdr>
-      <w:tabs>
-        <w:tab w:val="center" w:pos="4680"/>
-        <w:tab w:val="right" w:pos="9360"/>
-      </w:tabs>
-      <w:spacing w:after="0" w:line="240" w:lineRule="auto"/>
-      <w:rPr>
-        <w:color w:val="000000"/>
-      </w:rPr>
+      <w:pStyle w:val="Footer"/>
     </w:pPr>
   </w:p>
 </w:ftr>
 </file>
 
 <file path=word/footnotes.xml><?xml version="1.0" encoding="utf-8"?>
-<w:footnotes xmlns:wpc="http://schemas.microsoft.com/office/word/2010/wordprocessingCanvas" xmlns:cx="http://schemas.microsoft.com/office/drawing/2014/chartex" xmlns:cx1="http://schemas.microsoft.com/office/drawing/2015/9/8/chartex" xmlns:cx2="http://schemas.microsoft.com/office/drawing/2015/10/21/chartex" xmlns:cx3="http://schemas.microsoft.com/office/drawing/2016/5/9/chartex" xmlns:cx4="http://schemas.microsoft.com/office/drawing/2016/5/10/chartex" xmlns:cx5="http://schemas.microsoft.com/office/drawing/2016/5/11/chartex" xmlns:cx6="http://schemas.microsoft.com/office/drawing/2016/5/12/chartex" xmlns:cx7="http://schemas.microsoft.com/office/drawing/2016/5/13/chartex" xmlns:cx8="http://schemas.microsoft.com/office/drawing/2016/5/14/chartex" xmlns:mc="http://schemas.openxmlformats.org/markup-compatibility/2006" xmlns:aink="http://schemas.microsoft.com/office/drawing/2016/ink" xmlns:am3d="http://schemas.microsoft.com/office/drawing/2017/model3d" xmlns:o="urn:schemas-microsoft-com:office:office" xmlns:r="http://schemas.openxmlformats.org/officeDocument/2006/relationships" xmlns:m="http://schemas.openxmlformats.org/officeDocument/2006/math" xmlns:v="urn:schemas-microsoft-com:vml" xmlns:wp14="http://schemas.microsoft.com/office/word/2010/wordprocessingDrawing" xmlns:wp="http://schemas.openxmlformats.org/drawingml/2006/wordprocessingDrawing" xmlns:w10="urn:schemas-microsoft-com:office:word" xmlns:w="http://schemas.openxmlformats.org/wordprocessingml/2006/main" xmlns:w14="http://schemas.microsoft.com/office/word/2010/wordml" xmlns:w15="http://schemas.microsoft.com/office/word/2012/wordml" xmlns:w16cex="http://schemas.microsoft.com/office/word/2018/wordml/cex" xmlns:w16cid="http://schemas.microsoft.com/office/word/2016/wordml/cid" xmlns:w16="http://schemas.microsoft.com/office/word/2018/wordml" xmlns:w16sdtdh="http://schemas.microsoft.com/office/word/2020/wordml/sdtdatahash" xmlns:w16se="http://schemas.microsoft.com/office/word/2015/wordml/symex" xmlns:wpg="http://schemas.microsoft.com/office/word/2010/wordprocessingGroup" xmlns:wpi="http://schemas.microsoft.com/office/word/2010/wordprocessingInk" xmlns:wne="http://schemas.microsoft.com/office/word/2006/wordml" xmlns:wps="http://schemas.microsoft.com/office/word/2010/wordprocessingShape" mc:Ignorable="w14 w15 w16se w16cid w16 w16cex w16sdtdh wp14">
+<w:footnotes xmlns:wpc="http://schemas.microsoft.com/office/word/2010/wordprocessingCanvas" xmlns:cx="http://schemas.microsoft.com/office/drawing/2014/chartex" xmlns:mc="http://schemas.openxmlformats.org/markup-compatibility/2006" xmlns:o="urn:schemas-microsoft-com:office:office" xmlns:r="http://schemas.openxmlformats.org/officeDocument/2006/relationships" xmlns:m="http://schemas.openxmlformats.org/officeDocument/2006/math" xmlns:v="urn:schemas-microsoft-com:vml" xmlns:wp14="http://schemas.microsoft.com/office/word/2010/wordprocessingDrawing" xmlns:wp="http://schemas.openxmlformats.org/drawingml/2006/wordprocessingDrawing" xmlns:w10="urn:schemas-microsoft-com:office:word" xmlns:w="http://schemas.openxmlformats.org/wordprocessingml/2006/main" xmlns:w14="http://schemas.microsoft.com/office/word/2010/wordml" xmlns:w15="http://schemas.microsoft.com/office/word/2012/wordml" xmlns:w16se="http://schemas.microsoft.com/office/word/2015/wordml/symex" xmlns:wpg="http://schemas.microsoft.com/office/word/2010/wordprocessingGroup" xmlns:wpi="http://schemas.microsoft.com/office/word/2010/wordprocessingInk" xmlns:wne="http://schemas.microsoft.com/office/word/2006/wordml" xmlns:wps="http://schemas.microsoft.com/office/word/2010/wordprocessingShape" mc:Ignorable="w14 w15 w16se wp14">
   <w:footnote w:type="separator" w:id="-1">
     <w:p>
       <w:pPr>
@@ -1853,12 +1768,12 @@
 </file>
 
 <file path=word/numbering.xml><?xml version="1.0" encoding="utf-8"?>
-<w:numbering xmlns:wpc="http://schemas.microsoft.com/office/word/2010/wordprocessingCanvas" xmlns:cx="http://schemas.microsoft.com/office/drawing/2014/chartex" xmlns:cx1="http://schemas.microsoft.com/office/drawing/2015/9/8/chartex" xmlns:cx2="http://schemas.microsoft.com/office/drawing/2015/10/21/chartex" xmlns:cx3="http://schemas.microsoft.com/office/drawing/2016/5/9/chartex" xmlns:cx4="http://schemas.microsoft.com/office/drawing/2016/5/10/chartex" xmlns:cx5="http://schemas.microsoft.com/office/drawing/2016/5/11/chartex" xmlns:cx6="http://schemas.microsoft.com/office/drawing/2016/5/12/chartex" xmlns:cx7="http://schemas.microsoft.com/office/drawing/2016/5/13/chartex" xmlns:cx8="http://schemas.microsoft.com/office/drawing/2016/5/14/chartex" xmlns:mc="http://schemas.openxmlformats.org/markup-compatibility/2006" xmlns:aink="http://schemas.microsoft.com/office/drawing/2016/ink" xmlns:am3d="http://schemas.microsoft.com/office/drawing/2017/model3d" xmlns:o="urn:schemas-microsoft-com:office:office" xmlns:r="http://schemas.openxmlformats.org/officeDocument/2006/relationships" xmlns:m="http://schemas.openxmlformats.org/officeDocument/2006/math" xmlns:v="urn:schemas-microsoft-com:vml" xmlns:wp14="http://schemas.microsoft.com/office/word/2010/wordprocessingDrawing" xmlns:wp="http://schemas.openxmlformats.org/drawingml/2006/wordprocessingDrawing" xmlns:w10="urn:schemas-microsoft-com:office:word" xmlns:w="http://schemas.openxmlformats.org/wordprocessingml/2006/main" xmlns:w14="http://schemas.microsoft.com/office/word/2010/wordml" xmlns:w15="http://schemas.microsoft.com/office/word/2012/wordml" xmlns:w16cex="http://schemas.microsoft.com/office/word/2018/wordml/cex" xmlns:w16cid="http://schemas.microsoft.com/office/word/2016/wordml/cid" xmlns:w16="http://schemas.microsoft.com/office/word/2018/wordml" xmlns:w16sdtdh="http://schemas.microsoft.com/office/word/2020/wordml/sdtdatahash" xmlns:w16se="http://schemas.microsoft.com/office/word/2015/wordml/symex" xmlns:wpg="http://schemas.microsoft.com/office/word/2010/wordprocessingGroup" xmlns:wpi="http://schemas.microsoft.com/office/word/2010/wordprocessingInk" xmlns:wne="http://schemas.microsoft.com/office/word/2006/wordml" xmlns:wps="http://schemas.microsoft.com/office/word/2010/wordprocessingShape" mc:Ignorable="w14 w15 w16se w16cid w16 w16cex w16sdtdh wp14">
+<w:numbering xmlns:wpc="http://schemas.microsoft.com/office/word/2010/wordprocessingCanvas" xmlns:cx="http://schemas.microsoft.com/office/drawing/2014/chartex" xmlns:mc="http://schemas.openxmlformats.org/markup-compatibility/2006" xmlns:o="urn:schemas-microsoft-com:office:office" xmlns:r="http://schemas.openxmlformats.org/officeDocument/2006/relationships" xmlns:m="http://schemas.openxmlformats.org/officeDocument/2006/math" xmlns:v="urn:schemas-microsoft-com:vml" xmlns:wp14="http://schemas.microsoft.com/office/word/2010/wordprocessingDrawing" xmlns:wp="http://schemas.openxmlformats.org/drawingml/2006/wordprocessingDrawing" xmlns:w10="urn:schemas-microsoft-com:office:word" xmlns:w="http://schemas.openxmlformats.org/wordprocessingml/2006/main" xmlns:w14="http://schemas.microsoft.com/office/word/2010/wordml" xmlns:w15="http://schemas.microsoft.com/office/word/2012/wordml" xmlns:w16se="http://schemas.microsoft.com/office/word/2015/wordml/symex" xmlns:wpg="http://schemas.microsoft.com/office/word/2010/wordprocessingGroup" xmlns:wpi="http://schemas.microsoft.com/office/word/2010/wordprocessingInk" xmlns:wne="http://schemas.microsoft.com/office/word/2006/wordml" xmlns:wps="http://schemas.microsoft.com/office/word/2010/wordprocessingShape" mc:Ignorable="w14 w15 w16se wp14">
   <w:abstractNum w:abstractNumId="0" w15:restartNumberingAfterBreak="0">
-    <w:nsid w:val="2C4470A5"/>
-    <w:multiLevelType w:val="multilevel"/>
-    <w:tmpl w:val="573637DC"/>
-    <w:lvl w:ilvl="0">
+    <w:nsid w:val="0B637370"/>
+    <w:multiLevelType w:val="hybridMultilevel"/>
+    <w:tmpl w:val="F5624EFC"/>
+    <w:lvl w:ilvl="0" w:tplc="0409000F">
       <w:start w:val="1"/>
       <w:numFmt w:val="decimal"/>
       <w:lvlText w:val="%1."/>
@@ -1866,8 +1781,11 @@
       <w:pPr>
         <w:ind w:left="720" w:hanging="360"/>
       </w:pPr>
+      <w:rPr>
+        <w:rFonts w:hint="default"/>
+      </w:rPr>
     </w:lvl>
-    <w:lvl w:ilvl="1">
+    <w:lvl w:ilvl="1" w:tplc="04090019" w:tentative="1">
       <w:start w:val="1"/>
       <w:numFmt w:val="lowerLetter"/>
       <w:lvlText w:val="%2."/>
@@ -1876,7 +1794,7 @@
         <w:ind w:left="1440" w:hanging="360"/>
       </w:pPr>
     </w:lvl>
-    <w:lvl w:ilvl="2">
+    <w:lvl w:ilvl="2" w:tplc="0409001B" w:tentative="1">
       <w:start w:val="1"/>
       <w:numFmt w:val="lowerRoman"/>
       <w:lvlText w:val="%3."/>
@@ -1885,7 +1803,7 @@
         <w:ind w:left="2160" w:hanging="180"/>
       </w:pPr>
     </w:lvl>
-    <w:lvl w:ilvl="3">
+    <w:lvl w:ilvl="3" w:tplc="0409000F" w:tentative="1">
       <w:start w:val="1"/>
       <w:numFmt w:val="decimal"/>
       <w:lvlText w:val="%4."/>
@@ -1894,7 +1812,7 @@
         <w:ind w:left="2880" w:hanging="360"/>
       </w:pPr>
     </w:lvl>
-    <w:lvl w:ilvl="4">
+    <w:lvl w:ilvl="4" w:tplc="04090019" w:tentative="1">
       <w:start w:val="1"/>
       <w:numFmt w:val="lowerLetter"/>
       <w:lvlText w:val="%5."/>
@@ -1903,7 +1821,7 @@
         <w:ind w:left="3600" w:hanging="360"/>
       </w:pPr>
     </w:lvl>
-    <w:lvl w:ilvl="5">
+    <w:lvl w:ilvl="5" w:tplc="0409001B" w:tentative="1">
       <w:start w:val="1"/>
       <w:numFmt w:val="lowerRoman"/>
       <w:lvlText w:val="%6."/>
@@ -1912,7 +1830,7 @@
         <w:ind w:left="4320" w:hanging="180"/>
       </w:pPr>
     </w:lvl>
-    <w:lvl w:ilvl="6">
+    <w:lvl w:ilvl="6" w:tplc="0409000F" w:tentative="1">
       <w:start w:val="1"/>
       <w:numFmt w:val="decimal"/>
       <w:lvlText w:val="%7."/>
@@ -1921,7 +1839,7 @@
         <w:ind w:left="5040" w:hanging="360"/>
       </w:pPr>
     </w:lvl>
-    <w:lvl w:ilvl="7">
+    <w:lvl w:ilvl="7" w:tplc="04090019" w:tentative="1">
       <w:start w:val="1"/>
       <w:numFmt w:val="lowerLetter"/>
       <w:lvlText w:val="%8."/>
@@ -1930,7 +1848,7 @@
         <w:ind w:left="5760" w:hanging="360"/>
       </w:pPr>
     </w:lvl>
-    <w:lvl w:ilvl="8">
+    <w:lvl w:ilvl="8" w:tplc="0409001B" w:tentative="1">
       <w:start w:val="1"/>
       <w:numFmt w:val="lowerRoman"/>
       <w:lvlText w:val="%9."/>
@@ -1943,18 +1861,48 @@
   <w:num w:numId="1">
     <w:abstractNumId w:val="0"/>
   </w:num>
+  <w:num w:numId="2">
+    <w:abstractNumId w:val="0"/>
+    <w:lvlOverride w:ilvl="0">
+      <w:startOverride w:val="1"/>
+    </w:lvlOverride>
+    <w:lvlOverride w:ilvl="1">
+      <w:startOverride w:val="1"/>
+    </w:lvlOverride>
+    <w:lvlOverride w:ilvl="2">
+      <w:startOverride w:val="1"/>
+    </w:lvlOverride>
+    <w:lvlOverride w:ilvl="3">
+      <w:startOverride w:val="1"/>
+    </w:lvlOverride>
+    <w:lvlOverride w:ilvl="4">
+      <w:startOverride w:val="1"/>
+    </w:lvlOverride>
+    <w:lvlOverride w:ilvl="5">
+      <w:startOverride w:val="1"/>
+    </w:lvlOverride>
+    <w:lvlOverride w:ilvl="6">
+      <w:startOverride w:val="1"/>
+    </w:lvlOverride>
+    <w:lvlOverride w:ilvl="7">
+      <w:startOverride w:val="1"/>
+    </w:lvlOverride>
+    <w:lvlOverride w:ilvl="8">
+      <w:startOverride w:val="1"/>
+    </w:lvlOverride>
+  </w:num>
 </w:numbering>
 </file>
 
 <file path=word/styles.xml><?xml version="1.0" encoding="utf-8"?>
-<w:styles xmlns:mc="http://schemas.openxmlformats.org/markup-compatibility/2006" xmlns:r="http://schemas.openxmlformats.org/officeDocument/2006/relationships" xmlns:w="http://schemas.openxmlformats.org/wordprocessingml/2006/main" xmlns:w14="http://schemas.microsoft.com/office/word/2010/wordml" xmlns:w15="http://schemas.microsoft.com/office/word/2012/wordml" xmlns:w16cex="http://schemas.microsoft.com/office/word/2018/wordml/cex" xmlns:w16cid="http://schemas.microsoft.com/office/word/2016/wordml/cid" xmlns:w16="http://schemas.microsoft.com/office/word/2018/wordml" xmlns:w16sdtdh="http://schemas.microsoft.com/office/word/2020/wordml/sdtdatahash" xmlns:w16se="http://schemas.microsoft.com/office/word/2015/wordml/symex" mc:Ignorable="w14 w15 w16se w16cid w16 w16cex w16sdtdh">
+<w:styles xmlns:mc="http://schemas.openxmlformats.org/markup-compatibility/2006" xmlns:r="http://schemas.openxmlformats.org/officeDocument/2006/relationships" xmlns:w="http://schemas.openxmlformats.org/wordprocessingml/2006/main" xmlns:w14="http://schemas.microsoft.com/office/word/2010/wordml" xmlns:w15="http://schemas.microsoft.com/office/word/2012/wordml" xmlns:w16se="http://schemas.microsoft.com/office/word/2015/wordml/symex" mc:Ignorable="w14 w15 w16se">
   <w:docDefaults>
     <w:rPrDefault>
       <w:rPr>
-        <w:rFonts w:ascii="Calibri" w:eastAsia="Calibri" w:hAnsi="Calibri" w:cs="Calibri"/>
+        <w:rFonts w:asciiTheme="minorHAnsi" w:eastAsiaTheme="minorHAnsi" w:hAnsiTheme="minorHAnsi" w:cstheme="minorBidi"/>
         <w:sz w:val="22"/>
         <w:szCs w:val="22"/>
-        <w:lang w:val="en" w:eastAsia="en-PH" w:bidi="ar-SA"/>
+        <w:lang w:val="en-US" w:eastAsia="en-US" w:bidi="ar-SA"/>
       </w:rPr>
     </w:rPrDefault>
     <w:pPrDefault>
@@ -1963,7 +1911,7 @@
       </w:pPr>
     </w:pPrDefault>
   </w:docDefaults>
-  <w:latentStyles w:defLockedState="0" w:defUIPriority="99" w:defSemiHidden="0" w:defUnhideWhenUsed="0" w:defQFormat="0" w:count="376">
+  <w:latentStyles w:defLockedState="0" w:defUIPriority="99" w:defSemiHidden="0" w:defUnhideWhenUsed="0" w:defQFormat="0" w:count="371">
     <w:lsdException w:name="Normal" w:uiPriority="0" w:qFormat="1"/>
     <w:lsdException w:name="heading 1" w:uiPriority="9" w:qFormat="1"/>
     <w:lsdException w:name="heading 2" w:semiHidden="1" w:uiPriority="9" w:unhideWhenUsed="1" w:qFormat="1"/>
@@ -2118,7 +2066,7 @@
     <w:lsdException w:name="Table Web 2" w:semiHidden="1" w:unhideWhenUsed="1"/>
     <w:lsdException w:name="Table Web 3" w:semiHidden="1" w:unhideWhenUsed="1"/>
     <w:lsdException w:name="Balloon Text" w:semiHidden="1" w:unhideWhenUsed="1"/>
-    <w:lsdException w:name="Table Grid" w:uiPriority="39"/>
+    <w:lsdException w:name="Table Grid" w:uiPriority="59"/>
     <w:lsdException w:name="Table Theme" w:semiHidden="1" w:unhideWhenUsed="1"/>
     <w:lsdException w:name="Placeholder Text" w:semiHidden="1"/>
     <w:lsdException w:name="No Spacing" w:uiPriority="1" w:qFormat="1"/>
@@ -2335,137 +2283,11 @@
     <w:lsdException w:name="List Table 5 Dark Accent 6" w:uiPriority="50"/>
     <w:lsdException w:name="List Table 6 Colorful Accent 6" w:uiPriority="51"/>
     <w:lsdException w:name="List Table 7 Colorful Accent 6" w:uiPriority="52"/>
-    <w:lsdException w:name="Mention" w:semiHidden="1" w:unhideWhenUsed="1"/>
-    <w:lsdException w:name="Smart Hyperlink" w:semiHidden="1" w:unhideWhenUsed="1"/>
-    <w:lsdException w:name="Hashtag" w:semiHidden="1" w:unhideWhenUsed="1"/>
-    <w:lsdException w:name="Unresolved Mention" w:semiHidden="1" w:unhideWhenUsed="1"/>
-    <w:lsdException w:name="Smart Link" w:semiHidden="1" w:unhideWhenUsed="1"/>
   </w:latentStyles>
   <w:style w:type="paragraph" w:default="1" w:styleId="Normal">
     <w:name w:val="Normal"/>
     <w:qFormat/>
-  </w:style>
-  <w:style w:type="paragraph" w:styleId="Heading1">
-    <w:name w:val="heading 1"/>
-    <w:basedOn w:val="Normal"/>
-    <w:next w:val="Normal"/>
-    <w:uiPriority w:val="9"/>
-    <w:qFormat/>
-    <w:pPr>
-      <w:keepNext/>
-      <w:keepLines/>
-      <w:spacing w:before="480" w:after="120"/>
-      <w:outlineLvl w:val="0"/>
-    </w:pPr>
-    <w:rPr>
-      <w:b/>
-      <w:bCs/>
-      <w:sz w:val="48"/>
-      <w:szCs w:val="48"/>
-    </w:rPr>
-  </w:style>
-  <w:style w:type="paragraph" w:styleId="Heading2">
-    <w:name w:val="heading 2"/>
-    <w:basedOn w:val="Normal"/>
-    <w:next w:val="Normal"/>
-    <w:uiPriority w:val="9"/>
-    <w:semiHidden/>
-    <w:unhideWhenUsed/>
-    <w:qFormat/>
-    <w:pPr>
-      <w:keepNext/>
-      <w:keepLines/>
-      <w:spacing w:before="360" w:after="80"/>
-      <w:outlineLvl w:val="1"/>
-    </w:pPr>
-    <w:rPr>
-      <w:b/>
-      <w:bCs/>
-      <w:sz w:val="36"/>
-      <w:szCs w:val="36"/>
-    </w:rPr>
-  </w:style>
-  <w:style w:type="paragraph" w:styleId="Heading3">
-    <w:name w:val="heading 3"/>
-    <w:basedOn w:val="Normal"/>
-    <w:next w:val="Normal"/>
-    <w:uiPriority w:val="9"/>
-    <w:semiHidden/>
-    <w:unhideWhenUsed/>
-    <w:qFormat/>
-    <w:pPr>
-      <w:keepNext/>
-      <w:keepLines/>
-      <w:spacing w:before="280" w:after="80"/>
-      <w:outlineLvl w:val="2"/>
-    </w:pPr>
-    <w:rPr>
-      <w:b/>
-      <w:bCs/>
-      <w:sz w:val="28"/>
-      <w:szCs w:val="28"/>
-    </w:rPr>
-  </w:style>
-  <w:style w:type="paragraph" w:styleId="Heading4">
-    <w:name w:val="heading 4"/>
-    <w:basedOn w:val="Normal"/>
-    <w:next w:val="Normal"/>
-    <w:uiPriority w:val="9"/>
-    <w:semiHidden/>
-    <w:unhideWhenUsed/>
-    <w:qFormat/>
-    <w:pPr>
-      <w:keepNext/>
-      <w:keepLines/>
-      <w:spacing w:before="240" w:after="40"/>
-      <w:outlineLvl w:val="3"/>
-    </w:pPr>
-    <w:rPr>
-      <w:b/>
-      <w:bCs/>
-      <w:sz w:val="24"/>
-      <w:szCs w:val="24"/>
-    </w:rPr>
-  </w:style>
-  <w:style w:type="paragraph" w:styleId="Heading5">
-    <w:name w:val="heading 5"/>
-    <w:basedOn w:val="Normal"/>
-    <w:next w:val="Normal"/>
-    <w:uiPriority w:val="9"/>
-    <w:semiHidden/>
-    <w:unhideWhenUsed/>
-    <w:qFormat/>
-    <w:pPr>
-      <w:keepNext/>
-      <w:keepLines/>
-      <w:spacing w:before="220" w:after="40"/>
-      <w:outlineLvl w:val="4"/>
-    </w:pPr>
-    <w:rPr>
-      <w:b/>
-      <w:bCs/>
-    </w:rPr>
-  </w:style>
-  <w:style w:type="paragraph" w:styleId="Heading6">
-    <w:name w:val="heading 6"/>
-    <w:basedOn w:val="Normal"/>
-    <w:next w:val="Normal"/>
-    <w:uiPriority w:val="9"/>
-    <w:semiHidden/>
-    <w:unhideWhenUsed/>
-    <w:qFormat/>
-    <w:pPr>
-      <w:keepNext/>
-      <w:keepLines/>
-      <w:spacing w:before="200" w:after="40"/>
-      <w:outlineLvl w:val="5"/>
-    </w:pPr>
-    <w:rPr>
-      <w:b/>
-      <w:bCs/>
-      <w:sz w:val="20"/>
-      <w:szCs w:val="20"/>
-    </w:rPr>
+    <w:rsid w:val="00F4063C"/>
   </w:style>
   <w:style w:type="character" w:default="1" w:styleId="DefaultParagraphFont">
     <w:name w:val="Default Paragraph Font"/>
@@ -2494,68 +2316,99 @@
     <w:semiHidden/>
     <w:unhideWhenUsed/>
   </w:style>
-  <w:style w:type="table" w:customStyle="1" w:styleId="TableNormal0">
-    <w:name w:val="TableNormal"/>
-    <w:tblPr>
-      <w:tblCellMar>
-        <w:top w:w="100" w:type="dxa"/>
-        <w:left w:w="100" w:type="dxa"/>
-        <w:bottom w:w="100" w:type="dxa"/>
-        <w:right w:w="100" w:type="dxa"/>
-      </w:tblCellMar>
-    </w:tblPr>
-  </w:style>
-  <w:style w:type="paragraph" w:styleId="Title">
-    <w:name w:val="Title"/>
+  <w:style w:type="paragraph" w:styleId="BalloonText">
+    <w:name w:val="Balloon Text"/>
     <w:basedOn w:val="Normal"/>
-    <w:next w:val="Normal"/>
-    <w:uiPriority w:val="10"/>
-    <w:qFormat/>
+    <w:link w:val="BalloonTextChar"/>
+    <w:uiPriority w:val="99"/>
+    <w:semiHidden/>
+    <w:unhideWhenUsed/>
+    <w:rsid w:val="00C308C9"/>
     <w:pPr>
-      <w:keepNext/>
-      <w:keepLines/>
-      <w:spacing w:before="480" w:after="120"/>
+      <w:spacing w:after="0" w:line="240" w:lineRule="auto"/>
     </w:pPr>
     <w:rPr>
-      <w:b/>
-      <w:bCs/>
-      <w:sz w:val="72"/>
-      <w:szCs w:val="72"/>
+      <w:rFonts w:ascii="Tahoma" w:hAnsi="Tahoma" w:cs="Tahoma"/>
+      <w:sz w:val="16"/>
+      <w:szCs w:val="16"/>
     </w:rPr>
   </w:style>
-  <w:style w:type="paragraph" w:styleId="Subtitle">
-    <w:name w:val="Subtitle"/>
-    <w:basedOn w:val="Normal"/>
-    <w:next w:val="Normal"/>
-    <w:uiPriority w:val="11"/>
-    <w:qFormat/>
-    <w:pPr>
-      <w:keepNext/>
-      <w:keepLines/>
-      <w:spacing w:before="360" w:after="80"/>
-    </w:pPr>
+  <w:style w:type="character" w:customStyle="1" w:styleId="BalloonTextChar">
+    <w:name w:val="Balloon Text Char"/>
+    <w:basedOn w:val="DefaultParagraphFont"/>
+    <w:link w:val="BalloonText"/>
+    <w:uiPriority w:val="99"/>
+    <w:semiHidden/>
+    <w:rsid w:val="00C308C9"/>
     <w:rPr>
-      <w:rFonts w:ascii="Georgia" w:eastAsia="Georgia" w:hAnsi="Georgia" w:cs="Georgia"/>
-      <w:i/>
-      <w:iCs/>
-      <w:color w:val="666666"/>
-      <w:sz w:val="48"/>
-      <w:szCs w:val="48"/>
+      <w:rFonts w:ascii="Tahoma" w:hAnsi="Tahoma" w:cs="Tahoma"/>
+      <w:sz w:val="16"/>
+      <w:szCs w:val="16"/>
     </w:rPr>
   </w:style>
-  <w:style w:type="table" w:customStyle="1" w:styleId="a">
-    <w:basedOn w:val="TableNormal0"/>
-    <w:tblPr>
-      <w:tblStyleRowBandSize w:val="1"/>
-      <w:tblStyleColBandSize w:val="1"/>
-    </w:tblPr>
+  <w:style w:type="paragraph" w:styleId="ListParagraph">
+    <w:name w:val="List Paragraph"/>
+    <w:basedOn w:val="Normal"/>
+    <w:uiPriority w:val="34"/>
+    <w:qFormat/>
+    <w:rsid w:val="0074389A"/>
+    <w:pPr>
+      <w:ind w:left="720"/>
+      <w:contextualSpacing/>
+    </w:pPr>
   </w:style>
-  <w:style w:type="table" w:customStyle="1" w:styleId="a0">
-    <w:basedOn w:val="TableNormal0"/>
-    <w:tblPr>
-      <w:tblStyleRowBandSize w:val="1"/>
-      <w:tblStyleColBandSize w:val="1"/>
-    </w:tblPr>
+  <w:style w:type="paragraph" w:styleId="NoSpacing">
+    <w:name w:val="No Spacing"/>
+    <w:uiPriority w:val="1"/>
+    <w:qFormat/>
+    <w:rsid w:val="00473180"/>
+    <w:pPr>
+      <w:spacing w:after="0" w:line="240" w:lineRule="auto"/>
+    </w:pPr>
+  </w:style>
+  <w:style w:type="paragraph" w:styleId="Footer">
+    <w:name w:val="footer"/>
+    <w:basedOn w:val="Normal"/>
+    <w:link w:val="FooterChar"/>
+    <w:uiPriority w:val="99"/>
+    <w:unhideWhenUsed/>
+    <w:rsid w:val="00251C24"/>
+    <w:pPr>
+      <w:tabs>
+        <w:tab w:val="center" w:pos="4680"/>
+        <w:tab w:val="right" w:pos="9360"/>
+      </w:tabs>
+      <w:spacing w:after="0" w:line="240" w:lineRule="auto"/>
+    </w:pPr>
+  </w:style>
+  <w:style w:type="character" w:customStyle="1" w:styleId="FooterChar">
+    <w:name w:val="Footer Char"/>
+    <w:basedOn w:val="DefaultParagraphFont"/>
+    <w:link w:val="Footer"/>
+    <w:uiPriority w:val="99"/>
+    <w:rsid w:val="00251C24"/>
+  </w:style>
+  <w:style w:type="paragraph" w:styleId="Header">
+    <w:name w:val="header"/>
+    <w:basedOn w:val="Normal"/>
+    <w:link w:val="HeaderChar"/>
+    <w:uiPriority w:val="99"/>
+    <w:unhideWhenUsed/>
+    <w:rsid w:val="00251C24"/>
+    <w:pPr>
+      <w:tabs>
+        <w:tab w:val="center" w:pos="4680"/>
+        <w:tab w:val="right" w:pos="9360"/>
+      </w:tabs>
+      <w:spacing w:after="0" w:line="240" w:lineRule="auto"/>
+    </w:pPr>
+  </w:style>
+  <w:style w:type="character" w:customStyle="1" w:styleId="HeaderChar">
+    <w:name w:val="Header Char"/>
+    <w:basedOn w:val="DefaultParagraphFont"/>
+    <w:link w:val="Header"/>
+    <w:uiPriority w:val="99"/>
+    <w:rsid w:val="00251C24"/>
   </w:style>
 </w:styles>
 </file>
@@ -2603,7 +2456,7 @@
     </a:clrScheme>
     <a:fontScheme name="Office">
       <a:majorFont>
-        <a:latin typeface="Calibri"/>
+        <a:latin typeface="Cambria"/>
         <a:ea typeface=""/>
         <a:cs typeface=""/>
         <a:font script="Jpan" typeface="ＭＳ ゴシック"/>
@@ -2635,10 +2488,9 @@
         <a:font script="Mong" typeface="Mongolian Baiti"/>
         <a:font script="Viet" typeface="Times New Roman"/>
         <a:font script="Uigh" typeface="Microsoft Uighur"/>
-        <a:font script="Geor" typeface="Sylfaen"/>
       </a:majorFont>
       <a:minorFont>
-        <a:latin typeface="Cambria"/>
+        <a:latin typeface="Calibri"/>
         <a:ea typeface=""/>
         <a:cs typeface=""/>
         <a:font script="Jpan" typeface="ＭＳ 明朝"/>
@@ -2670,7 +2522,6 @@
         <a:font script="Mong" typeface="Mongolian Baiti"/>
         <a:font script="Viet" typeface="Arial"/>
         <a:font script="Uigh" typeface="Microsoft Uighur"/>
-        <a:font script="Geor" typeface="Sylfaen"/>
       </a:minorFont>
     </a:fontScheme>
     <a:fmtScheme name="Office">
@@ -2705,16 +2556,20 @@
           <a:gsLst>
             <a:gs pos="0">
               <a:schemeClr val="phClr">
-                <a:tint val="100000"/>
-                <a:shade val="100000"/>
+                <a:shade val="51000"/>
+                <a:satMod val="130000"/>
+              </a:schemeClr>
+            </a:gs>
+            <a:gs pos="80000">
+              <a:schemeClr val="phClr">
+                <a:shade val="93000"/>
                 <a:satMod val="130000"/>
               </a:schemeClr>
             </a:gs>
             <a:gs pos="100000">
               <a:schemeClr val="phClr">
-                <a:tint val="50000"/>
-                <a:shade val="100000"/>
-                <a:satMod val="350000"/>
+                <a:shade val="94000"/>
+                <a:satMod val="135000"/>
               </a:schemeClr>
             </a:gs>
           </a:gsLst>
@@ -2836,46 +2691,7 @@
       </a:bgFillStyleLst>
     </a:fmtScheme>
   </a:themeElements>
-  <a:objectDefaults>
-    <a:spDef>
-      <a:spPr/>
-      <a:bodyPr/>
-      <a:lstStyle/>
-      <a:style>
-        <a:lnRef idx="1">
-          <a:schemeClr val="accent1"/>
-        </a:lnRef>
-        <a:fillRef idx="3">
-          <a:schemeClr val="accent1"/>
-        </a:fillRef>
-        <a:effectRef idx="2">
-          <a:schemeClr val="accent1"/>
-        </a:effectRef>
-        <a:fontRef idx="minor">
-          <a:schemeClr val="lt1"/>
-        </a:fontRef>
-      </a:style>
-    </a:spDef>
-    <a:lnDef>
-      <a:spPr/>
-      <a:bodyPr/>
-      <a:lstStyle/>
-      <a:style>
-        <a:lnRef idx="2">
-          <a:schemeClr val="accent1"/>
-        </a:lnRef>
-        <a:fillRef idx="0">
-          <a:schemeClr val="accent1"/>
-        </a:fillRef>
-        <a:effectRef idx="1">
-          <a:schemeClr val="accent1"/>
-        </a:effectRef>
-        <a:fontRef idx="minor">
-          <a:schemeClr val="tx1"/>
-        </a:fontRef>
-      </a:style>
-    </a:lnDef>
-  </a:objectDefaults>
+  <a:objectDefaults/>
   <a:extraClrSchemeLst/>
 </a:theme>
 </file>
</xml_diff>

<commit_message>
feat: Enhance batch document handling and add new operator dialog
- Updated the add operator functionality to leave SBN No. blank for backend auto-generation.
- Improved keyboard navigation by preventing search input focus when a modal is open.
- Modified toast messages to include reminders for print settings.
- Refactored batch document download logic to streamline the process and improve error handling.
- Implemented a new batch printing dialog with options for scope and date filtering.
- Added custom route selection for batch printing.
- Enhanced the operator addition form with optional fields and date setting shortcuts.
- Improved the document preview modal for better user experience.
</commit_message>
<xml_diff>
--- a/backend/template.docx
+++ b/backend/template.docx
@@ -1,6 +1,6 @@
 
 <file path=word/document.xml><?xml version="1.0" encoding="utf-8"?>
-<w:document xmlns:wpc="http://schemas.microsoft.com/office/word/2010/wordprocessingCanvas" xmlns:cx="http://schemas.microsoft.com/office/drawing/2014/chartex" xmlns:mc="http://schemas.openxmlformats.org/markup-compatibility/2006" xmlns:o="urn:schemas-microsoft-com:office:office" xmlns:r="http://schemas.openxmlformats.org/officeDocument/2006/relationships" xmlns:m="http://schemas.openxmlformats.org/officeDocument/2006/math" xmlns:v="urn:schemas-microsoft-com:vml" xmlns:wp14="http://schemas.microsoft.com/office/word/2010/wordprocessingDrawing" xmlns:wp="http://schemas.openxmlformats.org/drawingml/2006/wordprocessingDrawing" xmlns:w10="urn:schemas-microsoft-com:office:word" xmlns:w="http://schemas.openxmlformats.org/wordprocessingml/2006/main" xmlns:w14="http://schemas.microsoft.com/office/word/2010/wordml" xmlns:w15="http://schemas.microsoft.com/office/word/2012/wordml" xmlns:w16se="http://schemas.microsoft.com/office/word/2015/wordml/symex" xmlns:wpg="http://schemas.microsoft.com/office/word/2010/wordprocessingGroup" xmlns:wpi="http://schemas.microsoft.com/office/word/2010/wordprocessingInk" xmlns:wne="http://schemas.microsoft.com/office/word/2006/wordml" xmlns:wps="http://schemas.microsoft.com/office/word/2010/wordprocessingShape" mc:Ignorable="w14 w15 w16se wp14">
+<w:document xmlns:wpc="http://schemas.microsoft.com/office/word/2010/wordprocessingCanvas" xmlns:cx="http://schemas.microsoft.com/office/drawing/2014/chartex" xmlns:cx1="http://schemas.microsoft.com/office/drawing/2015/9/8/chartex" xmlns:cx2="http://schemas.microsoft.com/office/drawing/2015/10/21/chartex" xmlns:cx3="http://schemas.microsoft.com/office/drawing/2016/5/9/chartex" xmlns:cx4="http://schemas.microsoft.com/office/drawing/2016/5/10/chartex" xmlns:cx5="http://schemas.microsoft.com/office/drawing/2016/5/11/chartex" xmlns:cx6="http://schemas.microsoft.com/office/drawing/2016/5/12/chartex" xmlns:cx7="http://schemas.microsoft.com/office/drawing/2016/5/13/chartex" xmlns:cx8="http://schemas.microsoft.com/office/drawing/2016/5/14/chartex" xmlns:mc="http://schemas.openxmlformats.org/markup-compatibility/2006" xmlns:aink="http://schemas.microsoft.com/office/drawing/2016/ink" xmlns:am3d="http://schemas.microsoft.com/office/drawing/2017/model3d" xmlns:o="urn:schemas-microsoft-com:office:office" xmlns:r="http://schemas.openxmlformats.org/officeDocument/2006/relationships" xmlns:m="http://schemas.openxmlformats.org/officeDocument/2006/math" xmlns:v="urn:schemas-microsoft-com:vml" xmlns:wp14="http://schemas.microsoft.com/office/word/2010/wordprocessingDrawing" xmlns:wp="http://schemas.openxmlformats.org/drawingml/2006/wordprocessingDrawing" xmlns:w10="urn:schemas-microsoft-com:office:word" xmlns:w="http://schemas.openxmlformats.org/wordprocessingml/2006/main" xmlns:w14="http://schemas.microsoft.com/office/word/2010/wordml" xmlns:w15="http://schemas.microsoft.com/office/word/2012/wordml" xmlns:w16cex="http://schemas.microsoft.com/office/word/2018/wordml/cex" xmlns:w16cid="http://schemas.microsoft.com/office/word/2016/wordml/cid" xmlns:w16="http://schemas.microsoft.com/office/word/2018/wordml" xmlns:w16sdtdh="http://schemas.microsoft.com/office/word/2020/wordml/sdtdatahash" xmlns:w16se="http://schemas.microsoft.com/office/word/2015/wordml/symex" xmlns:wpg="http://schemas.microsoft.com/office/word/2010/wordprocessingGroup" xmlns:wpi="http://schemas.microsoft.com/office/word/2010/wordprocessingInk" xmlns:wne="http://schemas.microsoft.com/office/word/2006/wordml" xmlns:wps="http://schemas.microsoft.com/office/word/2010/wordprocessingShape" mc:Ignorable="w14 w15 w16se w16cid w16 w16cex w16sdtdh wp14">
   <w:body>
     <w:p>
       <w:pPr>
@@ -48,7 +48,7 @@
                     </pic:cNvPicPr>
                   </pic:nvPicPr>
                   <pic:blipFill>
-                    <a:blip r:embed="rId7" cstate="print">
+                    <a:blip r:embed="rId8" cstate="print">
                       <a:extLst>
                         <a:ext uri="{28A0092B-C50C-407E-A947-70E740481C1C}">
                           <a14:useLocalDpi xmlns:a14="http://schemas.microsoft.com/office/drawing/2010/main" val="0"/>
@@ -114,7 +114,7 @@
                     </pic:cNvPicPr>
                   </pic:nvPicPr>
                   <pic:blipFill>
-                    <a:blip r:embed="rId8">
+                    <a:blip r:embed="rId9">
                       <a:extLst>
                         <a:ext uri="{28A0092B-C50C-407E-A947-70E740481C1C}">
                           <a14:useLocalDpi xmlns:a14="http://schemas.microsoft.com/office/drawing/2010/main" val="0"/>
@@ -179,7 +179,7 @@
                     </pic:cNvPicPr>
                   </pic:nvPicPr>
                   <pic:blipFill>
-                    <a:blip r:embed="rId9" cstate="print">
+                    <a:blip r:embed="rId10" cstate="print">
                       <a:extLst>
                         <a:ext uri="{28A0092B-C50C-407E-A947-70E740481C1C}">
                           <a14:useLocalDpi xmlns:a14="http://schemas.microsoft.com/office/drawing/2010/main" val="0"/>
@@ -557,15 +557,7 @@
           <w:sz w:val="20"/>
           <w:szCs w:val="20"/>
         </w:rPr>
-        <w:t>SBN No.</w:t>
-      </w:r>
-      <w:r>
-        <w:rPr>
-          <w:rFonts w:ascii="Times New Roman" w:hAnsi="Times New Roman" w:cs="Times New Roman"/>
-          <w:sz w:val="20"/>
-          <w:szCs w:val="20"/>
-        </w:rPr>
-        <w:t xml:space="preserve"> </w:t>
+        <w:t xml:space="preserve">SBN: </w:t>
       </w:r>
       <w:r>
         <w:rPr>
@@ -603,6 +595,7 @@
     <w:p>
       <w:pPr>
         <w:spacing w:after="0" w:line="240" w:lineRule="auto"/>
+        <w:ind w:right="276"/>
         <w:jc w:val="both"/>
         <w:rPr>
           <w:rFonts w:ascii="Times New Roman" w:hAnsi="Times New Roman" w:cs="Times New Roman"/>
@@ -779,8 +772,8 @@
     </w:p>
     <w:tbl>
       <w:tblPr>
-        <w:tblW w:w="8430" w:type="dxa"/>
-        <w:tblInd w:w="1134" w:type="dxa"/>
+        <w:tblW w:w="8124" w:type="dxa"/>
+        <w:tblInd w:w="1440" w:type="dxa"/>
         <w:tblBorders>
           <w:top w:val="single" w:sz="8" w:space="0" w:color="000000"/>
           <w:left w:val="single" w:sz="8" w:space="0" w:color="000000"/>
@@ -793,13 +786,13 @@
         <w:tblLook w:val="0600" w:firstRow="0" w:lastRow="0" w:firstColumn="0" w:lastColumn="0" w:noHBand="1" w:noVBand="1"/>
       </w:tblPr>
       <w:tblGrid>
-        <w:gridCol w:w="4200"/>
-        <w:gridCol w:w="4230"/>
+        <w:gridCol w:w="4500"/>
+        <w:gridCol w:w="3624"/>
       </w:tblGrid>
       <w:tr>
         <w:tc>
           <w:tcPr>
-            <w:tcW w:w="4200" w:type="dxa"/>
+            <w:tcW w:w="4500" w:type="dxa"/>
             <w:tcBorders>
               <w:top w:val="nil"/>
               <w:left w:val="nil"/>
@@ -834,7 +827,29 @@
               <w:rPr>
                 <w:rFonts w:ascii="Times New Roman" w:eastAsia="Times New Roman" w:hAnsi="Times New Roman" w:cs="Times New Roman"/>
               </w:rPr>
-              <w:t>Motor No.   :</w:t>
+              <w:t xml:space="preserve">Motor </w:t>
+            </w:r>
+            <w:proofErr w:type="gramStart"/>
+            <w:r>
+              <w:rPr>
+                <w:rFonts w:ascii="Times New Roman" w:eastAsia="Times New Roman" w:hAnsi="Times New Roman" w:cs="Times New Roman"/>
+              </w:rPr>
+              <w:t>No.</w:t>
+            </w:r>
+            <w:r>
+              <w:rPr>
+                <w:rFonts w:ascii="Times New Roman" w:eastAsia="Times New Roman" w:hAnsi="Times New Roman" w:cs="Times New Roman"/>
+              </w:rPr>
+              <w:t xml:space="preserve">  :</w:t>
+            </w:r>
+            <w:proofErr w:type="gramEnd"/>
+            <w:r>
+              <w:rPr>
+                <w:rFonts w:ascii="Times New Roman" w:eastAsia="Times New Roman" w:hAnsi="Times New Roman" w:cs="Times New Roman"/>
+                <w:b/>
+                <w:bCs/>
+              </w:rPr>
+              <w:t xml:space="preserve">      </w:t>
             </w:r>
             <w:r>
               <w:rPr>
@@ -842,13 +857,13 @@
                 <w:b/>
                 <w:bCs/>
               </w:rPr>
-              <w:t xml:space="preserve"> {{MOTOR_NO}}</w:t>
+              <w:t>{{MOTOR_NO}}</w:t>
             </w:r>
           </w:p>
         </w:tc>
         <w:tc>
           <w:tcPr>
-            <w:tcW w:w="4230" w:type="dxa"/>
+            <w:tcW w:w="3624" w:type="dxa"/>
             <w:tcBorders>
               <w:top w:val="nil"/>
               <w:left w:val="nil"/>
@@ -891,7 +906,15 @@
                 <w:b/>
                 <w:bCs/>
               </w:rPr>
-              <w:t xml:space="preserve"> {{PLATE_NO}}</w:t>
+              <w:t xml:space="preserve"> </w:t>
+            </w:r>
+            <w:r>
+              <w:rPr>
+                <w:rFonts w:ascii="Times New Roman" w:eastAsia="Times New Roman" w:hAnsi="Times New Roman" w:cs="Times New Roman"/>
+                <w:b/>
+                <w:bCs/>
+              </w:rPr>
+              <w:t>{{PLATE_NO}}</w:t>
             </w:r>
           </w:p>
         </w:tc>
@@ -899,7 +922,7 @@
       <w:tr>
         <w:tc>
           <w:tcPr>
-            <w:tcW w:w="4200" w:type="dxa"/>
+            <w:tcW w:w="4500" w:type="dxa"/>
             <w:tcBorders>
               <w:top w:val="nil"/>
               <w:left w:val="nil"/>
@@ -934,7 +957,13 @@
               <w:rPr>
                 <w:rFonts w:ascii="Times New Roman" w:eastAsia="Times New Roman" w:hAnsi="Times New Roman" w:cs="Times New Roman"/>
               </w:rPr>
-              <w:t>Chassis No. :</w:t>
+              <w:t>Chassis No.</w:t>
+            </w:r>
+            <w:r>
+              <w:rPr>
+                <w:rFonts w:ascii="Times New Roman" w:eastAsia="Times New Roman" w:hAnsi="Times New Roman" w:cs="Times New Roman"/>
+              </w:rPr>
+              <w:t>:</w:t>
             </w:r>
             <w:r>
               <w:rPr>
@@ -942,13 +971,39 @@
                 <w:b/>
                 <w:bCs/>
               </w:rPr>
-              <w:t xml:space="preserve"> {{CHASSIS_NO}}</w:t>
+              <w:t xml:space="preserve">   </w:t>
+            </w:r>
+            <w:proofErr w:type="gramStart"/>
+            <w:r>
+              <w:rPr>
+                <w:rFonts w:ascii="Times New Roman" w:eastAsia="Times New Roman" w:hAnsi="Times New Roman" w:cs="Times New Roman"/>
+                <w:b/>
+                <w:bCs/>
+              </w:rPr>
+              <w:t xml:space="preserve">   </w:t>
+            </w:r>
+            <w:r>
+              <w:rPr>
+                <w:rFonts w:ascii="Times New Roman" w:eastAsia="Times New Roman" w:hAnsi="Times New Roman" w:cs="Times New Roman"/>
+                <w:b/>
+                <w:bCs/>
+              </w:rPr>
+              <w:t>{</w:t>
+            </w:r>
+            <w:proofErr w:type="gramEnd"/>
+            <w:r>
+              <w:rPr>
+                <w:rFonts w:ascii="Times New Roman" w:eastAsia="Times New Roman" w:hAnsi="Times New Roman" w:cs="Times New Roman"/>
+                <w:b/>
+                <w:bCs/>
+              </w:rPr>
+              <w:t>{CHASSIS_NO}}</w:t>
             </w:r>
           </w:p>
         </w:tc>
         <w:tc>
           <w:tcPr>
-            <w:tcW w:w="4230" w:type="dxa"/>
+            <w:tcW w:w="3624" w:type="dxa"/>
             <w:tcBorders>
               <w:top w:val="nil"/>
               <w:left w:val="nil"/>
@@ -983,7 +1038,13 @@
               <w:rPr>
                 <w:rFonts w:ascii="Times New Roman" w:eastAsia="Times New Roman" w:hAnsi="Times New Roman" w:cs="Times New Roman"/>
               </w:rPr>
-              <w:t>Route      :</w:t>
+              <w:t xml:space="preserve">Route </w:t>
+            </w:r>
+            <w:r>
+              <w:rPr>
+                <w:rFonts w:ascii="Times New Roman" w:eastAsia="Times New Roman" w:hAnsi="Times New Roman" w:cs="Times New Roman"/>
+              </w:rPr>
+              <w:t>:</w:t>
             </w:r>
             <w:r>
               <w:rPr>
@@ -1019,8 +1080,16 @@
       <w:r>
         <w:rPr>
           <w:rFonts w:ascii="Times New Roman" w:eastAsia="Times New Roman" w:hAnsi="Times New Roman" w:cs="Times New Roman"/>
-        </w:rPr>
-        <w:t xml:space="preserve">Make         </w:t>
+          <w:b/>
+          <w:bCs/>
+        </w:rPr>
+        <w:t xml:space="preserve">     </w:t>
+      </w:r>
+      <w:r>
+        <w:rPr>
+          <w:rFonts w:ascii="Times New Roman" w:eastAsia="Times New Roman" w:hAnsi="Times New Roman" w:cs="Times New Roman"/>
+        </w:rPr>
+        <w:t xml:space="preserve">Make        </w:t>
       </w:r>
       <w:proofErr w:type="gramStart"/>
       <w:r>
@@ -1030,6 +1099,12 @@
         <w:t xml:space="preserve">  :</w:t>
       </w:r>
       <w:proofErr w:type="gramEnd"/>
+      <w:r>
+        <w:rPr>
+          <w:rFonts w:ascii="Times New Roman" w:eastAsia="Times New Roman" w:hAnsi="Times New Roman" w:cs="Times New Roman"/>
+        </w:rPr>
+        <w:t xml:space="preserve">     </w:t>
+      </w:r>
       <w:r>
         <w:rPr>
           <w:rFonts w:ascii="Times New Roman" w:eastAsia="Times New Roman" w:hAnsi="Times New Roman" w:cs="Times New Roman"/>
@@ -1059,6 +1134,7 @@
     <w:p>
       <w:pPr>
         <w:spacing w:after="0" w:line="360" w:lineRule="auto"/>
+        <w:ind w:right="262"/>
         <w:jc w:val="both"/>
         <w:rPr>
           <w:rFonts w:ascii="Times New Roman" w:hAnsi="Times New Roman" w:cs="Times New Roman"/>
@@ -1082,6 +1158,7 @@
     <w:p>
       <w:pPr>
         <w:spacing w:after="0" w:line="360" w:lineRule="auto"/>
+        <w:ind w:right="262"/>
         <w:jc w:val="both"/>
         <w:rPr>
           <w:rFonts w:ascii="Times New Roman" w:hAnsi="Times New Roman" w:cs="Times New Roman"/>
@@ -1101,6 +1178,7 @@
           <w:numId w:val="2"/>
         </w:numPr>
         <w:spacing w:after="0"/>
+        <w:ind w:right="262"/>
         <w:jc w:val="both"/>
         <w:rPr>
           <w:rFonts w:ascii="Times New Roman" w:hAnsi="Times New Roman" w:cs="Times New Roman"/>
@@ -1125,6 +1203,7 @@
           <w:numId w:val="2"/>
         </w:numPr>
         <w:spacing w:after="0"/>
+        <w:ind w:right="262"/>
         <w:jc w:val="both"/>
         <w:rPr>
           <w:rFonts w:ascii="Times New Roman" w:hAnsi="Times New Roman" w:cs="Times New Roman"/>
@@ -1149,6 +1228,7 @@
           <w:numId w:val="2"/>
         </w:numPr>
         <w:spacing w:after="0"/>
+        <w:ind w:right="262"/>
         <w:jc w:val="both"/>
         <w:rPr>
           <w:rFonts w:ascii="Times New Roman" w:hAnsi="Times New Roman" w:cs="Times New Roman"/>
@@ -1173,6 +1253,7 @@
           <w:numId w:val="2"/>
         </w:numPr>
         <w:spacing w:after="0"/>
+        <w:ind w:right="262"/>
         <w:jc w:val="both"/>
         <w:rPr>
           <w:rFonts w:ascii="Times New Roman" w:hAnsi="Times New Roman" w:cs="Times New Roman"/>
@@ -1197,6 +1278,7 @@
           <w:numId w:val="2"/>
         </w:numPr>
         <w:spacing w:after="0"/>
+        <w:ind w:right="262"/>
         <w:jc w:val="both"/>
         <w:rPr>
           <w:rFonts w:ascii="Times New Roman" w:hAnsi="Times New Roman" w:cs="Times New Roman"/>
@@ -1221,6 +1303,7 @@
           <w:numId w:val="2"/>
         </w:numPr>
         <w:spacing w:after="0"/>
+        <w:ind w:right="262"/>
         <w:jc w:val="both"/>
         <w:rPr>
           <w:rFonts w:ascii="Times New Roman" w:hAnsi="Times New Roman" w:cs="Times New Roman"/>
@@ -1245,6 +1328,7 @@
           <w:numId w:val="2"/>
         </w:numPr>
         <w:spacing w:after="0"/>
+        <w:ind w:right="262"/>
         <w:jc w:val="both"/>
         <w:rPr>
           <w:rFonts w:ascii="Times New Roman" w:hAnsi="Times New Roman" w:cs="Times New Roman"/>
@@ -1269,6 +1353,7 @@
           <w:numId w:val="2"/>
         </w:numPr>
         <w:spacing w:after="0"/>
+        <w:ind w:right="262"/>
         <w:jc w:val="both"/>
         <w:rPr>
           <w:rFonts w:ascii="Times New Roman" w:hAnsi="Times New Roman" w:cs="Times New Roman"/>
@@ -1293,6 +1378,7 @@
           <w:numId w:val="2"/>
         </w:numPr>
         <w:spacing w:after="0"/>
+        <w:ind w:right="262"/>
         <w:jc w:val="both"/>
         <w:rPr>
           <w:rFonts w:ascii="Times New Roman" w:hAnsi="Times New Roman" w:cs="Times New Roman"/>
@@ -1317,6 +1403,7 @@
           <w:numId w:val="2"/>
         </w:numPr>
         <w:spacing w:after="0"/>
+        <w:ind w:right="262"/>
         <w:jc w:val="both"/>
         <w:rPr>
           <w:rFonts w:ascii="Times New Roman" w:hAnsi="Times New Roman" w:cs="Times New Roman"/>
@@ -1336,6 +1423,7 @@
     <w:p>
       <w:pPr>
         <w:spacing w:after="0"/>
+        <w:ind w:right="262"/>
         <w:jc w:val="center"/>
         <w:rPr>
           <w:rFonts w:ascii="Times New Roman" w:hAnsi="Times New Roman" w:cs="Times New Roman"/>
@@ -1347,7 +1435,7 @@
     <w:p>
       <w:pPr>
         <w:spacing w:after="0"/>
-        <w:ind w:left="360"/>
+        <w:ind w:left="360" w:right="262"/>
         <w:jc w:val="both"/>
         <w:rPr>
           <w:rFonts w:ascii="Times New Roman" w:hAnsi="Times New Roman" w:cs="Times New Roman"/>
@@ -1367,7 +1455,7 @@
     <w:p>
       <w:pPr>
         <w:spacing w:after="0"/>
-        <w:ind w:left="360"/>
+        <w:ind w:left="360" w:right="262"/>
         <w:jc w:val="both"/>
         <w:rPr>
           <w:rFonts w:ascii="Times New Roman" w:hAnsi="Times New Roman" w:cs="Times New Roman"/>
@@ -1379,7 +1467,7 @@
     <w:p>
       <w:pPr>
         <w:spacing w:after="0"/>
-        <w:ind w:left="360"/>
+        <w:ind w:left="360" w:right="262"/>
         <w:jc w:val="both"/>
         <w:rPr>
           <w:rFonts w:ascii="Times New Roman" w:hAnsi="Times New Roman" w:cs="Times New Roman"/>
@@ -1409,6 +1497,7 @@
     <w:p>
       <w:pPr>
         <w:spacing w:after="0"/>
+        <w:ind w:right="262"/>
         <w:jc w:val="both"/>
         <w:rPr>
           <w:rFonts w:ascii="Times New Roman" w:hAnsi="Times New Roman" w:cs="Times New Roman"/>
@@ -1421,7 +1510,7 @@
     <w:p>
       <w:pPr>
         <w:spacing w:after="0"/>
-        <w:ind w:left="360"/>
+        <w:ind w:left="360" w:right="262"/>
         <w:jc w:val="both"/>
         <w:rPr>
           <w:rFonts w:ascii="Times New Roman" w:eastAsia="Times New Roman" w:hAnsi="Times New Roman" w:cs="Times New Roman"/>
@@ -1450,7 +1539,7 @@
           <w:tab w:val="left" w:pos="6510"/>
         </w:tabs>
         <w:spacing w:after="0"/>
-        <w:ind w:left="360"/>
+        <w:ind w:left="360" w:right="262"/>
         <w:jc w:val="both"/>
         <w:rPr>
           <w:rFonts w:ascii="Times New Roman" w:eastAsia="Times New Roman" w:hAnsi="Times New Roman" w:cs="Times New Roman"/>
@@ -1507,6 +1596,7 @@
           <w:tab w:val="left" w:pos="7080"/>
         </w:tabs>
         <w:spacing w:after="0" w:line="240" w:lineRule="auto"/>
+        <w:ind w:right="262"/>
         <w:jc w:val="both"/>
         <w:rPr>
           <w:color w:val="000000"/>
@@ -1544,22 +1634,33 @@
         </w:rPr>
         <w:tab/>
       </w:r>
-      <w:bookmarkStart w:id="2" w:name="_GoBack"/>
-      <w:bookmarkEnd w:id="2"/>
-    </w:p>
-    <w:p>
-      <w:pPr>
-        <w:spacing w:line="240" w:lineRule="auto"/>
-        <w:rPr>
-          <w:rFonts w:ascii="Times New Roman" w:eastAsia="Times New Roman" w:hAnsi="Times New Roman" w:cs="Times New Roman"/>
-          <w:b/>
-          <w:bCs/>
-        </w:rPr>
-      </w:pPr>
-    </w:p>
-    <w:p>
-      <w:pPr>
-        <w:spacing w:line="240" w:lineRule="auto"/>
+    </w:p>
+    <w:p>
+      <w:pPr>
+        <w:spacing w:after="0" w:line="240" w:lineRule="auto"/>
+        <w:ind w:right="262"/>
+        <w:rPr>
+          <w:rFonts w:ascii="Times New Roman" w:eastAsia="Times New Roman" w:hAnsi="Times New Roman" w:cs="Times New Roman"/>
+          <w:b/>
+          <w:bCs/>
+        </w:rPr>
+      </w:pPr>
+    </w:p>
+    <w:p>
+      <w:pPr>
+        <w:spacing w:after="0" w:line="240" w:lineRule="auto"/>
+        <w:ind w:right="262"/>
+        <w:rPr>
+          <w:rFonts w:ascii="Times New Roman" w:eastAsia="Times New Roman" w:hAnsi="Times New Roman" w:cs="Times New Roman"/>
+          <w:b/>
+          <w:bCs/>
+        </w:rPr>
+      </w:pPr>
+    </w:p>
+    <w:p>
+      <w:pPr>
+        <w:spacing w:after="0" w:line="240" w:lineRule="auto"/>
+        <w:ind w:right="262"/>
         <w:rPr>
           <w:rFonts w:ascii="Times New Roman" w:eastAsia="Times New Roman" w:hAnsi="Times New Roman" w:cs="Times New Roman"/>
           <w:b/>
@@ -1570,6 +1671,7 @@
     <w:p>
       <w:pPr>
         <w:spacing w:after="0"/>
+        <w:ind w:right="262"/>
         <w:jc w:val="center"/>
         <w:rPr>
           <w:rFonts w:ascii="Times New Roman" w:hAnsi="Times New Roman" w:cs="Times New Roman"/>
@@ -1587,6 +1689,7 @@
     <w:p>
       <w:pPr>
         <w:spacing w:after="0"/>
+        <w:ind w:right="262"/>
         <w:jc w:val="center"/>
         <w:rPr>
           <w:rFonts w:ascii="Times New Roman" w:eastAsia="Calibri" w:hAnsi="Times New Roman" w:cs="Times New Roman"/>
@@ -1601,9 +1704,9 @@
       </w:r>
     </w:p>
     <w:sectPr>
-      <w:footerReference w:type="default" r:id="rId10"/>
+      <w:footerReference w:type="default" r:id="rId11"/>
       <w:pgSz w:w="11906" w:h="16838" w:code="9"/>
-      <w:pgMar w:top="720" w:right="862" w:bottom="578" w:left="1151" w:header="720" w:footer="170" w:gutter="0"/>
+      <w:pgMar w:top="720" w:right="862" w:bottom="578" w:left="1151" w:header="720" w:footer="113" w:gutter="0"/>
       <w:cols w:space="720"/>
       <w:docGrid w:linePitch="360"/>
     </w:sectPr>
@@ -1612,7 +1715,7 @@
 </file>
 
 <file path=word/endnotes.xml><?xml version="1.0" encoding="utf-8"?>
-<w:endnotes xmlns:wpc="http://schemas.microsoft.com/office/word/2010/wordprocessingCanvas" xmlns:cx="http://schemas.microsoft.com/office/drawing/2014/chartex" xmlns:mc="http://schemas.openxmlformats.org/markup-compatibility/2006" xmlns:o="urn:schemas-microsoft-com:office:office" xmlns:r="http://schemas.openxmlformats.org/officeDocument/2006/relationships" xmlns:m="http://schemas.openxmlformats.org/officeDocument/2006/math" xmlns:v="urn:schemas-microsoft-com:vml" xmlns:wp14="http://schemas.microsoft.com/office/word/2010/wordprocessingDrawing" xmlns:wp="http://schemas.openxmlformats.org/drawingml/2006/wordprocessingDrawing" xmlns:w10="urn:schemas-microsoft-com:office:word" xmlns:w="http://schemas.openxmlformats.org/wordprocessingml/2006/main" xmlns:w14="http://schemas.microsoft.com/office/word/2010/wordml" xmlns:w15="http://schemas.microsoft.com/office/word/2012/wordml" xmlns:w16se="http://schemas.microsoft.com/office/word/2015/wordml/symex" xmlns:wpg="http://schemas.microsoft.com/office/word/2010/wordprocessingGroup" xmlns:wpi="http://schemas.microsoft.com/office/word/2010/wordprocessingInk" xmlns:wne="http://schemas.microsoft.com/office/word/2006/wordml" xmlns:wps="http://schemas.microsoft.com/office/word/2010/wordprocessingShape" mc:Ignorable="w14 w15 w16se wp14">
+<w:endnotes xmlns:wpc="http://schemas.microsoft.com/office/word/2010/wordprocessingCanvas" xmlns:cx="http://schemas.microsoft.com/office/drawing/2014/chartex" xmlns:cx1="http://schemas.microsoft.com/office/drawing/2015/9/8/chartex" xmlns:cx2="http://schemas.microsoft.com/office/drawing/2015/10/21/chartex" xmlns:cx3="http://schemas.microsoft.com/office/drawing/2016/5/9/chartex" xmlns:cx4="http://schemas.microsoft.com/office/drawing/2016/5/10/chartex" xmlns:cx5="http://schemas.microsoft.com/office/drawing/2016/5/11/chartex" xmlns:cx6="http://schemas.microsoft.com/office/drawing/2016/5/12/chartex" xmlns:cx7="http://schemas.microsoft.com/office/drawing/2016/5/13/chartex" xmlns:cx8="http://schemas.microsoft.com/office/drawing/2016/5/14/chartex" xmlns:mc="http://schemas.openxmlformats.org/markup-compatibility/2006" xmlns:aink="http://schemas.microsoft.com/office/drawing/2016/ink" xmlns:am3d="http://schemas.microsoft.com/office/drawing/2017/model3d" xmlns:o="urn:schemas-microsoft-com:office:office" xmlns:r="http://schemas.openxmlformats.org/officeDocument/2006/relationships" xmlns:m="http://schemas.openxmlformats.org/officeDocument/2006/math" xmlns:v="urn:schemas-microsoft-com:vml" xmlns:wp14="http://schemas.microsoft.com/office/word/2010/wordprocessingDrawing" xmlns:wp="http://schemas.openxmlformats.org/drawingml/2006/wordprocessingDrawing" xmlns:w10="urn:schemas-microsoft-com:office:word" xmlns:w="http://schemas.openxmlformats.org/wordprocessingml/2006/main" xmlns:w14="http://schemas.microsoft.com/office/word/2010/wordml" xmlns:w15="http://schemas.microsoft.com/office/word/2012/wordml" xmlns:w16cex="http://schemas.microsoft.com/office/word/2018/wordml/cex" xmlns:w16cid="http://schemas.microsoft.com/office/word/2016/wordml/cid" xmlns:w16="http://schemas.microsoft.com/office/word/2018/wordml" xmlns:w16sdtdh="http://schemas.microsoft.com/office/word/2020/wordml/sdtdatahash" xmlns:w16se="http://schemas.microsoft.com/office/word/2015/wordml/symex" xmlns:wpg="http://schemas.microsoft.com/office/word/2010/wordprocessingGroup" xmlns:wpi="http://schemas.microsoft.com/office/word/2010/wordprocessingInk" xmlns:wne="http://schemas.microsoft.com/office/word/2006/wordml" xmlns:wps="http://schemas.microsoft.com/office/word/2010/wordprocessingShape" mc:Ignorable="w14 w15 w16se w16cid w16 w16cex w16sdtdh wp14">
   <w:endnote w:type="separator" w:id="-1">
     <w:p>
       <w:pPr>
@@ -1637,7 +1740,7 @@
 </file>
 
 <file path=word/footer1.xml><?xml version="1.0" encoding="utf-8"?>
-<w:ftr xmlns:wpc="http://schemas.microsoft.com/office/word/2010/wordprocessingCanvas" xmlns:cx="http://schemas.microsoft.com/office/drawing/2014/chartex" xmlns:mc="http://schemas.openxmlformats.org/markup-compatibility/2006" xmlns:o="urn:schemas-microsoft-com:office:office" xmlns:r="http://schemas.openxmlformats.org/officeDocument/2006/relationships" xmlns:m="http://schemas.openxmlformats.org/officeDocument/2006/math" xmlns:v="urn:schemas-microsoft-com:vml" xmlns:wp14="http://schemas.microsoft.com/office/word/2010/wordprocessingDrawing" xmlns:wp="http://schemas.openxmlformats.org/drawingml/2006/wordprocessingDrawing" xmlns:w10="urn:schemas-microsoft-com:office:word" xmlns:w="http://schemas.openxmlformats.org/wordprocessingml/2006/main" xmlns:w14="http://schemas.microsoft.com/office/word/2010/wordml" xmlns:w15="http://schemas.microsoft.com/office/word/2012/wordml" xmlns:w16se="http://schemas.microsoft.com/office/word/2015/wordml/symex" xmlns:wpg="http://schemas.microsoft.com/office/word/2010/wordprocessingGroup" xmlns:wpi="http://schemas.microsoft.com/office/word/2010/wordprocessingInk" xmlns:wne="http://schemas.microsoft.com/office/word/2006/wordml" xmlns:wps="http://schemas.microsoft.com/office/word/2010/wordprocessingShape" mc:Ignorable="w14 w15 w16se wp14">
+<w:ftr xmlns:wpc="http://schemas.microsoft.com/office/word/2010/wordprocessingCanvas" xmlns:cx="http://schemas.microsoft.com/office/drawing/2014/chartex" xmlns:cx1="http://schemas.microsoft.com/office/drawing/2015/9/8/chartex" xmlns:cx2="http://schemas.microsoft.com/office/drawing/2015/10/21/chartex" xmlns:cx3="http://schemas.microsoft.com/office/drawing/2016/5/9/chartex" xmlns:cx4="http://schemas.microsoft.com/office/drawing/2016/5/10/chartex" xmlns:cx5="http://schemas.microsoft.com/office/drawing/2016/5/11/chartex" xmlns:cx6="http://schemas.microsoft.com/office/drawing/2016/5/12/chartex" xmlns:cx7="http://schemas.microsoft.com/office/drawing/2016/5/13/chartex" xmlns:cx8="http://schemas.microsoft.com/office/drawing/2016/5/14/chartex" xmlns:mc="http://schemas.openxmlformats.org/markup-compatibility/2006" xmlns:aink="http://schemas.microsoft.com/office/drawing/2016/ink" xmlns:am3d="http://schemas.microsoft.com/office/drawing/2017/model3d" xmlns:o="urn:schemas-microsoft-com:office:office" xmlns:r="http://schemas.openxmlformats.org/officeDocument/2006/relationships" xmlns:m="http://schemas.openxmlformats.org/officeDocument/2006/math" xmlns:v="urn:schemas-microsoft-com:vml" xmlns:wp14="http://schemas.microsoft.com/office/word/2010/wordprocessingDrawing" xmlns:wp="http://schemas.openxmlformats.org/drawingml/2006/wordprocessingDrawing" xmlns:w10="urn:schemas-microsoft-com:office:word" xmlns:w="http://schemas.openxmlformats.org/wordprocessingml/2006/main" xmlns:w14="http://schemas.microsoft.com/office/word/2010/wordml" xmlns:w15="http://schemas.microsoft.com/office/word/2012/wordml" xmlns:w16cex="http://schemas.microsoft.com/office/word/2018/wordml/cex" xmlns:w16cid="http://schemas.microsoft.com/office/word/2016/wordml/cid" xmlns:w16="http://schemas.microsoft.com/office/word/2018/wordml" xmlns:w16sdtdh="http://schemas.microsoft.com/office/word/2020/wordml/sdtdatahash" xmlns:w16se="http://schemas.microsoft.com/office/word/2015/wordml/symex" xmlns:wpg="http://schemas.microsoft.com/office/word/2010/wordprocessingGroup" xmlns:wpi="http://schemas.microsoft.com/office/word/2010/wordprocessingInk" xmlns:wne="http://schemas.microsoft.com/office/word/2006/wordml" xmlns:wps="http://schemas.microsoft.com/office/word/2010/wordprocessingShape" mc:Ignorable="w14 w15 w16se w16cid w16 w16cex w16sdtdh wp14">
   <w:p>
     <w:pPr>
       <w:pStyle w:val="Footer"/>
@@ -1677,25 +1780,7 @@
         <w:sz w:val="16"/>
         <w:szCs w:val="16"/>
       </w:rPr>
-      <w:t xml:space="preserve">2/F </w:t>
-    </w:r>
-    <w:proofErr w:type="spellStart"/>
-    <w:r>
-      <w:rPr>
-        <w:rFonts w:ascii="Bookman Old Style" w:hAnsi="Bookman Old Style" w:cs="Times New Roman"/>
-        <w:sz w:val="16"/>
-        <w:szCs w:val="16"/>
-      </w:rPr>
-      <w:t>Sangguniang</w:t>
-    </w:r>
-    <w:proofErr w:type="spellEnd"/>
-    <w:r>
-      <w:rPr>
-        <w:rFonts w:ascii="Bookman Old Style" w:hAnsi="Bookman Old Style" w:cs="Times New Roman"/>
-        <w:sz w:val="16"/>
-        <w:szCs w:val="16"/>
-      </w:rPr>
-      <w:t xml:space="preserve"> Bayan Bldg. Municipal Compound, Brgy. Ibayo Silangan, Naic, Cavite</w:t>
+      <w:t>2/F Sangguniang Bayan Bldg. Municipal Compound, Brgy. Ibayo Silangan, Naic, Cavite</w:t>
     </w:r>
   </w:p>
   <w:p>
@@ -1743,7 +1828,7 @@
 </file>
 
 <file path=word/footnotes.xml><?xml version="1.0" encoding="utf-8"?>
-<w:footnotes xmlns:wpc="http://schemas.microsoft.com/office/word/2010/wordprocessingCanvas" xmlns:cx="http://schemas.microsoft.com/office/drawing/2014/chartex" xmlns:mc="http://schemas.openxmlformats.org/markup-compatibility/2006" xmlns:o="urn:schemas-microsoft-com:office:office" xmlns:r="http://schemas.openxmlformats.org/officeDocument/2006/relationships" xmlns:m="http://schemas.openxmlformats.org/officeDocument/2006/math" xmlns:v="urn:schemas-microsoft-com:vml" xmlns:wp14="http://schemas.microsoft.com/office/word/2010/wordprocessingDrawing" xmlns:wp="http://schemas.openxmlformats.org/drawingml/2006/wordprocessingDrawing" xmlns:w10="urn:schemas-microsoft-com:office:word" xmlns:w="http://schemas.openxmlformats.org/wordprocessingml/2006/main" xmlns:w14="http://schemas.microsoft.com/office/word/2010/wordml" xmlns:w15="http://schemas.microsoft.com/office/word/2012/wordml" xmlns:w16se="http://schemas.microsoft.com/office/word/2015/wordml/symex" xmlns:wpg="http://schemas.microsoft.com/office/word/2010/wordprocessingGroup" xmlns:wpi="http://schemas.microsoft.com/office/word/2010/wordprocessingInk" xmlns:wne="http://schemas.microsoft.com/office/word/2006/wordml" xmlns:wps="http://schemas.microsoft.com/office/word/2010/wordprocessingShape" mc:Ignorable="w14 w15 w16se wp14">
+<w:footnotes xmlns:wpc="http://schemas.microsoft.com/office/word/2010/wordprocessingCanvas" xmlns:cx="http://schemas.microsoft.com/office/drawing/2014/chartex" xmlns:cx1="http://schemas.microsoft.com/office/drawing/2015/9/8/chartex" xmlns:cx2="http://schemas.microsoft.com/office/drawing/2015/10/21/chartex" xmlns:cx3="http://schemas.microsoft.com/office/drawing/2016/5/9/chartex" xmlns:cx4="http://schemas.microsoft.com/office/drawing/2016/5/10/chartex" xmlns:cx5="http://schemas.microsoft.com/office/drawing/2016/5/11/chartex" xmlns:cx6="http://schemas.microsoft.com/office/drawing/2016/5/12/chartex" xmlns:cx7="http://schemas.microsoft.com/office/drawing/2016/5/13/chartex" xmlns:cx8="http://schemas.microsoft.com/office/drawing/2016/5/14/chartex" xmlns:mc="http://schemas.openxmlformats.org/markup-compatibility/2006" xmlns:aink="http://schemas.microsoft.com/office/drawing/2016/ink" xmlns:am3d="http://schemas.microsoft.com/office/drawing/2017/model3d" xmlns:o="urn:schemas-microsoft-com:office:office" xmlns:r="http://schemas.openxmlformats.org/officeDocument/2006/relationships" xmlns:m="http://schemas.openxmlformats.org/officeDocument/2006/math" xmlns:v="urn:schemas-microsoft-com:vml" xmlns:wp14="http://schemas.microsoft.com/office/word/2010/wordprocessingDrawing" xmlns:wp="http://schemas.openxmlformats.org/drawingml/2006/wordprocessingDrawing" xmlns:w10="urn:schemas-microsoft-com:office:word" xmlns:w="http://schemas.openxmlformats.org/wordprocessingml/2006/main" xmlns:w14="http://schemas.microsoft.com/office/word/2010/wordml" xmlns:w15="http://schemas.microsoft.com/office/word/2012/wordml" xmlns:w16cex="http://schemas.microsoft.com/office/word/2018/wordml/cex" xmlns:w16cid="http://schemas.microsoft.com/office/word/2016/wordml/cid" xmlns:w16="http://schemas.microsoft.com/office/word/2018/wordml" xmlns:w16sdtdh="http://schemas.microsoft.com/office/word/2020/wordml/sdtdatahash" xmlns:w16se="http://schemas.microsoft.com/office/word/2015/wordml/symex" xmlns:wpg="http://schemas.microsoft.com/office/word/2010/wordprocessingGroup" xmlns:wpi="http://schemas.microsoft.com/office/word/2010/wordprocessingInk" xmlns:wne="http://schemas.microsoft.com/office/word/2006/wordml" xmlns:wps="http://schemas.microsoft.com/office/word/2010/wordprocessingShape" mc:Ignorable="w14 w15 w16se w16cid w16 w16cex w16sdtdh wp14">
   <w:footnote w:type="separator" w:id="-1">
     <w:p>
       <w:pPr>
@@ -1768,7 +1853,7 @@
 </file>
 
 <file path=word/numbering.xml><?xml version="1.0" encoding="utf-8"?>
-<w:numbering xmlns:wpc="http://schemas.microsoft.com/office/word/2010/wordprocessingCanvas" xmlns:cx="http://schemas.microsoft.com/office/drawing/2014/chartex" xmlns:mc="http://schemas.openxmlformats.org/markup-compatibility/2006" xmlns:o="urn:schemas-microsoft-com:office:office" xmlns:r="http://schemas.openxmlformats.org/officeDocument/2006/relationships" xmlns:m="http://schemas.openxmlformats.org/officeDocument/2006/math" xmlns:v="urn:schemas-microsoft-com:vml" xmlns:wp14="http://schemas.microsoft.com/office/word/2010/wordprocessingDrawing" xmlns:wp="http://schemas.openxmlformats.org/drawingml/2006/wordprocessingDrawing" xmlns:w10="urn:schemas-microsoft-com:office:word" xmlns:w="http://schemas.openxmlformats.org/wordprocessingml/2006/main" xmlns:w14="http://schemas.microsoft.com/office/word/2010/wordml" xmlns:w15="http://schemas.microsoft.com/office/word/2012/wordml" xmlns:w16se="http://schemas.microsoft.com/office/word/2015/wordml/symex" xmlns:wpg="http://schemas.microsoft.com/office/word/2010/wordprocessingGroup" xmlns:wpi="http://schemas.microsoft.com/office/word/2010/wordprocessingInk" xmlns:wne="http://schemas.microsoft.com/office/word/2006/wordml" xmlns:wps="http://schemas.microsoft.com/office/word/2010/wordprocessingShape" mc:Ignorable="w14 w15 w16se wp14">
+<w:numbering xmlns:wpc="http://schemas.microsoft.com/office/word/2010/wordprocessingCanvas" xmlns:cx="http://schemas.microsoft.com/office/drawing/2014/chartex" xmlns:cx1="http://schemas.microsoft.com/office/drawing/2015/9/8/chartex" xmlns:cx2="http://schemas.microsoft.com/office/drawing/2015/10/21/chartex" xmlns:cx3="http://schemas.microsoft.com/office/drawing/2016/5/9/chartex" xmlns:cx4="http://schemas.microsoft.com/office/drawing/2016/5/10/chartex" xmlns:cx5="http://schemas.microsoft.com/office/drawing/2016/5/11/chartex" xmlns:cx6="http://schemas.microsoft.com/office/drawing/2016/5/12/chartex" xmlns:cx7="http://schemas.microsoft.com/office/drawing/2016/5/13/chartex" xmlns:cx8="http://schemas.microsoft.com/office/drawing/2016/5/14/chartex" xmlns:mc="http://schemas.openxmlformats.org/markup-compatibility/2006" xmlns:aink="http://schemas.microsoft.com/office/drawing/2016/ink" xmlns:am3d="http://schemas.microsoft.com/office/drawing/2017/model3d" xmlns:o="urn:schemas-microsoft-com:office:office" xmlns:r="http://schemas.openxmlformats.org/officeDocument/2006/relationships" xmlns:m="http://schemas.openxmlformats.org/officeDocument/2006/math" xmlns:v="urn:schemas-microsoft-com:vml" xmlns:wp14="http://schemas.microsoft.com/office/word/2010/wordprocessingDrawing" xmlns:wp="http://schemas.openxmlformats.org/drawingml/2006/wordprocessingDrawing" xmlns:w10="urn:schemas-microsoft-com:office:word" xmlns:w="http://schemas.openxmlformats.org/wordprocessingml/2006/main" xmlns:w14="http://schemas.microsoft.com/office/word/2010/wordml" xmlns:w15="http://schemas.microsoft.com/office/word/2012/wordml" xmlns:w16cex="http://schemas.microsoft.com/office/word/2018/wordml/cex" xmlns:w16cid="http://schemas.microsoft.com/office/word/2016/wordml/cid" xmlns:w16="http://schemas.microsoft.com/office/word/2018/wordml" xmlns:w16sdtdh="http://schemas.microsoft.com/office/word/2020/wordml/sdtdatahash" xmlns:w16se="http://schemas.microsoft.com/office/word/2015/wordml/symex" xmlns:wpg="http://schemas.microsoft.com/office/word/2010/wordprocessingGroup" xmlns:wpi="http://schemas.microsoft.com/office/word/2010/wordprocessingInk" xmlns:wne="http://schemas.microsoft.com/office/word/2006/wordml" xmlns:wps="http://schemas.microsoft.com/office/word/2010/wordprocessingShape" mc:Ignorable="w14 w15 w16se w16cid w16 w16cex w16sdtdh wp14">
   <w:abstractNum w:abstractNumId="0" w15:restartNumberingAfterBreak="0">
     <w:nsid w:val="0B637370"/>
     <w:multiLevelType w:val="hybridMultilevel"/>
@@ -1895,7 +1980,7 @@
 </file>
 
 <file path=word/styles.xml><?xml version="1.0" encoding="utf-8"?>
-<w:styles xmlns:mc="http://schemas.openxmlformats.org/markup-compatibility/2006" xmlns:r="http://schemas.openxmlformats.org/officeDocument/2006/relationships" xmlns:w="http://schemas.openxmlformats.org/wordprocessingml/2006/main" xmlns:w14="http://schemas.microsoft.com/office/word/2010/wordml" xmlns:w15="http://schemas.microsoft.com/office/word/2012/wordml" xmlns:w16se="http://schemas.microsoft.com/office/word/2015/wordml/symex" mc:Ignorable="w14 w15 w16se">
+<w:styles xmlns:mc="http://schemas.openxmlformats.org/markup-compatibility/2006" xmlns:r="http://schemas.openxmlformats.org/officeDocument/2006/relationships" xmlns:w="http://schemas.openxmlformats.org/wordprocessingml/2006/main" xmlns:w14="http://schemas.microsoft.com/office/word/2010/wordml" xmlns:w15="http://schemas.microsoft.com/office/word/2012/wordml" xmlns:w16cex="http://schemas.microsoft.com/office/word/2018/wordml/cex" xmlns:w16cid="http://schemas.microsoft.com/office/word/2016/wordml/cid" xmlns:w16="http://schemas.microsoft.com/office/word/2018/wordml" xmlns:w16sdtdh="http://schemas.microsoft.com/office/word/2020/wordml/sdtdatahash" xmlns:w16se="http://schemas.microsoft.com/office/word/2015/wordml/symex" mc:Ignorable="w14 w15 w16se w16cid w16 w16cex w16sdtdh">
   <w:docDefaults>
     <w:rPrDefault>
       <w:rPr>
@@ -1911,7 +1996,7 @@
       </w:pPr>
     </w:pPrDefault>
   </w:docDefaults>
-  <w:latentStyles w:defLockedState="0" w:defUIPriority="99" w:defSemiHidden="0" w:defUnhideWhenUsed="0" w:defQFormat="0" w:count="371">
+  <w:latentStyles w:defLockedState="0" w:defUIPriority="99" w:defSemiHidden="0" w:defUnhideWhenUsed="0" w:defQFormat="0" w:count="376">
     <w:lsdException w:name="Normal" w:uiPriority="0" w:qFormat="1"/>
     <w:lsdException w:name="heading 1" w:uiPriority="9" w:qFormat="1"/>
     <w:lsdException w:name="heading 2" w:semiHidden="1" w:uiPriority="9" w:unhideWhenUsed="1" w:qFormat="1"/>
@@ -2017,7 +2102,6 @@
     <w:lsdException w:name="HTML Sample" w:semiHidden="1" w:unhideWhenUsed="1"/>
     <w:lsdException w:name="HTML Typewriter" w:semiHidden="1" w:unhideWhenUsed="1"/>
     <w:lsdException w:name="HTML Variable" w:semiHidden="1" w:unhideWhenUsed="1"/>
-    <w:lsdException w:name="Normal Table" w:semiHidden="1" w:unhideWhenUsed="1"/>
     <w:lsdException w:name="annotation subject" w:semiHidden="1" w:unhideWhenUsed="1"/>
     <w:lsdException w:name="No List" w:semiHidden="1" w:unhideWhenUsed="1"/>
     <w:lsdException w:name="Outline List 1" w:semiHidden="1" w:unhideWhenUsed="1"/>
@@ -2060,11 +2144,8 @@
     <w:lsdException w:name="Table Contemporary" w:semiHidden="1" w:unhideWhenUsed="1"/>
     <w:lsdException w:name="Table Elegant" w:semiHidden="1" w:unhideWhenUsed="1"/>
     <w:lsdException w:name="Table Professional" w:semiHidden="1" w:unhideWhenUsed="1"/>
-    <w:lsdException w:name="Table Subtle 1" w:semiHidden="1" w:unhideWhenUsed="1"/>
     <w:lsdException w:name="Table Subtle 2" w:semiHidden="1" w:unhideWhenUsed="1"/>
     <w:lsdException w:name="Table Web 1" w:semiHidden="1" w:unhideWhenUsed="1"/>
-    <w:lsdException w:name="Table Web 2" w:semiHidden="1" w:unhideWhenUsed="1"/>
-    <w:lsdException w:name="Table Web 3" w:semiHidden="1" w:unhideWhenUsed="1"/>
     <w:lsdException w:name="Balloon Text" w:semiHidden="1" w:unhideWhenUsed="1"/>
     <w:lsdException w:name="Table Grid" w:uiPriority="59"/>
     <w:lsdException w:name="Table Theme" w:semiHidden="1" w:unhideWhenUsed="1"/>
@@ -2283,6 +2364,11 @@
     <w:lsdException w:name="List Table 5 Dark Accent 6" w:uiPriority="50"/>
     <w:lsdException w:name="List Table 6 Colorful Accent 6" w:uiPriority="51"/>
     <w:lsdException w:name="List Table 7 Colorful Accent 6" w:uiPriority="52"/>
+    <w:lsdException w:name="Mention" w:semiHidden="1" w:unhideWhenUsed="1"/>
+    <w:lsdException w:name="Smart Hyperlink" w:semiHidden="1" w:unhideWhenUsed="1"/>
+    <w:lsdException w:name="Hashtag" w:semiHidden="1" w:unhideWhenUsed="1"/>
+    <w:lsdException w:name="Unresolved Mention" w:semiHidden="1" w:unhideWhenUsed="1"/>
+    <w:lsdException w:name="Smart Link" w:semiHidden="1" w:unhideWhenUsed="1"/>
   </w:latentStyles>
   <w:style w:type="paragraph" w:default="1" w:styleId="Normal">
     <w:name w:val="Normal"/>
@@ -2694,4 +2780,16 @@
   <a:objectDefaults/>
   <a:extraClrSchemeLst/>
 </a:theme>
+</file>
+
+<file path=customXml/item1.xml><?xml version="1.0" encoding="utf-8"?>
+<b:Sources xmlns:b="http://schemas.openxmlformats.org/officeDocument/2006/bibliography" xmlns="http://schemas.openxmlformats.org/officeDocument/2006/bibliography" SelectedStyle="\APASixthEditionOfficeOnline.xsl" StyleName="APA" Version="6"/>
+</file>
+
+<file path=customXml/itemProps1.xml><?xml version="1.0" encoding="utf-8"?>
+<ds:datastoreItem xmlns:ds="http://schemas.openxmlformats.org/officeDocument/2006/customXml" ds:itemID="{76A39BC5-1004-41CB-ABE7-E97821665DD1}">
+  <ds:schemaRefs>
+    <ds:schemaRef ds:uri="http://schemas.openxmlformats.org/officeDocument/2006/bibliography"/>
+  </ds:schemaRefs>
+</ds:datastoreItem>
 </file>
</xml_diff>